<commit_message>
implementation of wordtemplateprocessor, created true template for earnings report template, added SM lung transplant workbook
</commit_message>
<xml_diff>
--- a/EconAutomation/src/supporting_docs/econ_report_templates/LCP_mastertemplate_report_template.docx
+++ b/EconAutomation/src/supporting_docs/econ_report_templates/LCP_mastertemplate_report_template.docx
@@ -51,7 +51,7 @@
           <w:sz w:val="24"/>
           <w:szCs w:val="24"/>
         </w:rPr>
-        <w:t>April 16, 2026</w:t>
+        <w:t>April 17, 2026</w:t>
       </w:r>
       <w:r>
         <w:rPr>
@@ -76,279 +76,6 @@
           <w:szCs w:val="24"/>
         </w:rPr>
       </w:pPr>
-    </w:p>
-    <w:p>
-      <w:pPr>
-        <w:autoSpaceDE w:val="0"/>
-        <w:autoSpaceDN w:val="0"/>
-        <w:adjustRightInd w:val="0"/>
-        <w:spacing w:after="0" w:line="240" w:lineRule="auto"/>
-        <w:rPr>
-          <w:rFonts w:ascii="Times New Roman" w:hAnsi="Times New Roman" w:cs="Times New Roman"/>
-          <w:color w:val="000000"/>
-          <w:sz w:val="23"/>
-          <w:szCs w:val="23"/>
-          <w:highlight w:val="yellow"/>
-        </w:rPr>
-      </w:pPr>
-      <w:r>
-        <w:rPr>
-          <w:rFonts w:ascii="Times New Roman" w:hAnsi="Times New Roman" w:cs="Times New Roman"/>
-          <w:color w:val="000000"/>
-          <w:sz w:val="23"/>
-          <w:szCs w:val="23"/>
-          <w:highlight w:val="yellow"/>
-        </w:rPr>
-        <w:fldChar w:fldCharType="begin"/>
-      </w:r>
-      <w:r>
-        <w:rPr>
-          <w:rFonts w:ascii="Times New Roman" w:hAnsi="Times New Roman" w:cs="Times New Roman"/>
-          <w:color w:val="000000"/>
-          <w:sz w:val="23"/>
-          <w:szCs w:val="23"/>
-          <w:highlight w:val="yellow"/>
-        </w:rPr>
-        <w:instrText xml:space="preserve"> DOCVARIABLE "zapLink¦2!1!AttorneySalutation" </w:instrText>
-      </w:r>
-      <w:r>
-        <w:rPr>
-          <w:rFonts w:ascii="Times New Roman" w:hAnsi="Times New Roman" w:cs="Times New Roman"/>
-          <w:color w:val="000000"/>
-          <w:sz w:val="23"/>
-          <w:szCs w:val="23"/>
-          <w:highlight w:val="yellow"/>
-        </w:rPr>
-        <w:fldChar w:fldCharType="separate"/>
-      </w:r>
-      <w:proofErr w:type="gramStart"/>
-      <w:r>
-        <w:rPr>
-          <w:rFonts w:ascii="Times New Roman" w:hAnsi="Times New Roman" w:cs="Times New Roman"/>
-          <w:color w:val="000000"/>
-          <w:sz w:val="23"/>
-          <w:szCs w:val="23"/>
-          <w:highlight w:val="yellow"/>
-        </w:rPr>
-        <w:t xml:space="preserve">{{ </w:t>
-      </w:r>
-      <w:proofErr w:type="spellStart"/>
-      <w:r>
-        <w:rPr>
-          <w:rFonts w:ascii="Times New Roman" w:hAnsi="Times New Roman" w:cs="Times New Roman"/>
-          <w:color w:val="000000"/>
-          <w:sz w:val="23"/>
-          <w:szCs w:val="23"/>
-          <w:highlight w:val="yellow"/>
-        </w:rPr>
-        <w:t>attorney</w:t>
-      </w:r>
-      <w:proofErr w:type="gramEnd"/>
-      <w:r>
-        <w:rPr>
-          <w:rFonts w:ascii="Times New Roman" w:hAnsi="Times New Roman" w:cs="Times New Roman"/>
-          <w:color w:val="000000"/>
-          <w:sz w:val="23"/>
-          <w:szCs w:val="23"/>
-          <w:highlight w:val="yellow"/>
-        </w:rPr>
-        <w:t>_</w:t>
-      </w:r>
-      <w:proofErr w:type="gramStart"/>
-      <w:r>
-        <w:rPr>
-          <w:rFonts w:ascii="Times New Roman" w:hAnsi="Times New Roman" w:cs="Times New Roman"/>
-          <w:color w:val="000000"/>
-          <w:sz w:val="23"/>
-          <w:szCs w:val="23"/>
-          <w:highlight w:val="yellow"/>
-        </w:rPr>
-        <w:t>salutation</w:t>
-      </w:r>
-      <w:proofErr w:type="spellEnd"/>
-      <w:r>
-        <w:rPr>
-          <w:rFonts w:ascii="Times New Roman" w:hAnsi="Times New Roman" w:cs="Times New Roman"/>
-          <w:color w:val="000000"/>
-          <w:sz w:val="23"/>
-          <w:szCs w:val="23"/>
-          <w:highlight w:val="yellow"/>
-        </w:rPr>
-        <w:t xml:space="preserve"> }</w:t>
-      </w:r>
-      <w:proofErr w:type="gramEnd"/>
-      <w:r>
-        <w:rPr>
-          <w:rFonts w:ascii="Times New Roman" w:hAnsi="Times New Roman" w:cs="Times New Roman"/>
-          <w:color w:val="000000"/>
-          <w:sz w:val="23"/>
-          <w:szCs w:val="23"/>
-          <w:highlight w:val="yellow"/>
-        </w:rPr>
-        <w:t>}</w:t>
-      </w:r>
-      <w:r>
-        <w:rPr>
-          <w:rFonts w:ascii="Times New Roman" w:hAnsi="Times New Roman" w:cs="Times New Roman"/>
-          <w:color w:val="000000"/>
-          <w:sz w:val="23"/>
-          <w:szCs w:val="23"/>
-          <w:highlight w:val="yellow"/>
-        </w:rPr>
-        <w:t xml:space="preserve"> </w:t>
-      </w:r>
-      <w:r>
-        <w:rPr>
-          <w:rFonts w:ascii="Times New Roman" w:hAnsi="Times New Roman" w:cs="Times New Roman"/>
-          <w:color w:val="000000"/>
-          <w:sz w:val="23"/>
-          <w:szCs w:val="23"/>
-          <w:highlight w:val="yellow"/>
-        </w:rPr>
-        <w:fldChar w:fldCharType="end"/>
-      </w:r>
-      <w:proofErr w:type="gramStart"/>
-      <w:r>
-        <w:rPr>
-          <w:rFonts w:ascii="Times New Roman" w:hAnsi="Times New Roman" w:cs="Times New Roman"/>
-          <w:color w:val="000000"/>
-          <w:sz w:val="23"/>
-          <w:szCs w:val="23"/>
-          <w:highlight w:val="yellow"/>
-        </w:rPr>
-        <w:t xml:space="preserve">{{ </w:t>
-      </w:r>
-      <w:proofErr w:type="spellStart"/>
-      <w:r>
-        <w:rPr>
-          <w:rFonts w:ascii="Times New Roman" w:hAnsi="Times New Roman" w:cs="Times New Roman"/>
-          <w:color w:val="000000"/>
-          <w:sz w:val="23"/>
-          <w:szCs w:val="23"/>
-          <w:highlight w:val="yellow"/>
-        </w:rPr>
-        <w:t>attorney</w:t>
-      </w:r>
-      <w:proofErr w:type="gramEnd"/>
-      <w:r>
-        <w:rPr>
-          <w:rFonts w:ascii="Times New Roman" w:hAnsi="Times New Roman" w:cs="Times New Roman"/>
-          <w:color w:val="000000"/>
-          <w:sz w:val="23"/>
-          <w:szCs w:val="23"/>
-          <w:highlight w:val="yellow"/>
-        </w:rPr>
-        <w:t>_name_</w:t>
-      </w:r>
-      <w:proofErr w:type="gramStart"/>
-      <w:r>
-        <w:rPr>
-          <w:rFonts w:ascii="Times New Roman" w:hAnsi="Times New Roman" w:cs="Times New Roman"/>
-          <w:color w:val="000000"/>
-          <w:sz w:val="23"/>
-          <w:szCs w:val="23"/>
-          <w:highlight w:val="yellow"/>
-        </w:rPr>
-        <w:t>first</w:t>
-      </w:r>
-      <w:proofErr w:type="spellEnd"/>
-      <w:r>
-        <w:rPr>
-          <w:rFonts w:ascii="Times New Roman" w:hAnsi="Times New Roman" w:cs="Times New Roman"/>
-          <w:color w:val="000000"/>
-          <w:sz w:val="23"/>
-          <w:szCs w:val="23"/>
-          <w:highlight w:val="yellow"/>
-        </w:rPr>
-        <w:t xml:space="preserve"> }</w:t>
-      </w:r>
-      <w:proofErr w:type="gramEnd"/>
-      <w:r>
-        <w:rPr>
-          <w:rFonts w:ascii="Times New Roman" w:hAnsi="Times New Roman" w:cs="Times New Roman"/>
-          <w:color w:val="000000"/>
-          <w:sz w:val="23"/>
-          <w:szCs w:val="23"/>
-          <w:highlight w:val="yellow"/>
-        </w:rPr>
-        <w:t>}</w:t>
-      </w:r>
-      <w:r>
-        <w:rPr>
-          <w:rFonts w:ascii="Times New Roman" w:hAnsi="Times New Roman" w:cs="Times New Roman"/>
-          <w:color w:val="000000"/>
-          <w:sz w:val="23"/>
-          <w:szCs w:val="23"/>
-          <w:highlight w:val="yellow"/>
-        </w:rPr>
-        <w:t xml:space="preserve"> </w:t>
-      </w:r>
-      <w:proofErr w:type="gramStart"/>
-      <w:r>
-        <w:rPr>
-          <w:rFonts w:ascii="Times New Roman" w:hAnsi="Times New Roman" w:cs="Times New Roman"/>
-          <w:color w:val="000000"/>
-          <w:sz w:val="23"/>
-          <w:szCs w:val="23"/>
-          <w:highlight w:val="yellow"/>
-        </w:rPr>
-        <w:t xml:space="preserve">{{ </w:t>
-      </w:r>
-      <w:proofErr w:type="spellStart"/>
-      <w:r>
-        <w:rPr>
-          <w:rFonts w:ascii="Times New Roman" w:hAnsi="Times New Roman" w:cs="Times New Roman"/>
-          <w:color w:val="000000"/>
-          <w:sz w:val="23"/>
-          <w:szCs w:val="23"/>
-          <w:highlight w:val="yellow"/>
-        </w:rPr>
-        <w:t>attorney</w:t>
-      </w:r>
-      <w:proofErr w:type="gramEnd"/>
-      <w:r>
-        <w:rPr>
-          <w:rFonts w:ascii="Times New Roman" w:hAnsi="Times New Roman" w:cs="Times New Roman"/>
-          <w:color w:val="000000"/>
-          <w:sz w:val="23"/>
-          <w:szCs w:val="23"/>
-          <w:highlight w:val="yellow"/>
-        </w:rPr>
-        <w:t>_name_</w:t>
-      </w:r>
-      <w:proofErr w:type="gramStart"/>
-      <w:r>
-        <w:rPr>
-          <w:rFonts w:ascii="Times New Roman" w:hAnsi="Times New Roman" w:cs="Times New Roman"/>
-          <w:color w:val="000000"/>
-          <w:sz w:val="23"/>
-          <w:szCs w:val="23"/>
-          <w:highlight w:val="yellow"/>
-        </w:rPr>
-        <w:t>last</w:t>
-      </w:r>
-      <w:proofErr w:type="spellEnd"/>
-      <w:r>
-        <w:rPr>
-          <w:rFonts w:ascii="Times New Roman" w:hAnsi="Times New Roman" w:cs="Times New Roman"/>
-          <w:color w:val="000000"/>
-          <w:sz w:val="23"/>
-          <w:szCs w:val="23"/>
-          <w:highlight w:val="yellow"/>
-        </w:rPr>
-        <w:t xml:space="preserve"> }</w:t>
-      </w:r>
-      <w:proofErr w:type="gramEnd"/>
-      <w:r>
-        <w:rPr>
-          <w:rFonts w:ascii="Times New Roman" w:hAnsi="Times New Roman" w:cs="Times New Roman"/>
-          <w:color w:val="000000"/>
-          <w:sz w:val="23"/>
-          <w:szCs w:val="23"/>
-          <w:highlight w:val="yellow"/>
-        </w:rPr>
-        <w:t>}</w:t>
-      </w:r>
     </w:p>
     <w:p>
       <w:pPr>
@@ -365,7 +92,6 @@
           <w:highlight w:val="yellow"/>
         </w:rPr>
       </w:pPr>
-      <w:proofErr w:type="gramStart"/>
       <w:r>
         <w:rPr>
           <w:rFonts w:ascii="Times New Roman" w:hAnsi="Times New Roman" w:cs="Times New Roman"/>
@@ -374,9 +100,8 @@
           <w:szCs w:val="23"/>
           <w:highlight w:val="yellow"/>
         </w:rPr>
-        <w:t xml:space="preserve">{{ </w:t>
-      </w:r>
-      <w:proofErr w:type="spellStart"/>
+        <w:t>[[</w:t>
+      </w:r>
       <w:r>
         <w:rPr>
           <w:rFonts w:ascii="Times New Roman" w:hAnsi="Times New Roman" w:cs="Times New Roman"/>
@@ -385,9 +110,8 @@
           <w:szCs w:val="23"/>
           <w:highlight w:val="yellow"/>
         </w:rPr>
-        <w:t>firm</w:t>
-      </w:r>
-      <w:proofErr w:type="gramEnd"/>
+        <w:t>attorney_salutation_with_name_full</w:t>
+      </w:r>
       <w:r>
         <w:rPr>
           <w:rFonts w:ascii="Times New Roman" w:hAnsi="Times New Roman" w:cs="Times New Roman"/>
@@ -396,40 +120,7 @@
           <w:szCs w:val="23"/>
           <w:highlight w:val="yellow"/>
         </w:rPr>
-        <w:t>_</w:t>
-      </w:r>
-      <w:proofErr w:type="gramStart"/>
-      <w:r>
-        <w:rPr>
-          <w:rFonts w:ascii="Times New Roman" w:hAnsi="Times New Roman" w:cs="Times New Roman"/>
-          <w:color w:val="000000"/>
-          <w:sz w:val="23"/>
-          <w:szCs w:val="23"/>
-          <w:highlight w:val="yellow"/>
-        </w:rPr>
-        <w:t>name</w:t>
-      </w:r>
-      <w:proofErr w:type="spellEnd"/>
-      <w:r>
-        <w:rPr>
-          <w:rFonts w:ascii="Times New Roman" w:hAnsi="Times New Roman" w:cs="Times New Roman"/>
-          <w:color w:val="000000"/>
-          <w:sz w:val="23"/>
-          <w:szCs w:val="23"/>
-          <w:highlight w:val="yellow"/>
-        </w:rPr>
-        <w:t xml:space="preserve"> }</w:t>
-      </w:r>
-      <w:proofErr w:type="gramEnd"/>
-      <w:r>
-        <w:rPr>
-          <w:rFonts w:ascii="Times New Roman" w:hAnsi="Times New Roman" w:cs="Times New Roman"/>
-          <w:color w:val="000000"/>
-          <w:sz w:val="23"/>
-          <w:szCs w:val="23"/>
-          <w:highlight w:val="yellow"/>
-        </w:rPr>
-        <w:t>}</w:t>
+        <w:t>]]</w:t>
       </w:r>
     </w:p>
     <w:p>
@@ -446,7 +137,6 @@
           <w:szCs w:val="24"/>
         </w:rPr>
       </w:pPr>
-      <w:proofErr w:type="gramStart"/>
       <w:r>
         <w:rPr>
           <w:rFonts w:ascii="Times New Roman" w:hAnsi="Times New Roman" w:cs="Times New Roman"/>
@@ -455,9 +145,8 @@
           <w:szCs w:val="23"/>
           <w:highlight w:val="yellow"/>
         </w:rPr>
-        <w:t xml:space="preserve">{{ </w:t>
-      </w:r>
-      <w:proofErr w:type="spellStart"/>
+        <w:t>[[</w:t>
+      </w:r>
       <w:r>
         <w:rPr>
           <w:rFonts w:ascii="Times New Roman" w:hAnsi="Times New Roman" w:cs="Times New Roman"/>
@@ -466,9 +155,8 @@
           <w:szCs w:val="23"/>
           <w:highlight w:val="yellow"/>
         </w:rPr>
-        <w:t>firm</w:t>
-      </w:r>
-      <w:proofErr w:type="gramEnd"/>
+        <w:t>firm_address_full</w:t>
+      </w:r>
       <w:r>
         <w:rPr>
           <w:rFonts w:ascii="Times New Roman" w:hAnsi="Times New Roman" w:cs="Times New Roman"/>
@@ -477,192 +165,7 @@
           <w:szCs w:val="23"/>
           <w:highlight w:val="yellow"/>
         </w:rPr>
-        <w:t>_</w:t>
-      </w:r>
-      <w:proofErr w:type="gramStart"/>
-      <w:r>
-        <w:rPr>
-          <w:rFonts w:ascii="Times New Roman" w:hAnsi="Times New Roman" w:cs="Times New Roman"/>
-          <w:color w:val="000000"/>
-          <w:sz w:val="23"/>
-          <w:szCs w:val="23"/>
-          <w:highlight w:val="yellow"/>
-        </w:rPr>
-        <w:t>city</w:t>
-      </w:r>
-      <w:proofErr w:type="spellEnd"/>
-      <w:r>
-        <w:rPr>
-          <w:rFonts w:ascii="Times New Roman" w:hAnsi="Times New Roman" w:cs="Times New Roman"/>
-          <w:color w:val="000000"/>
-          <w:sz w:val="23"/>
-          <w:szCs w:val="23"/>
-          <w:highlight w:val="yellow"/>
-        </w:rPr>
-        <w:t xml:space="preserve"> }</w:t>
-      </w:r>
-      <w:proofErr w:type="gramEnd"/>
-      <w:r>
-        <w:rPr>
-          <w:rFonts w:ascii="Times New Roman" w:hAnsi="Times New Roman" w:cs="Times New Roman"/>
-          <w:color w:val="000000"/>
-          <w:sz w:val="23"/>
-          <w:szCs w:val="23"/>
-          <w:highlight w:val="yellow"/>
-        </w:rPr>
-        <w:t>}</w:t>
-      </w:r>
-      <w:r>
-        <w:rPr>
-          <w:rFonts w:ascii="Times New Roman" w:hAnsi="Times New Roman" w:cs="Times New Roman"/>
-          <w:color w:val="000000"/>
-          <w:sz w:val="23"/>
-          <w:szCs w:val="23"/>
-          <w:highlight w:val="yellow"/>
-        </w:rPr>
-        <w:t xml:space="preserve">, </w:t>
-      </w:r>
-      <w:proofErr w:type="gramStart"/>
-      <w:r>
-        <w:rPr>
-          <w:rFonts w:ascii="Times New Roman" w:hAnsi="Times New Roman" w:cs="Times New Roman"/>
-          <w:color w:val="000000"/>
-          <w:sz w:val="23"/>
-          <w:szCs w:val="23"/>
-          <w:highlight w:val="yellow"/>
-        </w:rPr>
-        <w:t xml:space="preserve">{{ </w:t>
-      </w:r>
-      <w:proofErr w:type="spellStart"/>
-      <w:r>
-        <w:rPr>
-          <w:rFonts w:ascii="Times New Roman" w:hAnsi="Times New Roman" w:cs="Times New Roman"/>
-          <w:color w:val="000000"/>
-          <w:sz w:val="23"/>
-          <w:szCs w:val="23"/>
-          <w:highlight w:val="yellow"/>
-        </w:rPr>
-        <w:t>firm</w:t>
-      </w:r>
-      <w:proofErr w:type="gramEnd"/>
-      <w:r>
-        <w:rPr>
-          <w:rFonts w:ascii="Times New Roman" w:hAnsi="Times New Roman" w:cs="Times New Roman"/>
-          <w:color w:val="000000"/>
-          <w:sz w:val="23"/>
-          <w:szCs w:val="23"/>
-          <w:highlight w:val="yellow"/>
-        </w:rPr>
-        <w:t>_</w:t>
-      </w:r>
-      <w:proofErr w:type="gramStart"/>
-      <w:r>
-        <w:rPr>
-          <w:rFonts w:ascii="Times New Roman" w:hAnsi="Times New Roman" w:cs="Times New Roman"/>
-          <w:color w:val="000000"/>
-          <w:sz w:val="23"/>
-          <w:szCs w:val="23"/>
-          <w:highlight w:val="yellow"/>
-        </w:rPr>
-        <w:t>state</w:t>
-      </w:r>
-      <w:proofErr w:type="spellEnd"/>
-      <w:r>
-        <w:rPr>
-          <w:rFonts w:ascii="Times New Roman" w:hAnsi="Times New Roman" w:cs="Times New Roman"/>
-          <w:color w:val="000000"/>
-          <w:sz w:val="23"/>
-          <w:szCs w:val="23"/>
-          <w:highlight w:val="yellow"/>
-        </w:rPr>
-        <w:t xml:space="preserve"> }</w:t>
-      </w:r>
-      <w:proofErr w:type="gramEnd"/>
-      <w:r>
-        <w:rPr>
-          <w:rFonts w:ascii="Times New Roman" w:hAnsi="Times New Roman" w:cs="Times New Roman"/>
-          <w:color w:val="000000"/>
-          <w:sz w:val="23"/>
-          <w:szCs w:val="23"/>
-          <w:highlight w:val="yellow"/>
-        </w:rPr>
-        <w:t>}</w:t>
-      </w:r>
-      <w:r>
-        <w:rPr>
-          <w:rFonts w:ascii="Times New Roman" w:hAnsi="Times New Roman" w:cs="Times New Roman"/>
-          <w:iCs/>
-          <w:sz w:val="24"/>
-          <w:szCs w:val="24"/>
-          <w:highlight w:val="yellow"/>
-        </w:rPr>
-        <w:t xml:space="preserve"> </w:t>
-      </w:r>
-      <w:proofErr w:type="gramStart"/>
-      <w:r>
-        <w:rPr>
-          <w:rFonts w:ascii="Times New Roman" w:hAnsi="Times New Roman" w:cs="Times New Roman"/>
-          <w:color w:val="000000"/>
-          <w:sz w:val="23"/>
-          <w:szCs w:val="23"/>
-          <w:highlight w:val="yellow"/>
-        </w:rPr>
-        <w:t xml:space="preserve">{{ </w:t>
-      </w:r>
-      <w:proofErr w:type="spellStart"/>
-      <w:r>
-        <w:rPr>
-          <w:rFonts w:ascii="Times New Roman" w:hAnsi="Times New Roman" w:cs="Times New Roman"/>
-          <w:color w:val="000000"/>
-          <w:sz w:val="23"/>
-          <w:szCs w:val="23"/>
-          <w:highlight w:val="yellow"/>
-        </w:rPr>
-        <w:t>firm</w:t>
-      </w:r>
-      <w:proofErr w:type="gramEnd"/>
-      <w:r>
-        <w:rPr>
-          <w:rFonts w:ascii="Times New Roman" w:hAnsi="Times New Roman" w:cs="Times New Roman"/>
-          <w:color w:val="000000"/>
-          <w:sz w:val="23"/>
-          <w:szCs w:val="23"/>
-          <w:highlight w:val="yellow"/>
-        </w:rPr>
-        <w:t>_zip_</w:t>
-      </w:r>
-      <w:proofErr w:type="gramStart"/>
-      <w:r>
-        <w:rPr>
-          <w:rFonts w:ascii="Times New Roman" w:hAnsi="Times New Roman" w:cs="Times New Roman"/>
-          <w:color w:val="000000"/>
-          <w:sz w:val="23"/>
-          <w:szCs w:val="23"/>
-          <w:highlight w:val="yellow"/>
-        </w:rPr>
-        <w:t>code</w:t>
-      </w:r>
-      <w:proofErr w:type="spellEnd"/>
-      <w:r>
-        <w:rPr>
-          <w:rFonts w:ascii="Times New Roman" w:hAnsi="Times New Roman" w:cs="Times New Roman"/>
-          <w:color w:val="000000"/>
-          <w:sz w:val="23"/>
-          <w:szCs w:val="23"/>
-          <w:highlight w:val="yellow"/>
-        </w:rPr>
-        <w:t xml:space="preserve"> }</w:t>
-      </w:r>
-      <w:proofErr w:type="gramEnd"/>
-      <w:r>
-        <w:rPr>
-          <w:rFonts w:ascii="Times New Roman" w:hAnsi="Times New Roman" w:cs="Times New Roman"/>
-          <w:color w:val="000000"/>
-          <w:sz w:val="23"/>
-          <w:szCs w:val="23"/>
-          <w:highlight w:val="yellow"/>
-        </w:rPr>
-        <w:t>}</w:t>
+        <w:t>]]</w:t>
       </w:r>
     </w:p>
     <w:p>
@@ -723,85 +226,55 @@
         </w:rPr>
         <w:t xml:space="preserve">: </w:t>
       </w:r>
-      <w:proofErr w:type="gramStart"/>
       <w:r>
         <w:rPr>
           <w:b/>
           <w:bCs/>
           <w:i/>
           <w:iCs/>
-        </w:rPr>
-        <w:t xml:space="preserve">{{ </w:t>
-      </w:r>
-      <w:proofErr w:type="spellStart"/>
+          <w:highlight w:val="yellow"/>
+        </w:rPr>
+        <w:t>[[</w:t>
+      </w:r>
       <w:r>
         <w:rPr>
           <w:b/>
           <w:bCs/>
           <w:i/>
           <w:iCs/>
-        </w:rPr>
-        <w:t>firm</w:t>
-      </w:r>
-      <w:proofErr w:type="gramEnd"/>
+          <w:highlight w:val="yellow"/>
+        </w:rPr>
+        <w:t>firm_email</w:t>
+      </w:r>
       <w:r>
         <w:rPr>
           <w:b/>
           <w:bCs/>
           <w:i/>
           <w:iCs/>
-        </w:rPr>
-        <w:t>_</w:t>
-      </w:r>
-      <w:proofErr w:type="gramStart"/>
-      <w:r>
-        <w:rPr>
-          <w:b/>
-          <w:bCs/>
+          <w:highlight w:val="yellow"/>
+        </w:rPr>
+        <w:t>]]</w:t>
+      </w:r>
+    </w:p>
+    <w:p>
+      <w:pPr>
+        <w:spacing w:line="240" w:lineRule="auto"/>
+        <w:rPr>
+          <w:rFonts w:ascii="Times New Roman" w:hAnsi="Times New Roman" w:cs="Times New Roman"/>
           <w:i/>
           <w:iCs/>
-        </w:rPr>
-        <w:t>email</w:t>
-      </w:r>
-      <w:proofErr w:type="spellEnd"/>
-      <w:r>
-        <w:rPr>
-          <w:b/>
-          <w:bCs/>
-          <w:i/>
-          <w:iCs/>
-        </w:rPr>
-        <w:t xml:space="preserve"> }</w:t>
-      </w:r>
-      <w:proofErr w:type="gramEnd"/>
-      <w:r>
-        <w:rPr>
-          <w:b/>
-          <w:bCs/>
-          <w:i/>
-          <w:iCs/>
-        </w:rPr>
-        <w:t>}</w:t>
-      </w:r>
+          <w:sz w:val="24"/>
+          <w:szCs w:val="24"/>
+          <w:u w:val="single"/>
+        </w:rPr>
+      </w:pPr>
     </w:p>
     <w:p>
       <w:pPr>
         <w:spacing w:line="240" w:lineRule="auto"/>
         <w:rPr>
           <w:rFonts w:ascii="Times New Roman" w:hAnsi="Times New Roman" w:cs="Times New Roman"/>
-          <w:i/>
-          <w:iCs/>
-          <w:sz w:val="24"/>
-          <w:szCs w:val="24"/>
-          <w:u w:val="single"/>
-        </w:rPr>
-      </w:pPr>
-    </w:p>
-    <w:p>
-      <w:pPr>
-        <w:spacing w:line="240" w:lineRule="auto"/>
-        <w:rPr>
-          <w:rFonts w:ascii="Times New Roman" w:hAnsi="Times New Roman" w:cs="Times New Roman"/>
           <w:sz w:val="24"/>
           <w:szCs w:val="24"/>
         </w:rPr>
@@ -870,7 +343,6 @@
         </w:rPr>
         <w:t xml:space="preserve">RE: </w:t>
       </w:r>
-      <w:proofErr w:type="gramStart"/>
       <w:r>
         <w:rPr>
           <w:rFonts w:ascii="Times New Roman" w:hAnsi="Times New Roman" w:cs="Times New Roman"/>
@@ -879,9 +351,8 @@
           <w:szCs w:val="23"/>
           <w:highlight w:val="yellow"/>
         </w:rPr>
-        <w:t xml:space="preserve">{{ </w:t>
-      </w:r>
-      <w:proofErr w:type="spellStart"/>
+        <w:t>[[</w:t>
+      </w:r>
       <w:r>
         <w:rPr>
           <w:rFonts w:ascii="Times New Roman" w:hAnsi="Times New Roman" w:cs="Times New Roman"/>
@@ -890,9 +361,8 @@
           <w:szCs w:val="23"/>
           <w:highlight w:val="yellow"/>
         </w:rPr>
-        <w:t>claimant</w:t>
-      </w:r>
-      <w:proofErr w:type="gramEnd"/>
+        <w:t>claimant_name_f</w:t>
+      </w:r>
       <w:r>
         <w:rPr>
           <w:rFonts w:ascii="Times New Roman" w:hAnsi="Times New Roman" w:cs="Times New Roman"/>
@@ -901,9 +371,8 @@
           <w:szCs w:val="23"/>
           <w:highlight w:val="yellow"/>
         </w:rPr>
-        <w:t>_name_</w:t>
-      </w:r>
-      <w:proofErr w:type="gramStart"/>
+        <w:t>ull</w:t>
+      </w:r>
       <w:r>
         <w:rPr>
           <w:rFonts w:ascii="Times New Roman" w:hAnsi="Times New Roman" w:cs="Times New Roman"/>
@@ -912,104 +381,7 @@
           <w:szCs w:val="23"/>
           <w:highlight w:val="yellow"/>
         </w:rPr>
-        <w:t>first</w:t>
-      </w:r>
-      <w:proofErr w:type="spellEnd"/>
-      <w:r>
-        <w:rPr>
-          <w:rFonts w:ascii="Times New Roman" w:hAnsi="Times New Roman" w:cs="Times New Roman"/>
-          <w:color w:val="000000"/>
-          <w:sz w:val="23"/>
-          <w:szCs w:val="23"/>
-          <w:highlight w:val="yellow"/>
-        </w:rPr>
-        <w:t xml:space="preserve"> }</w:t>
-      </w:r>
-      <w:proofErr w:type="gramEnd"/>
-      <w:r>
-        <w:rPr>
-          <w:rFonts w:ascii="Times New Roman" w:hAnsi="Times New Roman" w:cs="Times New Roman"/>
-          <w:color w:val="000000"/>
-          <w:sz w:val="23"/>
-          <w:szCs w:val="23"/>
-          <w:highlight w:val="yellow"/>
-        </w:rPr>
-        <w:t>}</w:t>
-      </w:r>
-      <w:r>
-        <w:rPr>
-          <w:rFonts w:ascii="Times New Roman" w:hAnsi="Times New Roman" w:cs="Times New Roman"/>
-          <w:color w:val="000000"/>
-          <w:sz w:val="23"/>
-          <w:szCs w:val="23"/>
-        </w:rPr>
-        <w:t xml:space="preserve"> </w:t>
-      </w:r>
-      <w:proofErr w:type="gramStart"/>
-      <w:r>
-        <w:rPr>
-          <w:rFonts w:ascii="Times New Roman" w:hAnsi="Times New Roman" w:cs="Times New Roman"/>
-          <w:color w:val="000000"/>
-          <w:sz w:val="23"/>
-          <w:szCs w:val="23"/>
-          <w:highlight w:val="yellow"/>
-        </w:rPr>
-        <w:t xml:space="preserve">{{ </w:t>
-      </w:r>
-      <w:proofErr w:type="spellStart"/>
-      <w:r>
-        <w:rPr>
-          <w:rFonts w:ascii="Times New Roman" w:hAnsi="Times New Roman" w:cs="Times New Roman"/>
-          <w:color w:val="000000"/>
-          <w:sz w:val="23"/>
-          <w:szCs w:val="23"/>
-          <w:highlight w:val="yellow"/>
-        </w:rPr>
-        <w:t>claimant</w:t>
-      </w:r>
-      <w:proofErr w:type="gramEnd"/>
-      <w:r>
-        <w:rPr>
-          <w:rFonts w:ascii="Times New Roman" w:hAnsi="Times New Roman" w:cs="Times New Roman"/>
-          <w:color w:val="000000"/>
-          <w:sz w:val="23"/>
-          <w:szCs w:val="23"/>
-          <w:highlight w:val="yellow"/>
-        </w:rPr>
-        <w:t>_name_</w:t>
-      </w:r>
-      <w:proofErr w:type="gramStart"/>
-      <w:r>
-        <w:rPr>
-          <w:rFonts w:ascii="Times New Roman" w:hAnsi="Times New Roman" w:cs="Times New Roman"/>
-          <w:color w:val="000000"/>
-          <w:sz w:val="23"/>
-          <w:szCs w:val="23"/>
-          <w:highlight w:val="yellow"/>
-        </w:rPr>
-        <w:t>last</w:t>
-      </w:r>
-      <w:proofErr w:type="spellEnd"/>
-      <w:r>
-        <w:rPr>
-          <w:rFonts w:ascii="Times New Roman" w:hAnsi="Times New Roman" w:cs="Times New Roman"/>
-          <w:color w:val="000000"/>
-          <w:sz w:val="23"/>
-          <w:szCs w:val="23"/>
-          <w:highlight w:val="yellow"/>
-        </w:rPr>
-        <w:t xml:space="preserve"> }</w:t>
-      </w:r>
-      <w:proofErr w:type="gramEnd"/>
-      <w:r>
-        <w:rPr>
-          <w:rFonts w:ascii="Times New Roman" w:hAnsi="Times New Roman" w:cs="Times New Roman"/>
-          <w:color w:val="000000"/>
-          <w:sz w:val="23"/>
-          <w:szCs w:val="23"/>
-          <w:highlight w:val="yellow"/>
-        </w:rPr>
-        <w:t>}</w:t>
+        <w:t>]]</w:t>
       </w:r>
     </w:p>
     <w:p>
@@ -1037,114 +409,51 @@
           <w:sz w:val="24"/>
           <w:szCs w:val="24"/>
         </w:rPr>
-        <w:t xml:space="preserve">Dear </w:t>
-      </w:r>
-      <w:r>
-        <w:rPr>
-          <w:rFonts w:ascii="Times New Roman" w:hAnsi="Times New Roman" w:cs="Times New Roman"/>
-          <w:sz w:val="24"/>
-          <w:szCs w:val="24"/>
-          <w:highlight w:val="yellow"/>
-        </w:rPr>
-        <w:fldChar w:fldCharType="begin"/>
-      </w:r>
-      <w:r>
-        <w:rPr>
-          <w:rFonts w:ascii="Times New Roman" w:hAnsi="Times New Roman" w:cs="Times New Roman"/>
-          <w:sz w:val="24"/>
-          <w:szCs w:val="24"/>
-          <w:highlight w:val="yellow"/>
-        </w:rPr>
-        <w:instrText xml:space="preserve"> DOCVARIABLE "zapLink¦2!1!AttorneySalutation" </w:instrText>
-      </w:r>
-      <w:r>
-        <w:rPr>
-          <w:rFonts w:ascii="Times New Roman" w:hAnsi="Times New Roman" w:cs="Times New Roman"/>
-          <w:sz w:val="24"/>
-          <w:szCs w:val="24"/>
-          <w:highlight w:val="yellow"/>
-        </w:rPr>
-        <w:fldChar w:fldCharType="separate"/>
-      </w:r>
-      <w:r>
-        <w:rPr>
-          <w:rFonts w:ascii="Times New Roman" w:hAnsi="Times New Roman" w:cs="Times New Roman"/>
-          <w:color w:val="000000"/>
-          <w:sz w:val="23"/>
-          <w:szCs w:val="23"/>
-          <w:highlight w:val="yellow"/>
-        </w:rPr>
-        <w:t xml:space="preserve">{{ </w:t>
-      </w:r>
-      <w:proofErr w:type="spellStart"/>
-      <w:r>
-        <w:rPr>
-          <w:rFonts w:ascii="Times New Roman" w:hAnsi="Times New Roman" w:cs="Times New Roman"/>
-          <w:color w:val="000000"/>
-          <w:sz w:val="23"/>
-          <w:szCs w:val="23"/>
+        <w:t>Dear</w:t>
+      </w:r>
+      <w:r>
+        <w:rPr>
+          <w:rFonts w:ascii="Times New Roman" w:hAnsi="Times New Roman" w:cs="Times New Roman"/>
+          <w:sz w:val="24"/>
+          <w:szCs w:val="24"/>
+        </w:rPr>
+        <w:t xml:space="preserve"> </w:t>
+      </w:r>
+      <w:r>
+        <w:rPr>
+          <w:rFonts w:ascii="Times New Roman" w:hAnsi="Times New Roman" w:cs="Times New Roman"/>
+          <w:sz w:val="24"/>
+          <w:szCs w:val="24"/>
+          <w:highlight w:val="yellow"/>
+        </w:rPr>
+        <w:t>[[</w:t>
+      </w:r>
+      <w:r>
+        <w:rPr>
+          <w:rFonts w:ascii="Times New Roman" w:hAnsi="Times New Roman" w:cs="Times New Roman"/>
+          <w:sz w:val="24"/>
+          <w:szCs w:val="24"/>
           <w:highlight w:val="yellow"/>
         </w:rPr>
         <w:t>attorney_salutation</w:t>
       </w:r>
-      <w:proofErr w:type="spellEnd"/>
-      <w:r>
-        <w:rPr>
-          <w:rFonts w:ascii="Times New Roman" w:hAnsi="Times New Roman" w:cs="Times New Roman"/>
-          <w:color w:val="000000"/>
-          <w:sz w:val="23"/>
-          <w:szCs w:val="23"/>
-          <w:highlight w:val="yellow"/>
-        </w:rPr>
-        <w:t xml:space="preserve"> }}</w:t>
-      </w:r>
-      <w:r>
-        <w:rPr>
-          <w:rFonts w:ascii="Times New Roman" w:hAnsi="Times New Roman" w:cs="Times New Roman"/>
-          <w:sz w:val="24"/>
-          <w:szCs w:val="24"/>
-          <w:highlight w:val="yellow"/>
-        </w:rPr>
-        <w:t xml:space="preserve"> </w:t>
-      </w:r>
-      <w:r>
-        <w:rPr>
-          <w:rFonts w:ascii="Times New Roman" w:hAnsi="Times New Roman" w:cs="Times New Roman"/>
-          <w:sz w:val="24"/>
-          <w:szCs w:val="24"/>
-          <w:highlight w:val="yellow"/>
-        </w:rPr>
-        <w:fldChar w:fldCharType="end"/>
-      </w:r>
-      <w:r>
-        <w:rPr>
-          <w:rFonts w:ascii="Times New Roman" w:hAnsi="Times New Roman" w:cs="Times New Roman"/>
-          <w:color w:val="000000"/>
-          <w:sz w:val="23"/>
-          <w:szCs w:val="23"/>
-          <w:highlight w:val="yellow"/>
-        </w:rPr>
-        <w:t xml:space="preserve">{{ </w:t>
-      </w:r>
-      <w:r>
-        <w:rPr>
-          <w:rFonts w:ascii="Times New Roman" w:hAnsi="Times New Roman" w:cs="Times New Roman"/>
-          <w:color w:val="000000"/>
-          <w:sz w:val="23"/>
-          <w:szCs w:val="23"/>
-          <w:highlight w:val="yellow"/>
-        </w:rPr>
-        <w:t>attorney_name_last</w:t>
-      </w:r>
-      <w:r>
-        <w:rPr>
-          <w:rFonts w:ascii="Times New Roman" w:hAnsi="Times New Roman" w:cs="Times New Roman"/>
-          <w:color w:val="000000"/>
-          <w:sz w:val="23"/>
-          <w:szCs w:val="23"/>
-          <w:highlight w:val="yellow"/>
-        </w:rPr>
-        <w:t xml:space="preserve"> }}</w:t>
+      <w:r>
+        <w:rPr>
+          <w:rFonts w:ascii="Times New Roman" w:hAnsi="Times New Roman" w:cs="Times New Roman"/>
+          <w:sz w:val="24"/>
+          <w:szCs w:val="24"/>
+          <w:highlight w:val="yellow"/>
+        </w:rPr>
+        <w:t>_with_name_last</w:t>
+      </w:r>
+      <w:r>
+        <w:rPr>
+          <w:rFonts w:ascii="Times New Roman" w:hAnsi="Times New Roman" w:cs="Times New Roman"/>
+          <w:sz w:val="24"/>
+          <w:szCs w:val="24"/>
+          <w:highlight w:val="yellow"/>
+        </w:rPr>
+        <w:t>]]</w:t>
       </w:r>
       <w:r>
         <w:rPr>
@@ -1185,7 +494,7 @@
           <w:rFonts w:ascii="Times New Roman" w:hAnsi="Times New Roman" w:cs="Times New Roman"/>
           <w:sz w:val="24"/>
           <w:szCs w:val="24"/>
-          <w:highlight w:val="yellow"/>
+          <w:highlight w:val="green"/>
         </w:rPr>
         <w:t>Life Care Plan</w:t>
       </w:r>
@@ -1204,63 +513,25 @@
           <w:szCs w:val="24"/>
           <w:highlight w:val="yellow"/>
         </w:rPr>
-        <w:fldChar w:fldCharType="begin"/>
-      </w:r>
-      <w:r>
-        <w:rPr>
-          <w:rFonts w:ascii="Times New Roman" w:hAnsi="Times New Roman" w:cs="Times New Roman"/>
-          <w:sz w:val="24"/>
-          <w:szCs w:val="24"/>
-          <w:highlight w:val="yellow"/>
-        </w:rPr>
-        <w:instrText xml:space="preserve"> DOCVARIABLE "zapLink¦2!1!LifeCarePlanner" </w:instrText>
-      </w:r>
-      <w:r>
-        <w:rPr>
-          <w:rFonts w:ascii="Times New Roman" w:hAnsi="Times New Roman" w:cs="Times New Roman"/>
-          <w:sz w:val="24"/>
-          <w:szCs w:val="24"/>
-          <w:highlight w:val="yellow"/>
-        </w:rPr>
-        <w:fldChar w:fldCharType="separate"/>
-      </w:r>
-      <w:r>
-        <w:rPr>
-          <w:rFonts w:ascii="Times New Roman" w:hAnsi="Times New Roman" w:cs="Times New Roman"/>
-          <w:sz w:val="24"/>
-          <w:szCs w:val="24"/>
-          <w:highlight w:val="yellow"/>
-        </w:rPr>
-        <w:t xml:space="preserve">Todd S. </w:t>
-      </w:r>
-      <w:proofErr w:type="spellStart"/>
-      <w:r>
-        <w:rPr>
-          <w:rFonts w:ascii="Times New Roman" w:hAnsi="Times New Roman" w:cs="Times New Roman"/>
-          <w:sz w:val="24"/>
-          <w:szCs w:val="24"/>
-          <w:highlight w:val="yellow"/>
-        </w:rPr>
-        <w:t>Capielano</w:t>
-      </w:r>
-      <w:proofErr w:type="spellEnd"/>
-      <w:r>
-        <w:rPr>
-          <w:rFonts w:ascii="Times New Roman" w:hAnsi="Times New Roman" w:cs="Times New Roman"/>
-          <w:sz w:val="24"/>
-          <w:szCs w:val="24"/>
-          <w:highlight w:val="yellow"/>
-        </w:rPr>
-        <w:t>, CLCP</w:t>
-      </w:r>
-      <w:r>
-        <w:rPr>
-          <w:rFonts w:ascii="Times New Roman" w:hAnsi="Times New Roman" w:cs="Times New Roman"/>
-          <w:sz w:val="24"/>
-          <w:szCs w:val="24"/>
-          <w:highlight w:val="yellow"/>
-        </w:rPr>
-        <w:fldChar w:fldCharType="end"/>
+        <w:t>[[</w:t>
+      </w:r>
+      <w:r>
+        <w:rPr>
+          <w:rFonts w:ascii="Times New Roman" w:hAnsi="Times New Roman" w:cs="Times New Roman"/>
+          <w:sz w:val="24"/>
+          <w:szCs w:val="24"/>
+          <w:highlight w:val="yellow"/>
+        </w:rPr>
+        <w:t>LCP_preparer</w:t>
+      </w:r>
+      <w:r>
+        <w:rPr>
+          <w:rFonts w:ascii="Times New Roman" w:hAnsi="Times New Roman" w:cs="Times New Roman"/>
+          <w:sz w:val="24"/>
+          <w:szCs w:val="24"/>
+          <w:highlight w:val="yellow"/>
+        </w:rPr>
+        <w:t>]]</w:t>
       </w:r>
       <w:r>
         <w:rPr>
@@ -1293,43 +564,25 @@
           <w:szCs w:val="24"/>
           <w:highlight w:val="yellow"/>
         </w:rPr>
-        <w:fldChar w:fldCharType="begin"/>
-      </w:r>
-      <w:r>
-        <w:rPr>
-          <w:rFonts w:ascii="Times New Roman" w:hAnsi="Times New Roman" w:cs="Times New Roman"/>
-          <w:sz w:val="24"/>
-          <w:szCs w:val="24"/>
-          <w:highlight w:val="yellow"/>
-        </w:rPr>
-        <w:instrText xml:space="preserve"> DOCVARIABLE "zapLink¦2!1!LCPReportDate" </w:instrText>
-      </w:r>
-      <w:r>
-        <w:rPr>
-          <w:rFonts w:ascii="Times New Roman" w:hAnsi="Times New Roman" w:cs="Times New Roman"/>
-          <w:sz w:val="24"/>
-          <w:szCs w:val="24"/>
-          <w:highlight w:val="yellow"/>
-        </w:rPr>
-        <w:fldChar w:fldCharType="separate"/>
-      </w:r>
-      <w:r>
-        <w:rPr>
-          <w:rFonts w:ascii="Times New Roman" w:hAnsi="Times New Roman" w:cs="Times New Roman"/>
-          <w:sz w:val="24"/>
-          <w:szCs w:val="24"/>
-          <w:highlight w:val="yellow"/>
-        </w:rPr>
-        <w:t>TBD</w:t>
-      </w:r>
-      <w:r>
-        <w:rPr>
-          <w:rFonts w:ascii="Times New Roman" w:hAnsi="Times New Roman" w:cs="Times New Roman"/>
-          <w:sz w:val="24"/>
-          <w:szCs w:val="24"/>
-          <w:highlight w:val="yellow"/>
-        </w:rPr>
-        <w:fldChar w:fldCharType="end"/>
+        <w:t>[[</w:t>
+      </w:r>
+      <w:r>
+        <w:rPr>
+          <w:rFonts w:ascii="Times New Roman" w:hAnsi="Times New Roman" w:cs="Times New Roman"/>
+          <w:sz w:val="24"/>
+          <w:szCs w:val="24"/>
+          <w:highlight w:val="yellow"/>
+        </w:rPr>
+        <w:t>LCP_report_date</w:t>
+      </w:r>
+      <w:r>
+        <w:rPr>
+          <w:rFonts w:ascii="Times New Roman" w:hAnsi="Times New Roman" w:cs="Times New Roman"/>
+          <w:sz w:val="24"/>
+          <w:szCs w:val="24"/>
+          <w:highlight w:val="yellow"/>
+        </w:rPr>
+        <w:t>]]</w:t>
       </w:r>
       <w:r>
         <w:rPr>
@@ -1353,9 +606,8 @@
           <w:rFonts w:ascii="Times New Roman" w:hAnsi="Times New Roman" w:cs="Times New Roman"/>
           <w:sz w:val="24"/>
           <w:szCs w:val="24"/>
-          <w:highlight w:val="yellow"/>
-        </w:rPr>
-        <w:t>Your client</w:t>
+        </w:rPr>
+        <w:t>The plaintiff</w:t>
       </w:r>
       <w:r>
         <w:rPr>
@@ -1379,66 +631,32 @@
           <w:sz w:val="24"/>
           <w:szCs w:val="24"/>
           <w:highlight w:val="yellow"/>
-          <w:u w:val="single"/>
-        </w:rPr>
-        <w:fldChar w:fldCharType="begin"/>
-      </w:r>
-      <w:r>
-        <w:rPr>
-          <w:rFonts w:ascii="Times New Roman" w:hAnsi="Times New Roman" w:cs="Times New Roman"/>
-          <w:sz w:val="24"/>
-          <w:szCs w:val="24"/>
-          <w:highlight w:val="yellow"/>
-          <w:u w:val="single"/>
-        </w:rPr>
-        <w:instrText xml:space="preserve"> DOCVARIABLE "zapLink¦2!1!Lower_Bound_of_Estimate" </w:instrText>
-      </w:r>
-      <w:r>
-        <w:rPr>
-          <w:rFonts w:ascii="Times New Roman" w:hAnsi="Times New Roman" w:cs="Times New Roman"/>
-          <w:sz w:val="24"/>
-          <w:szCs w:val="24"/>
-          <w:highlight w:val="yellow"/>
-          <w:u w:val="single"/>
-        </w:rPr>
-        <w:fldChar w:fldCharType="separate"/>
-      </w:r>
-      <w:r>
-        <w:rPr>
-          <w:rFonts w:ascii="Times New Roman" w:hAnsi="Times New Roman" w:cs="Times New Roman"/>
-          <w:sz w:val="24"/>
-          <w:szCs w:val="24"/>
-          <w:highlight w:val="yellow"/>
-          <w:u w:val="single"/>
-        </w:rPr>
-        <w:t xml:space="preserve"> $10 </w:t>
-      </w:r>
-      <w:r>
-        <w:rPr>
-          <w:rFonts w:ascii="Times New Roman" w:hAnsi="Times New Roman" w:cs="Times New Roman"/>
-          <w:sz w:val="24"/>
-          <w:szCs w:val="24"/>
-          <w:highlight w:val="yellow"/>
-          <w:u w:val="single"/>
-        </w:rPr>
-        <w:fldChar w:fldCharType="end"/>
-      </w:r>
-      <w:r>
-        <w:rPr>
-          <w:rFonts w:ascii="Times New Roman" w:hAnsi="Times New Roman" w:cs="Times New Roman"/>
-          <w:sz w:val="24"/>
-          <w:szCs w:val="24"/>
-          <w:highlight w:val="yellow"/>
-        </w:rPr>
-        <w:t>to</w:t>
-      </w:r>
-      <w:r>
-        <w:rPr>
-          <w:rFonts w:ascii="Times New Roman" w:hAnsi="Times New Roman" w:cs="Times New Roman"/>
-          <w:sz w:val="24"/>
-          <w:szCs w:val="24"/>
-          <w:highlight w:val="yellow"/>
-          <w:u w:val="single"/>
+        </w:rPr>
+        <w:t>[[</w:t>
+      </w:r>
+      <w:r>
+        <w:rPr>
+          <w:rFonts w:ascii="Times New Roman" w:hAnsi="Times New Roman" w:cs="Times New Roman"/>
+          <w:sz w:val="24"/>
+          <w:szCs w:val="24"/>
+          <w:highlight w:val="yellow"/>
+        </w:rPr>
+        <w:t>estimate_lower_bound</w:t>
+      </w:r>
+      <w:r>
+        <w:rPr>
+          <w:rFonts w:ascii="Times New Roman" w:hAnsi="Times New Roman" w:cs="Times New Roman"/>
+          <w:sz w:val="24"/>
+          <w:szCs w:val="24"/>
+          <w:highlight w:val="yellow"/>
+        </w:rPr>
+        <w:t>]]</w:t>
+      </w:r>
+      <w:r>
+        <w:rPr>
+          <w:rFonts w:ascii="Times New Roman" w:hAnsi="Times New Roman" w:cs="Times New Roman"/>
+          <w:sz w:val="24"/>
+          <w:szCs w:val="24"/>
         </w:rPr>
         <w:t xml:space="preserve"> </w:t>
       </w:r>
@@ -1447,52 +665,44 @@
           <w:rFonts w:ascii="Times New Roman" w:hAnsi="Times New Roman" w:cs="Times New Roman"/>
           <w:sz w:val="24"/>
           <w:szCs w:val="24"/>
-          <w:highlight w:val="yellow"/>
-          <w:u w:val="single"/>
-        </w:rPr>
-        <w:fldChar w:fldCharType="begin"/>
-      </w:r>
-      <w:r>
-        <w:rPr>
-          <w:rFonts w:ascii="Times New Roman" w:hAnsi="Times New Roman" w:cs="Times New Roman"/>
-          <w:sz w:val="24"/>
-          <w:szCs w:val="24"/>
-          <w:highlight w:val="yellow"/>
-          <w:u w:val="single"/>
-        </w:rPr>
-        <w:instrText xml:space="preserve"> DOCVARIABLE "zapLink¦2!1!Upper_Bound_of_Estimate" </w:instrText>
-      </w:r>
-      <w:r>
-        <w:rPr>
-          <w:rFonts w:ascii="Times New Roman" w:hAnsi="Times New Roman" w:cs="Times New Roman"/>
-          <w:sz w:val="24"/>
-          <w:szCs w:val="24"/>
-          <w:highlight w:val="yellow"/>
-          <w:u w:val="single"/>
-        </w:rPr>
-        <w:fldChar w:fldCharType="separate"/>
-      </w:r>
-      <w:r>
-        <w:rPr>
-          <w:rFonts w:ascii="Times New Roman" w:hAnsi="Times New Roman" w:cs="Times New Roman"/>
-          <w:sz w:val="24"/>
-          <w:szCs w:val="24"/>
-          <w:highlight w:val="yellow"/>
-          <w:u w:val="single"/>
-        </w:rPr>
-        <w:t xml:space="preserve"> $20 </w:t>
-      </w:r>
-      <w:r>
-        <w:rPr>
-          <w:rFonts w:ascii="Times New Roman" w:hAnsi="Times New Roman" w:cs="Times New Roman"/>
-          <w:sz w:val="24"/>
-          <w:szCs w:val="24"/>
-          <w:highlight w:val="yellow"/>
-          <w:u w:val="single"/>
-        </w:rPr>
-        <w:fldChar w:fldCharType="end"/>
-      </w:r>
-      <w:proofErr w:type="gramStart"/>
+        </w:rPr>
+        <w:t xml:space="preserve">to </w:t>
+      </w:r>
+      <w:r>
+        <w:rPr>
+          <w:rFonts w:ascii="Times New Roman" w:hAnsi="Times New Roman" w:cs="Times New Roman"/>
+          <w:sz w:val="24"/>
+          <w:szCs w:val="24"/>
+          <w:highlight w:val="yellow"/>
+        </w:rPr>
+        <w:t>[[</w:t>
+      </w:r>
+      <w:r>
+        <w:rPr>
+          <w:rFonts w:ascii="Times New Roman" w:hAnsi="Times New Roman" w:cs="Times New Roman"/>
+          <w:sz w:val="24"/>
+          <w:szCs w:val="24"/>
+          <w:highlight w:val="yellow"/>
+        </w:rPr>
+        <w:t>estimate_upper_bound</w:t>
+      </w:r>
+      <w:r>
+        <w:rPr>
+          <w:rFonts w:ascii="Times New Roman" w:hAnsi="Times New Roman" w:cs="Times New Roman"/>
+          <w:sz w:val="24"/>
+          <w:szCs w:val="24"/>
+          <w:highlight w:val="yellow"/>
+        </w:rPr>
+        <w:t>]]</w:t>
+      </w:r>
+      <w:r>
+        <w:rPr>
+          <w:rFonts w:ascii="Times New Roman" w:hAnsi="Times New Roman" w:cs="Times New Roman"/>
+          <w:sz w:val="24"/>
+          <w:szCs w:val="24"/>
+        </w:rPr>
+        <w:t xml:space="preserve"> </w:t>
+      </w:r>
       <w:r>
         <w:rPr>
           <w:rFonts w:ascii="Times New Roman" w:hAnsi="Times New Roman" w:cs="Times New Roman"/>
@@ -1507,16 +717,7 @@
           <w:sz w:val="24"/>
           <w:szCs w:val="24"/>
         </w:rPr>
-        <w:t xml:space="preserve"> order to</w:t>
-      </w:r>
-      <w:proofErr w:type="gramEnd"/>
-      <w:r>
-        <w:rPr>
-          <w:rFonts w:ascii="Times New Roman" w:hAnsi="Times New Roman" w:cs="Times New Roman"/>
-          <w:sz w:val="24"/>
-          <w:szCs w:val="24"/>
-        </w:rPr>
-        <w:t xml:space="preserve"> fund future medical </w:t>
+        <w:t xml:space="preserve"> order to fund future medical </w:t>
       </w:r>
       <w:r>
         <w:rPr>
@@ -1541,7 +742,7 @@
           <w:sz w:val="24"/>
           <w:szCs w:val="24"/>
         </w:rPr>
-        <w:t xml:space="preserve">is </w:t>
+        <w:t>is</w:t>
       </w:r>
       <w:r>
         <w:rPr>
@@ -1549,10 +750,8 @@
           <w:spacing w:val="-10"/>
           <w:sz w:val="24"/>
           <w:szCs w:val="24"/>
-          <w:highlight w:val="yellow"/>
-          <w:u w:val="single"/>
-        </w:rPr>
-        <w:fldChar w:fldCharType="begin"/>
+        </w:rPr>
+        <w:t xml:space="preserve"> </w:t>
       </w:r>
       <w:r>
         <w:rPr>
@@ -1561,9 +760,8 @@
           <w:sz w:val="24"/>
           <w:szCs w:val="24"/>
           <w:highlight w:val="yellow"/>
-          <w:u w:val="single"/>
-        </w:rPr>
-        <w:instrText xml:space="preserve"> DOCVARIABLE "zapLink¦2!1!Midpoint_of_Estimate" </w:instrText>
+        </w:rPr>
+        <w:t>[[</w:t>
       </w:r>
       <w:r>
         <w:rPr>
@@ -1572,9 +770,8 @@
           <w:sz w:val="24"/>
           <w:szCs w:val="24"/>
           <w:highlight w:val="yellow"/>
-          <w:u w:val="single"/>
-        </w:rPr>
-        <w:fldChar w:fldCharType="separate"/>
+        </w:rPr>
+        <w:t>estimate_midpoint</w:t>
       </w:r>
       <w:r>
         <w:rPr>
@@ -1583,20 +780,8 @@
           <w:sz w:val="24"/>
           <w:szCs w:val="24"/>
           <w:highlight w:val="yellow"/>
-          <w:u w:val="single"/>
-        </w:rPr>
-        <w:t xml:space="preserve"> $15 </w:t>
-      </w:r>
-      <w:r>
-        <w:rPr>
-          <w:rFonts w:ascii="Times New Roman" w:hAnsi="Times New Roman" w:cs="Times New Roman"/>
-          <w:spacing w:val="-10"/>
-          <w:sz w:val="24"/>
-          <w:szCs w:val="24"/>
-          <w:highlight w:val="yellow"/>
-          <w:u w:val="single"/>
-        </w:rPr>
-        <w:fldChar w:fldCharType="end"/>
+        </w:rPr>
+        <w:t>]]</w:t>
       </w:r>
       <w:r>
         <w:rPr>
@@ -1618,397 +803,32 @@
     </w:p>
     <w:p>
       <w:pPr>
-        <w:jc w:val="center"/>
-        <w:rPr>
-          <w:rFonts w:ascii="Times New Roman" w:hAnsi="Times New Roman" w:cs="Times New Roman"/>
-          <w:sz w:val="24"/>
-          <w:szCs w:val="24"/>
-        </w:rPr>
-      </w:pPr>
-      <w:r>
-        <w:rPr>
-          <w:rFonts w:ascii="Times New Roman" w:hAnsi="Times New Roman" w:cs="Times New Roman"/>
-          <w:sz w:val="24"/>
-          <w:szCs w:val="24"/>
-        </w:rPr>
-        <w:t>DURATION</w:t>
-      </w:r>
+        <w:spacing w:after="0"/>
+        <w:jc w:val="both"/>
+        <w:rPr>
+          <w:rFonts w:ascii="Times New Roman" w:hAnsi="Times New Roman" w:cs="Times New Roman"/>
+          <w:spacing w:val="-10"/>
+          <w:sz w:val="24"/>
+          <w:szCs w:val="24"/>
+        </w:rPr>
+      </w:pPr>
     </w:p>
     <w:p>
       <w:pPr>
-        <w:jc w:val="both"/>
-        <w:rPr>
-          <w:rFonts w:ascii="Times New Roman" w:hAnsi="Times New Roman" w:cs="Times New Roman"/>
-          <w:sz w:val="24"/>
-          <w:szCs w:val="24"/>
-        </w:rPr>
-      </w:pPr>
-      <w:r>
-        <w:rPr>
-          <w:rFonts w:ascii="Times New Roman" w:hAnsi="Times New Roman" w:cs="Times New Roman"/>
-          <w:sz w:val="24"/>
-          <w:szCs w:val="24"/>
-          <w:highlight w:val="yellow"/>
-        </w:rPr>
-        <w:fldChar w:fldCharType="begin"/>
-      </w:r>
-      <w:r>
-        <w:rPr>
-          <w:rFonts w:ascii="Times New Roman" w:hAnsi="Times New Roman" w:cs="Times New Roman"/>
-          <w:sz w:val="24"/>
-          <w:szCs w:val="24"/>
-          <w:highlight w:val="yellow"/>
-        </w:rPr>
-        <w:instrText xml:space="preserve"> DOCVARIABLE "zapLink¦2!1!ClaimantSalutation" </w:instrText>
-      </w:r>
-      <w:r>
-        <w:rPr>
-          <w:rFonts w:ascii="Times New Roman" w:hAnsi="Times New Roman" w:cs="Times New Roman"/>
-          <w:sz w:val="24"/>
-          <w:szCs w:val="24"/>
-          <w:highlight w:val="yellow"/>
-        </w:rPr>
-        <w:fldChar w:fldCharType="separate"/>
-      </w:r>
-      <w:proofErr w:type="spellStart"/>
-      <w:r>
-        <w:rPr>
-          <w:rFonts w:ascii="Times New Roman" w:hAnsi="Times New Roman" w:cs="Times New Roman"/>
-          <w:sz w:val="24"/>
-          <w:szCs w:val="24"/>
-          <w:highlight w:val="yellow"/>
-        </w:rPr>
-        <w:t>Mr.</w:t>
-      </w:r>
-      <w:r>
-        <w:rPr>
-          <w:rFonts w:ascii="Times New Roman" w:hAnsi="Times New Roman" w:cs="Times New Roman"/>
-          <w:sz w:val="24"/>
-          <w:szCs w:val="24"/>
-          <w:highlight w:val="yellow"/>
-        </w:rPr>
-        <w:fldChar w:fldCharType="end"/>
-      </w:r>
-      <w:r>
-        <w:rPr>
-          <w:rFonts w:ascii="Times New Roman" w:hAnsi="Times New Roman" w:cs="Times New Roman"/>
-          <w:sz w:val="24"/>
-          <w:szCs w:val="24"/>
-          <w:highlight w:val="yellow"/>
-        </w:rPr>
-        <w:fldChar w:fldCharType="begin"/>
-      </w:r>
-      <w:r>
-        <w:rPr>
-          <w:rFonts w:ascii="Times New Roman" w:hAnsi="Times New Roman" w:cs="Times New Roman"/>
-          <w:sz w:val="24"/>
-          <w:szCs w:val="24"/>
-          <w:highlight w:val="yellow"/>
-        </w:rPr>
-        <w:instrText xml:space="preserve"> DOCVARIABLE "zapLink¦2!1!Client_Name_Last" </w:instrText>
-      </w:r>
-      <w:r>
-        <w:rPr>
-          <w:rFonts w:ascii="Times New Roman" w:hAnsi="Times New Roman" w:cs="Times New Roman"/>
-          <w:sz w:val="24"/>
-          <w:szCs w:val="24"/>
-          <w:highlight w:val="yellow"/>
-        </w:rPr>
-        <w:fldChar w:fldCharType="separate"/>
-      </w:r>
-      <w:r>
-        <w:rPr>
-          <w:rFonts w:ascii="Times New Roman" w:hAnsi="Times New Roman" w:cs="Times New Roman"/>
-          <w:sz w:val="24"/>
-          <w:szCs w:val="24"/>
-          <w:highlight w:val="yellow"/>
-        </w:rPr>
-        <w:t>Dunkley</w:t>
-      </w:r>
-      <w:proofErr w:type="spellEnd"/>
-      <w:r>
-        <w:rPr>
-          <w:rFonts w:ascii="Times New Roman" w:hAnsi="Times New Roman" w:cs="Times New Roman"/>
-          <w:sz w:val="24"/>
-          <w:szCs w:val="24"/>
-          <w:highlight w:val="yellow"/>
-        </w:rPr>
-        <w:fldChar w:fldCharType="end"/>
-      </w:r>
-      <w:r>
-        <w:rPr>
-          <w:rFonts w:ascii="Times New Roman" w:hAnsi="Times New Roman" w:cs="Times New Roman"/>
-          <w:sz w:val="24"/>
-          <w:szCs w:val="24"/>
-        </w:rPr>
-        <w:t xml:space="preserve"> </w:t>
-      </w:r>
-      <w:r>
-        <w:rPr>
-          <w:rFonts w:ascii="Times New Roman" w:hAnsi="Times New Roman" w:cs="Times New Roman"/>
-          <w:sz w:val="24"/>
-          <w:szCs w:val="24"/>
-        </w:rPr>
-        <w:t>was born o</w:t>
-      </w:r>
-      <w:r>
-        <w:rPr>
-          <w:rFonts w:ascii="Times New Roman" w:hAnsi="Times New Roman" w:cs="Times New Roman"/>
-          <w:sz w:val="24"/>
-          <w:szCs w:val="24"/>
-        </w:rPr>
-        <w:t>n</w:t>
-      </w:r>
-      <w:r>
-        <w:rPr>
-          <w:rFonts w:ascii="Times New Roman" w:hAnsi="Times New Roman" w:cs="Times New Roman"/>
-          <w:sz w:val="24"/>
-          <w:szCs w:val="24"/>
-        </w:rPr>
-        <w:t xml:space="preserve"> </w:t>
-      </w:r>
-      <w:r>
-        <w:rPr>
-          <w:rFonts w:ascii="Times New Roman" w:hAnsi="Times New Roman" w:cs="Times New Roman"/>
-          <w:sz w:val="24"/>
-          <w:szCs w:val="24"/>
-          <w:highlight w:val="yellow"/>
-        </w:rPr>
-        <w:fldChar w:fldCharType="begin"/>
-      </w:r>
-      <w:r>
-        <w:rPr>
-          <w:rFonts w:ascii="Times New Roman" w:hAnsi="Times New Roman" w:cs="Times New Roman"/>
-          <w:sz w:val="24"/>
-          <w:szCs w:val="24"/>
-          <w:highlight w:val="yellow"/>
-        </w:rPr>
-        <w:instrText xml:space="preserve"> DOCVARIABLE "zapLink¦2!1!LongDOB" </w:instrText>
-      </w:r>
-      <w:r>
-        <w:rPr>
-          <w:rFonts w:ascii="Times New Roman" w:hAnsi="Times New Roman" w:cs="Times New Roman"/>
-          <w:sz w:val="24"/>
-          <w:szCs w:val="24"/>
-          <w:highlight w:val="yellow"/>
-        </w:rPr>
-        <w:fldChar w:fldCharType="separate"/>
-      </w:r>
-      <w:r>
-        <w:rPr>
-          <w:rFonts w:ascii="Times New Roman" w:hAnsi="Times New Roman" w:cs="Times New Roman"/>
-          <w:sz w:val="24"/>
-          <w:szCs w:val="24"/>
-          <w:highlight w:val="yellow"/>
-        </w:rPr>
-        <w:t>September 25, 1980</w:t>
-      </w:r>
-      <w:r>
-        <w:rPr>
-          <w:rFonts w:ascii="Times New Roman" w:hAnsi="Times New Roman" w:cs="Times New Roman"/>
-          <w:sz w:val="24"/>
-          <w:szCs w:val="24"/>
-          <w:highlight w:val="yellow"/>
-        </w:rPr>
-        <w:fldChar w:fldCharType="end"/>
-      </w:r>
-      <w:r>
-        <w:rPr>
-          <w:rFonts w:ascii="Times New Roman" w:hAnsi="Times New Roman" w:cs="Times New Roman"/>
-          <w:sz w:val="24"/>
-          <w:szCs w:val="24"/>
-        </w:rPr>
-        <w:t xml:space="preserve">. Life expectancy is </w:t>
-      </w:r>
-      <w:r>
-        <w:rPr>
-          <w:rFonts w:ascii="Times New Roman" w:hAnsi="Times New Roman" w:cs="Times New Roman"/>
-          <w:sz w:val="24"/>
-          <w:szCs w:val="24"/>
-          <w:highlight w:val="yellow"/>
-        </w:rPr>
-        <w:fldChar w:fldCharType="begin"/>
-      </w:r>
-      <w:r>
-        <w:rPr>
-          <w:rFonts w:ascii="Times New Roman" w:hAnsi="Times New Roman" w:cs="Times New Roman"/>
-          <w:sz w:val="24"/>
-          <w:szCs w:val="24"/>
-          <w:highlight w:val="yellow"/>
-        </w:rPr>
-        <w:instrText xml:space="preserve"> DOCVARIABLE "zapLink¦2!1!Life_Expectancy" </w:instrText>
-      </w:r>
-      <w:r>
-        <w:rPr>
-          <w:rFonts w:ascii="Times New Roman" w:hAnsi="Times New Roman" w:cs="Times New Roman"/>
-          <w:sz w:val="24"/>
-          <w:szCs w:val="24"/>
-          <w:highlight w:val="yellow"/>
-        </w:rPr>
-        <w:fldChar w:fldCharType="separate"/>
-      </w:r>
-      <w:r>
-        <w:rPr>
-          <w:rFonts w:ascii="Times New Roman" w:hAnsi="Times New Roman" w:cs="Times New Roman"/>
-          <w:sz w:val="24"/>
-          <w:szCs w:val="24"/>
-          <w:highlight w:val="yellow"/>
-        </w:rPr>
-        <w:t>34.30</w:t>
-      </w:r>
-      <w:r>
-        <w:rPr>
-          <w:rFonts w:ascii="Times New Roman" w:hAnsi="Times New Roman" w:cs="Times New Roman"/>
-          <w:sz w:val="24"/>
-          <w:szCs w:val="24"/>
-          <w:highlight w:val="yellow"/>
-        </w:rPr>
-        <w:fldChar w:fldCharType="end"/>
-      </w:r>
-      <w:r>
-        <w:rPr>
-          <w:rFonts w:ascii="Times New Roman" w:hAnsi="Times New Roman" w:cs="Times New Roman"/>
-          <w:sz w:val="24"/>
-          <w:szCs w:val="24"/>
-        </w:rPr>
-        <w:t xml:space="preserve"> prospective years according to the 202</w:t>
-      </w:r>
-      <w:r>
-        <w:rPr>
-          <w:rFonts w:ascii="Times New Roman" w:hAnsi="Times New Roman" w:cs="Times New Roman"/>
-          <w:sz w:val="24"/>
-          <w:szCs w:val="24"/>
-        </w:rPr>
-        <w:t>3</w:t>
-      </w:r>
-      <w:r>
-        <w:rPr>
-          <w:rFonts w:ascii="Times New Roman" w:hAnsi="Times New Roman" w:cs="Times New Roman"/>
-          <w:sz w:val="24"/>
-          <w:szCs w:val="24"/>
-        </w:rPr>
-        <w:t xml:space="preserve"> U.S. Life Tables published by the Centers for Disease Control and Prevention (Arias, Xu, &amp; Kochanek, 2025</w:t>
-      </w:r>
-      <w:r>
-        <w:rPr>
-          <w:rFonts w:ascii="Times New Roman" w:hAnsi="Times New Roman" w:cs="Times New Roman"/>
-          <w:sz w:val="24"/>
-          <w:szCs w:val="24"/>
-        </w:rPr>
-        <w:t>)</w:t>
-      </w:r>
-      <w:r>
-        <w:rPr>
-          <w:rFonts w:ascii="Times New Roman" w:hAnsi="Times New Roman" w:cs="Times New Roman"/>
-          <w:sz w:val="24"/>
-          <w:szCs w:val="24"/>
-        </w:rPr>
-        <w:t xml:space="preserve"> </w:t>
-      </w:r>
-      <w:r>
-        <w:rPr>
-          <w:rFonts w:ascii="Times New Roman" w:hAnsi="Times New Roman" w:cs="Times New Roman"/>
-          <w:sz w:val="24"/>
-          <w:szCs w:val="24"/>
-          <w:highlight w:val="yellow"/>
-        </w:rPr>
-        <w:t xml:space="preserve">and the </w:t>
-      </w:r>
-      <w:r>
-        <w:rPr>
-          <w:rFonts w:ascii="Times New Roman" w:hAnsi="Times New Roman" w:cs="Times New Roman"/>
-          <w:sz w:val="24"/>
-          <w:szCs w:val="24"/>
-          <w:highlight w:val="yellow"/>
-        </w:rPr>
-        <w:t>L</w:t>
-      </w:r>
-      <w:r>
-        <w:rPr>
-          <w:rFonts w:ascii="Times New Roman" w:hAnsi="Times New Roman" w:cs="Times New Roman"/>
-          <w:sz w:val="24"/>
-          <w:szCs w:val="24"/>
-          <w:highlight w:val="yellow"/>
-        </w:rPr>
-        <w:t xml:space="preserve">ife </w:t>
-      </w:r>
-      <w:r>
-        <w:rPr>
-          <w:rFonts w:ascii="Times New Roman" w:hAnsi="Times New Roman" w:cs="Times New Roman"/>
-          <w:sz w:val="24"/>
-          <w:szCs w:val="24"/>
-          <w:highlight w:val="yellow"/>
-        </w:rPr>
-        <w:t>C</w:t>
-      </w:r>
-      <w:r>
-        <w:rPr>
-          <w:rFonts w:ascii="Times New Roman" w:hAnsi="Times New Roman" w:cs="Times New Roman"/>
-          <w:sz w:val="24"/>
-          <w:szCs w:val="24"/>
-          <w:highlight w:val="yellow"/>
-        </w:rPr>
-        <w:t xml:space="preserve">are </w:t>
-      </w:r>
-      <w:r>
-        <w:rPr>
-          <w:rFonts w:ascii="Times New Roman" w:hAnsi="Times New Roman" w:cs="Times New Roman"/>
-          <w:sz w:val="24"/>
-          <w:szCs w:val="24"/>
-          <w:highlight w:val="yellow"/>
-        </w:rPr>
-        <w:t>P</w:t>
-      </w:r>
-      <w:r>
-        <w:rPr>
-          <w:rFonts w:ascii="Times New Roman" w:hAnsi="Times New Roman" w:cs="Times New Roman"/>
-          <w:sz w:val="24"/>
-          <w:szCs w:val="24"/>
-          <w:highlight w:val="yellow"/>
-        </w:rPr>
-        <w:t>lan</w:t>
-      </w:r>
-      <w:r>
-        <w:rPr>
-          <w:rFonts w:ascii="Times New Roman" w:hAnsi="Times New Roman" w:cs="Times New Roman"/>
-          <w:sz w:val="24"/>
-          <w:szCs w:val="24"/>
-        </w:rPr>
-        <w:t>.</w:t>
-      </w:r>
-      <w:r>
-        <w:rPr>
-          <w:rFonts w:ascii="Times New Roman" w:hAnsi="Times New Roman" w:cs="Times New Roman"/>
-          <w:sz w:val="24"/>
-          <w:szCs w:val="24"/>
-        </w:rPr>
-        <w:t xml:space="preserve"> </w:t>
-      </w:r>
-      <w:r>
-        <w:rPr>
-          <w:rFonts w:ascii="Times New Roman" w:hAnsi="Times New Roman" w:cs="Times New Roman"/>
-          <w:sz w:val="24"/>
-          <w:szCs w:val="24"/>
-          <w:highlight w:val="yellow"/>
-        </w:rPr>
-        <w:t>At this time, I have not been provided a trial date. I assume a reference date of March 30, 2026.</w:t>
-      </w:r>
-      <w:r>
-        <w:rPr>
-          <w:rFonts w:ascii="Times New Roman" w:hAnsi="Times New Roman" w:cs="Times New Roman"/>
-          <w:sz w:val="24"/>
-          <w:szCs w:val="24"/>
-        </w:rPr>
-        <w:t xml:space="preserve"> </w:t>
-      </w:r>
-      <w:r>
-        <w:rPr>
-          <w:rFonts w:ascii="Times New Roman" w:hAnsi="Times New Roman" w:cs="Times New Roman"/>
-          <w:sz w:val="24"/>
-          <w:szCs w:val="24"/>
-          <w:highlight w:val="yellow"/>
-        </w:rPr>
-        <w:t>The trial date is March 30, 2026.</w:t>
+        <w:jc w:val="center"/>
+        <w:rPr>
+          <w:rFonts w:ascii="Times New Roman" w:hAnsi="Times New Roman" w:cs="Times New Roman"/>
+          <w:sz w:val="24"/>
+          <w:szCs w:val="24"/>
+        </w:rPr>
+      </w:pPr>
+      <w:r>
+        <w:rPr>
+          <w:rFonts w:ascii="Times New Roman" w:hAnsi="Times New Roman" w:cs="Times New Roman"/>
+          <w:sz w:val="24"/>
+          <w:szCs w:val="24"/>
+        </w:rPr>
+        <w:t>DURATION</w:t>
       </w:r>
     </w:p>
     <w:p>
@@ -2020,356 +840,625 @@
           <w:szCs w:val="24"/>
         </w:rPr>
       </w:pPr>
+      <w:r>
+        <w:rPr>
+          <w:rFonts w:ascii="Times New Roman" w:hAnsi="Times New Roman" w:cs="Times New Roman"/>
+          <w:sz w:val="24"/>
+          <w:szCs w:val="24"/>
+          <w:highlight w:val="yellow"/>
+        </w:rPr>
+        <w:t>[[</w:t>
+      </w:r>
+      <w:r>
+        <w:rPr>
+          <w:rFonts w:ascii="Times New Roman" w:hAnsi="Times New Roman" w:cs="Times New Roman"/>
+          <w:sz w:val="24"/>
+          <w:szCs w:val="24"/>
+          <w:highlight w:val="yellow"/>
+        </w:rPr>
+        <w:t>claimant_salutation_with_name_last</w:t>
+      </w:r>
+      <w:r>
+        <w:rPr>
+          <w:rFonts w:ascii="Times New Roman" w:hAnsi="Times New Roman" w:cs="Times New Roman"/>
+          <w:sz w:val="24"/>
+          <w:szCs w:val="24"/>
+          <w:highlight w:val="yellow"/>
+        </w:rPr>
+        <w:t>]]</w:t>
+      </w:r>
+      <w:r>
+        <w:rPr>
+          <w:rFonts w:ascii="Times New Roman" w:hAnsi="Times New Roman" w:cs="Times New Roman"/>
+          <w:sz w:val="24"/>
+          <w:szCs w:val="24"/>
+        </w:rPr>
+        <w:t xml:space="preserve"> </w:t>
+      </w:r>
+      <w:r>
+        <w:rPr>
+          <w:rFonts w:ascii="Times New Roman" w:hAnsi="Times New Roman" w:cs="Times New Roman"/>
+          <w:sz w:val="24"/>
+          <w:szCs w:val="24"/>
+        </w:rPr>
+        <w:t>was born o</w:t>
+      </w:r>
+      <w:r>
+        <w:rPr>
+          <w:rFonts w:ascii="Times New Roman" w:hAnsi="Times New Roman" w:cs="Times New Roman"/>
+          <w:sz w:val="24"/>
+          <w:szCs w:val="24"/>
+        </w:rPr>
+        <w:t>n</w:t>
+      </w:r>
+      <w:r>
+        <w:rPr>
+          <w:rFonts w:ascii="Times New Roman" w:hAnsi="Times New Roman" w:cs="Times New Roman"/>
+          <w:sz w:val="24"/>
+          <w:szCs w:val="24"/>
+        </w:rPr>
+        <w:t xml:space="preserve"> </w:t>
+      </w:r>
+      <w:r>
+        <w:rPr>
+          <w:rFonts w:ascii="Times New Roman" w:hAnsi="Times New Roman" w:cs="Times New Roman"/>
+          <w:sz w:val="24"/>
+          <w:szCs w:val="24"/>
+          <w:highlight w:val="yellow"/>
+        </w:rPr>
+        <w:t>[[</w:t>
+      </w:r>
+      <w:r>
+        <w:rPr>
+          <w:rFonts w:ascii="Times New Roman" w:hAnsi="Times New Roman" w:cs="Times New Roman"/>
+          <w:sz w:val="24"/>
+          <w:szCs w:val="24"/>
+          <w:highlight w:val="yellow"/>
+        </w:rPr>
+        <w:t>claimant_long_DOB</w:t>
+      </w:r>
+      <w:r>
+        <w:rPr>
+          <w:rFonts w:ascii="Times New Roman" w:hAnsi="Times New Roman" w:cs="Times New Roman"/>
+          <w:sz w:val="24"/>
+          <w:szCs w:val="24"/>
+          <w:highlight w:val="yellow"/>
+        </w:rPr>
+        <w:t>]]</w:t>
+      </w:r>
+      <w:r>
+        <w:rPr>
+          <w:rFonts w:ascii="Times New Roman" w:hAnsi="Times New Roman" w:cs="Times New Roman"/>
+          <w:sz w:val="24"/>
+          <w:szCs w:val="24"/>
+        </w:rPr>
+        <w:t xml:space="preserve">. Life expectancy is </w:t>
+      </w:r>
+      <w:r>
+        <w:rPr>
+          <w:rFonts w:ascii="Times New Roman" w:hAnsi="Times New Roman" w:cs="Times New Roman"/>
+          <w:sz w:val="24"/>
+          <w:szCs w:val="24"/>
+        </w:rPr>
+        <w:t>[[</w:t>
+      </w:r>
+      <w:r>
+        <w:rPr>
+          <w:rFonts w:ascii="Times New Roman" w:hAnsi="Times New Roman" w:cs="Times New Roman"/>
+          <w:sz w:val="24"/>
+          <w:szCs w:val="24"/>
+        </w:rPr>
+        <w:t>life_expectancy</w:t>
+      </w:r>
+      <w:r>
+        <w:rPr>
+          <w:rFonts w:ascii="Times New Roman" w:hAnsi="Times New Roman" w:cs="Times New Roman"/>
+          <w:sz w:val="24"/>
+          <w:szCs w:val="24"/>
+        </w:rPr>
+        <w:t>]]</w:t>
+      </w:r>
+      <w:r>
+        <w:rPr>
+          <w:rFonts w:ascii="Times New Roman" w:hAnsi="Times New Roman" w:cs="Times New Roman"/>
+          <w:sz w:val="24"/>
+          <w:szCs w:val="24"/>
+        </w:rPr>
+        <w:t xml:space="preserve"> prospective years according to the 202</w:t>
+      </w:r>
+      <w:r>
+        <w:rPr>
+          <w:rFonts w:ascii="Times New Roman" w:hAnsi="Times New Roman" w:cs="Times New Roman"/>
+          <w:sz w:val="24"/>
+          <w:szCs w:val="24"/>
+        </w:rPr>
+        <w:t>3</w:t>
+      </w:r>
+      <w:r>
+        <w:rPr>
+          <w:rFonts w:ascii="Times New Roman" w:hAnsi="Times New Roman" w:cs="Times New Roman"/>
+          <w:sz w:val="24"/>
+          <w:szCs w:val="24"/>
+        </w:rPr>
+        <w:t xml:space="preserve"> U.S. Life Tables published by the Centers for Disease Control and Prevention (Arias, Xu, &amp; Kochanek, 2025</w:t>
+      </w:r>
+      <w:r>
+        <w:rPr>
+          <w:rFonts w:ascii="Times New Roman" w:hAnsi="Times New Roman" w:cs="Times New Roman"/>
+          <w:sz w:val="24"/>
+          <w:szCs w:val="24"/>
+        </w:rPr>
+        <w:t>)</w:t>
+      </w:r>
+      <w:r>
+        <w:rPr>
+          <w:rFonts w:ascii="Times New Roman" w:hAnsi="Times New Roman" w:cs="Times New Roman"/>
+          <w:sz w:val="24"/>
+          <w:szCs w:val="24"/>
+        </w:rPr>
+        <w:t xml:space="preserve"> </w:t>
+      </w:r>
+      <w:r>
+        <w:rPr>
+          <w:rFonts w:ascii="Times New Roman" w:hAnsi="Times New Roman" w:cs="Times New Roman"/>
+          <w:sz w:val="24"/>
+          <w:szCs w:val="24"/>
+          <w:highlight w:val="green"/>
+        </w:rPr>
+        <w:t xml:space="preserve">and the </w:t>
+      </w:r>
+      <w:r>
+        <w:rPr>
+          <w:rFonts w:ascii="Times New Roman" w:hAnsi="Times New Roman" w:cs="Times New Roman"/>
+          <w:sz w:val="24"/>
+          <w:szCs w:val="24"/>
+          <w:highlight w:val="green"/>
+        </w:rPr>
+        <w:t>L</w:t>
+      </w:r>
+      <w:r>
+        <w:rPr>
+          <w:rFonts w:ascii="Times New Roman" w:hAnsi="Times New Roman" w:cs="Times New Roman"/>
+          <w:sz w:val="24"/>
+          <w:szCs w:val="24"/>
+          <w:highlight w:val="green"/>
+        </w:rPr>
+        <w:t xml:space="preserve">ife </w:t>
+      </w:r>
+      <w:r>
+        <w:rPr>
+          <w:rFonts w:ascii="Times New Roman" w:hAnsi="Times New Roman" w:cs="Times New Roman"/>
+          <w:sz w:val="24"/>
+          <w:szCs w:val="24"/>
+          <w:highlight w:val="green"/>
+        </w:rPr>
+        <w:t>C</w:t>
+      </w:r>
+      <w:r>
+        <w:rPr>
+          <w:rFonts w:ascii="Times New Roman" w:hAnsi="Times New Roman" w:cs="Times New Roman"/>
+          <w:sz w:val="24"/>
+          <w:szCs w:val="24"/>
+          <w:highlight w:val="green"/>
+        </w:rPr>
+        <w:t xml:space="preserve">are </w:t>
+      </w:r>
+      <w:r>
+        <w:rPr>
+          <w:rFonts w:ascii="Times New Roman" w:hAnsi="Times New Roman" w:cs="Times New Roman"/>
+          <w:sz w:val="24"/>
+          <w:szCs w:val="24"/>
+          <w:highlight w:val="green"/>
+        </w:rPr>
+        <w:t>P</w:t>
+      </w:r>
+      <w:r>
+        <w:rPr>
+          <w:rFonts w:ascii="Times New Roman" w:hAnsi="Times New Roman" w:cs="Times New Roman"/>
+          <w:sz w:val="24"/>
+          <w:szCs w:val="24"/>
+          <w:highlight w:val="green"/>
+        </w:rPr>
+        <w:t>lan</w:t>
+      </w:r>
+      <w:r>
+        <w:rPr>
+          <w:rFonts w:ascii="Times New Roman" w:hAnsi="Times New Roman" w:cs="Times New Roman"/>
+          <w:sz w:val="24"/>
+          <w:szCs w:val="24"/>
+        </w:rPr>
+        <w:t>.</w:t>
+      </w:r>
+      <w:r>
+        <w:rPr>
+          <w:rFonts w:ascii="Times New Roman" w:hAnsi="Times New Roman" w:cs="Times New Roman"/>
+          <w:sz w:val="24"/>
+          <w:szCs w:val="24"/>
+        </w:rPr>
+        <w:t xml:space="preserve"> </w:t>
+      </w:r>
+      <w:r>
+        <w:rPr>
+          <w:rFonts w:ascii="Times New Roman" w:hAnsi="Times New Roman" w:cs="Times New Roman"/>
+          <w:sz w:val="24"/>
+          <w:szCs w:val="24"/>
+          <w:highlight w:val="green"/>
+        </w:rPr>
+        <w:t>At this time, I have not been provided a trial date. I assume a reference date of</w:t>
+      </w:r>
+      <w:r>
+        <w:rPr>
+          <w:rFonts w:ascii="Times New Roman" w:hAnsi="Times New Roman" w:cs="Times New Roman"/>
+          <w:sz w:val="24"/>
+          <w:szCs w:val="24"/>
+          <w:highlight w:val="yellow"/>
+        </w:rPr>
+        <w:t xml:space="preserve"> </w:t>
+      </w:r>
+      <w:r>
+        <w:rPr>
+          <w:rFonts w:ascii="Times New Roman" w:hAnsi="Times New Roman" w:cs="Times New Roman"/>
+          <w:sz w:val="24"/>
+          <w:szCs w:val="24"/>
+          <w:highlight w:val="yellow"/>
+        </w:rPr>
+        <w:t>[[</w:t>
+      </w:r>
+      <w:r>
+        <w:rPr>
+          <w:rFonts w:ascii="Times New Roman" w:hAnsi="Times New Roman" w:cs="Times New Roman"/>
+          <w:sz w:val="24"/>
+          <w:szCs w:val="24"/>
+          <w:highlight w:val="yellow"/>
+        </w:rPr>
+        <w:t>date_of_trial_long</w:t>
+      </w:r>
+      <w:r>
+        <w:rPr>
+          <w:rFonts w:ascii="Times New Roman" w:hAnsi="Times New Roman" w:cs="Times New Roman"/>
+          <w:sz w:val="24"/>
+          <w:szCs w:val="24"/>
+          <w:highlight w:val="yellow"/>
+        </w:rPr>
+        <w:t>]]</w:t>
+      </w:r>
+      <w:r>
+        <w:rPr>
+          <w:rFonts w:ascii="Times New Roman" w:hAnsi="Times New Roman" w:cs="Times New Roman"/>
+          <w:sz w:val="24"/>
+          <w:szCs w:val="24"/>
+          <w:highlight w:val="yellow"/>
+        </w:rPr>
+        <w:t>.</w:t>
+      </w:r>
+      <w:r>
+        <w:rPr>
+          <w:rFonts w:ascii="Times New Roman" w:hAnsi="Times New Roman" w:cs="Times New Roman"/>
+          <w:sz w:val="24"/>
+          <w:szCs w:val="24"/>
+        </w:rPr>
+        <w:t xml:space="preserve"> </w:t>
+      </w:r>
+      <w:r>
+        <w:rPr>
+          <w:rFonts w:ascii="Times New Roman" w:hAnsi="Times New Roman" w:cs="Times New Roman"/>
+          <w:sz w:val="24"/>
+          <w:szCs w:val="24"/>
+          <w:highlight w:val="green"/>
+        </w:rPr>
+        <w:t xml:space="preserve">The trial date is </w:t>
+      </w:r>
+      <w:r>
+        <w:rPr>
+          <w:rFonts w:ascii="Times New Roman" w:hAnsi="Times New Roman" w:cs="Times New Roman"/>
+          <w:sz w:val="24"/>
+          <w:szCs w:val="24"/>
+          <w:highlight w:val="yellow"/>
+        </w:rPr>
+        <w:t>[[</w:t>
+      </w:r>
+      <w:r>
+        <w:rPr>
+          <w:rFonts w:ascii="Times New Roman" w:hAnsi="Times New Roman" w:cs="Times New Roman"/>
+          <w:sz w:val="24"/>
+          <w:szCs w:val="24"/>
+          <w:highlight w:val="yellow"/>
+        </w:rPr>
+        <w:t>date_of_trial_long</w:t>
+      </w:r>
+      <w:r>
+        <w:rPr>
+          <w:rFonts w:ascii="Times New Roman" w:hAnsi="Times New Roman" w:cs="Times New Roman"/>
+          <w:sz w:val="24"/>
+          <w:szCs w:val="24"/>
+          <w:highlight w:val="yellow"/>
+        </w:rPr>
+        <w:t>]]</w:t>
+      </w:r>
+      <w:r>
+        <w:rPr>
+          <w:rFonts w:ascii="Times New Roman" w:hAnsi="Times New Roman" w:cs="Times New Roman"/>
+          <w:sz w:val="24"/>
+          <w:szCs w:val="24"/>
+          <w:highlight w:val="yellow"/>
+        </w:rPr>
+        <w:t>.</w:t>
+      </w:r>
     </w:p>
     <w:p>
       <w:pPr>
-        <w:jc w:val="center"/>
-        <w:rPr>
-          <w:rFonts w:ascii="Times New Roman" w:hAnsi="Times New Roman" w:cs="Times New Roman"/>
-          <w:sz w:val="24"/>
-          <w:szCs w:val="24"/>
-        </w:rPr>
-      </w:pPr>
-      <w:r>
-        <w:rPr>
-          <w:rFonts w:ascii="Times New Roman" w:hAnsi="Times New Roman" w:cs="Times New Roman"/>
-          <w:sz w:val="24"/>
-          <w:szCs w:val="24"/>
-        </w:rPr>
-        <w:t>DISCOUNT RATES</w:t>
-      </w:r>
+        <w:jc w:val="both"/>
+        <w:rPr>
+          <w:rFonts w:ascii="Times New Roman" w:hAnsi="Times New Roman" w:cs="Times New Roman"/>
+          <w:sz w:val="24"/>
+          <w:szCs w:val="24"/>
+        </w:rPr>
+      </w:pPr>
     </w:p>
     <w:p>
       <w:pPr>
-        <w:jc w:val="both"/>
-        <w:rPr>
-          <w:rFonts w:ascii="Times New Roman" w:hAnsi="Times New Roman" w:cs="Times New Roman"/>
-          <w:sz w:val="24"/>
-          <w:szCs w:val="24"/>
-          <w:highlight w:val="yellow"/>
-        </w:rPr>
-      </w:pPr>
-      <w:r>
-        <w:rPr>
-          <w:rFonts w:ascii="Times New Roman" w:hAnsi="Times New Roman" w:cs="Times New Roman"/>
-          <w:sz w:val="24"/>
-          <w:szCs w:val="24"/>
-        </w:rPr>
-        <w:t>Discount rates ensure that any pecuniary award for future medical care accounts for the potential investment return </w:t>
-      </w:r>
-      <w:r>
-        <w:rPr>
-          <w:rFonts w:ascii="Times New Roman" w:hAnsi="Times New Roman" w:cs="Times New Roman"/>
-          <w:sz w:val="24"/>
-          <w:szCs w:val="24"/>
-          <w:highlight w:val="yellow"/>
-        </w:rPr>
-        <w:fldChar w:fldCharType="begin"/>
-      </w:r>
-      <w:r>
-        <w:rPr>
-          <w:rFonts w:ascii="Times New Roman" w:hAnsi="Times New Roman" w:cs="Times New Roman"/>
-          <w:sz w:val="24"/>
-          <w:szCs w:val="24"/>
-          <w:highlight w:val="yellow"/>
-        </w:rPr>
-        <w:instrText xml:space="preserve"> DOCVARIABLE "zapLink¦2!1!ClaimantSalutation" </w:instrText>
-      </w:r>
-      <w:r>
-        <w:rPr>
-          <w:rFonts w:ascii="Times New Roman" w:hAnsi="Times New Roman" w:cs="Times New Roman"/>
-          <w:sz w:val="24"/>
-          <w:szCs w:val="24"/>
-          <w:highlight w:val="yellow"/>
-        </w:rPr>
-        <w:fldChar w:fldCharType="separate"/>
-      </w:r>
-      <w:r>
-        <w:rPr>
-          <w:rFonts w:ascii="Times New Roman" w:hAnsi="Times New Roman" w:cs="Times New Roman"/>
-          <w:sz w:val="24"/>
-          <w:szCs w:val="24"/>
-          <w:highlight w:val="yellow"/>
-        </w:rPr>
-        <w:t>Mr.</w:t>
-      </w:r>
-      <w:r>
-        <w:rPr>
-          <w:rFonts w:ascii="Times New Roman" w:hAnsi="Times New Roman" w:cs="Times New Roman"/>
-          <w:sz w:val="24"/>
-          <w:szCs w:val="24"/>
-          <w:highlight w:val="yellow"/>
-        </w:rPr>
-        <w:fldChar w:fldCharType="end"/>
-      </w:r>
-      <w:r>
-        <w:rPr>
-          <w:rFonts w:ascii="Times New Roman" w:hAnsi="Times New Roman" w:cs="Times New Roman"/>
-          <w:sz w:val="24"/>
-          <w:szCs w:val="24"/>
-        </w:rPr>
-        <w:t xml:space="preserve"> </w:t>
-      </w:r>
-      <w:r>
-        <w:rPr>
-          <w:rFonts w:ascii="Times New Roman" w:hAnsi="Times New Roman" w:cs="Times New Roman"/>
-          <w:sz w:val="24"/>
-          <w:szCs w:val="24"/>
-          <w:highlight w:val="yellow"/>
-        </w:rPr>
-        <w:fldChar w:fldCharType="begin"/>
-      </w:r>
-      <w:r>
-        <w:rPr>
-          <w:rFonts w:ascii="Times New Roman" w:hAnsi="Times New Roman" w:cs="Times New Roman"/>
-          <w:sz w:val="24"/>
-          <w:szCs w:val="24"/>
-          <w:highlight w:val="yellow"/>
-        </w:rPr>
-        <w:instrText xml:space="preserve"> DOCVARIABLE "zapLink¦2!1!Client_Name_Last" </w:instrText>
-      </w:r>
-      <w:r>
-        <w:rPr>
-          <w:rFonts w:ascii="Times New Roman" w:hAnsi="Times New Roman" w:cs="Times New Roman"/>
-          <w:sz w:val="24"/>
-          <w:szCs w:val="24"/>
-          <w:highlight w:val="yellow"/>
-        </w:rPr>
-        <w:fldChar w:fldCharType="separate"/>
-      </w:r>
-      <w:r>
-        <w:rPr>
-          <w:rFonts w:ascii="Times New Roman" w:hAnsi="Times New Roman" w:cs="Times New Roman"/>
-          <w:sz w:val="24"/>
-          <w:szCs w:val="24"/>
-          <w:highlight w:val="yellow"/>
-        </w:rPr>
-        <w:t>Dunkley</w:t>
-      </w:r>
-      <w:r>
-        <w:rPr>
-          <w:rFonts w:ascii="Times New Roman" w:hAnsi="Times New Roman" w:cs="Times New Roman"/>
-          <w:sz w:val="24"/>
-          <w:szCs w:val="24"/>
-          <w:highlight w:val="yellow"/>
-        </w:rPr>
-        <w:fldChar w:fldCharType="end"/>
-      </w:r>
-      <w:r>
-        <w:rPr>
-          <w:rFonts w:ascii="Times New Roman" w:hAnsi="Times New Roman" w:cs="Times New Roman"/>
-          <w:sz w:val="24"/>
-          <w:szCs w:val="24"/>
-        </w:rPr>
-        <w:t xml:space="preserve"> may earn to fund future medical care. The discount rate is </w:t>
-      </w:r>
-      <w:r>
-        <w:rPr>
-          <w:rFonts w:ascii="Times New Roman" w:hAnsi="Times New Roman" w:cs="Times New Roman"/>
-          <w:sz w:val="24"/>
-          <w:szCs w:val="24"/>
-        </w:rPr>
-        <w:t>laddered,</w:t>
-      </w:r>
-      <w:r>
-        <w:rPr>
-          <w:rFonts w:ascii="Times New Roman" w:hAnsi="Times New Roman" w:cs="Times New Roman"/>
-          <w:sz w:val="24"/>
-          <w:szCs w:val="24"/>
-        </w:rPr>
-        <w:t xml:space="preserve"> allowing investment yields to match the future duration of </w:t>
-      </w:r>
-      <w:r>
-        <w:rPr>
-          <w:rFonts w:ascii="Times New Roman" w:hAnsi="Times New Roman" w:cs="Times New Roman"/>
-          <w:sz w:val="24"/>
-          <w:szCs w:val="24"/>
-        </w:rPr>
-        <w:t>costs,</w:t>
-      </w:r>
-      <w:r>
-        <w:rPr>
-          <w:rFonts w:ascii="Times New Roman" w:hAnsi="Times New Roman" w:cs="Times New Roman"/>
-          <w:sz w:val="24"/>
-          <w:szCs w:val="24"/>
-        </w:rPr>
-        <w:t xml:space="preserve"> which will ensure that any present value award is exhausted at the end of the duration. Discount rates are derived from current benchmark yields on AAA</w:t>
-      </w:r>
-      <w:r>
-        <w:rPr>
-          <w:rFonts w:ascii="Times New Roman" w:hAnsi="Times New Roman" w:cs="Times New Roman"/>
-          <w:sz w:val="24"/>
-          <w:szCs w:val="24"/>
-        </w:rPr>
-        <w:t>-</w:t>
-      </w:r>
-      <w:r>
-        <w:rPr>
-          <w:rFonts w:ascii="Times New Roman" w:hAnsi="Times New Roman" w:cs="Times New Roman"/>
-          <w:sz w:val="24"/>
-          <w:szCs w:val="24"/>
-        </w:rPr>
-        <w:t xml:space="preserve">rated municipal bonds </w:t>
-      </w:r>
-      <w:r>
-        <w:rPr>
-          <w:rFonts w:ascii="Times New Roman" w:hAnsi="Times New Roman" w:cs="Times New Roman"/>
-          <w:sz w:val="24"/>
-          <w:szCs w:val="24"/>
-        </w:rPr>
-        <w:t xml:space="preserve">and </w:t>
-      </w:r>
-      <w:r>
-        <w:rPr>
-          <w:rFonts w:ascii="Times New Roman" w:hAnsi="Times New Roman" w:cs="Times New Roman"/>
-          <w:sz w:val="24"/>
-          <w:szCs w:val="24"/>
-        </w:rPr>
-        <w:t>are enumerated in the figures at the end of this narrative</w:t>
-      </w:r>
-      <w:r>
-        <w:rPr>
-          <w:rFonts w:ascii="Times New Roman" w:hAnsi="Times New Roman" w:cs="Times New Roman"/>
-          <w:sz w:val="24"/>
-          <w:szCs w:val="24"/>
-          <w:highlight w:val="yellow"/>
-        </w:rPr>
-        <w:t>.</w:t>
-      </w:r>
-      <w:r>
-        <w:rPr>
-          <w:rFonts w:ascii="Times New Roman" w:hAnsi="Times New Roman" w:cs="Times New Roman"/>
-          <w:sz w:val="24"/>
-          <w:szCs w:val="24"/>
-          <w:highlight w:val="yellow"/>
-        </w:rPr>
-        <w:t xml:space="preserve"> </w:t>
-      </w:r>
-      <w:r>
-        <w:rPr>
-          <w:rFonts w:ascii="Times New Roman" w:hAnsi="Times New Roman" w:cs="Times New Roman"/>
-          <w:sz w:val="24"/>
-          <w:szCs w:val="24"/>
-          <w:highlight w:val="yellow"/>
-        </w:rPr>
-        <w:t xml:space="preserve">For maturities greater than 30 </w:t>
-      </w:r>
-      <w:r>
-        <w:rPr>
-          <w:rFonts w:ascii="Times New Roman" w:hAnsi="Times New Roman" w:cs="Times New Roman"/>
-          <w:sz w:val="24"/>
-          <w:szCs w:val="24"/>
-          <w:highlight w:val="yellow"/>
-        </w:rPr>
-        <w:t>years</w:t>
-      </w:r>
-      <w:r>
-        <w:rPr>
-          <w:rFonts w:ascii="Times New Roman" w:hAnsi="Times New Roman" w:cs="Times New Roman"/>
-          <w:sz w:val="24"/>
-          <w:szCs w:val="24"/>
-          <w:highlight w:val="yellow"/>
-        </w:rPr>
-        <w:t>, I use the longest available maturity of</w:t>
-      </w:r>
-      <w:r>
-        <w:rPr>
-          <w:rFonts w:ascii="Times New Roman" w:hAnsi="Times New Roman" w:cs="Times New Roman"/>
-          <w:sz w:val="24"/>
-          <w:szCs w:val="24"/>
-        </w:rPr>
-        <w:t xml:space="preserve"> </w:t>
-      </w:r>
-      <w:r>
-        <w:rPr>
-          <w:rFonts w:ascii="Times New Roman" w:hAnsi="Times New Roman" w:cs="Times New Roman"/>
-          <w:sz w:val="24"/>
-          <w:szCs w:val="24"/>
-          <w:highlight w:val="red"/>
-        </w:rPr>
-        <w:t>4.</w:t>
-      </w:r>
-      <w:r>
-        <w:rPr>
-          <w:rFonts w:ascii="Times New Roman" w:hAnsi="Times New Roman" w:cs="Times New Roman"/>
-          <w:sz w:val="24"/>
-          <w:szCs w:val="24"/>
-          <w:highlight w:val="red"/>
-        </w:rPr>
-        <w:t>3</w:t>
-      </w:r>
-      <w:r>
-        <w:rPr>
-          <w:rFonts w:ascii="Times New Roman" w:hAnsi="Times New Roman" w:cs="Times New Roman"/>
-          <w:sz w:val="24"/>
-          <w:szCs w:val="24"/>
-          <w:highlight w:val="red"/>
-        </w:rPr>
-        <w:t>%.</w:t>
-      </w:r>
-      <w:r>
-        <w:rPr>
-          <w:rFonts w:ascii="Times New Roman" w:hAnsi="Times New Roman" w:cs="Times New Roman"/>
-          <w:sz w:val="24"/>
-          <w:szCs w:val="24"/>
-        </w:rPr>
-        <w:t xml:space="preserve"> </w:t>
-      </w:r>
-      <w:r>
-        <w:rPr>
-          <w:rFonts w:ascii="Times New Roman" w:hAnsi="Times New Roman" w:cs="Times New Roman"/>
-          <w:sz w:val="24"/>
-          <w:szCs w:val="24"/>
-        </w:rPr>
-        <w:t xml:space="preserve">Discount rates range from </w:t>
-      </w:r>
-      <w:r>
-        <w:rPr>
-          <w:rFonts w:ascii="Times New Roman" w:hAnsi="Times New Roman" w:cs="Times New Roman"/>
-          <w:sz w:val="24"/>
-          <w:szCs w:val="24"/>
-          <w:highlight w:val="yellow"/>
-        </w:rPr>
-        <w:t>2.0% to 4.</w:t>
-      </w:r>
-      <w:r>
-        <w:rPr>
-          <w:rFonts w:ascii="Times New Roman" w:hAnsi="Times New Roman" w:cs="Times New Roman"/>
-          <w:sz w:val="24"/>
-          <w:szCs w:val="24"/>
-          <w:highlight w:val="yellow"/>
-        </w:rPr>
-        <w:t>3</w:t>
-      </w:r>
-      <w:r>
-        <w:rPr>
-          <w:rFonts w:ascii="Times New Roman" w:hAnsi="Times New Roman" w:cs="Times New Roman"/>
-          <w:sz w:val="24"/>
-          <w:szCs w:val="24"/>
-          <w:highlight w:val="yellow"/>
-        </w:rPr>
-        <w:t>%.</w:t>
+        <w:jc w:val="center"/>
+        <w:rPr>
+          <w:rFonts w:ascii="Times New Roman" w:hAnsi="Times New Roman" w:cs="Times New Roman"/>
+          <w:sz w:val="24"/>
+          <w:szCs w:val="24"/>
+        </w:rPr>
+      </w:pPr>
+      <w:r>
+        <w:rPr>
+          <w:rFonts w:ascii="Times New Roman" w:hAnsi="Times New Roman" w:cs="Times New Roman"/>
+          <w:sz w:val="24"/>
+          <w:szCs w:val="24"/>
+        </w:rPr>
+        <w:t>DISCOUNT RATES</w:t>
       </w:r>
     </w:p>
     <w:p>
       <w:pPr>
-        <w:rPr>
-          <w:rFonts w:ascii="Times New Roman" w:hAnsi="Times New Roman" w:cs="Times New Roman"/>
-          <w:sz w:val="24"/>
-          <w:szCs w:val="24"/>
-        </w:rPr>
-      </w:pPr>
-      <w:r>
-        <w:rPr>
-          <w:rFonts w:ascii="Times New Roman" w:hAnsi="Times New Roman" w:cs="Times New Roman"/>
-          <w:sz w:val="24"/>
-          <w:szCs w:val="24"/>
-        </w:rPr>
-        <w:br w:type="page"/>
+        <w:jc w:val="both"/>
+        <w:rPr>
+          <w:rFonts w:ascii="Times New Roman" w:hAnsi="Times New Roman" w:cs="Times New Roman"/>
+          <w:sz w:val="24"/>
+          <w:szCs w:val="24"/>
+          <w:highlight w:val="yellow"/>
+        </w:rPr>
+      </w:pPr>
+      <w:r>
+        <w:rPr>
+          <w:rFonts w:ascii="Times New Roman" w:hAnsi="Times New Roman" w:cs="Times New Roman"/>
+          <w:sz w:val="24"/>
+          <w:szCs w:val="24"/>
+        </w:rPr>
+        <w:t>Discount rates ensure that any pecuniary award for future medical care accounts for the potential investment return </w:t>
+      </w:r>
+      <w:r>
+        <w:rPr>
+          <w:rFonts w:ascii="Times New Roman" w:hAnsi="Times New Roman" w:cs="Times New Roman"/>
+          <w:sz w:val="24"/>
+          <w:szCs w:val="24"/>
+          <w:highlight w:val="yellow"/>
+        </w:rPr>
+        <w:t>[[</w:t>
+      </w:r>
+      <w:r>
+        <w:rPr>
+          <w:rFonts w:ascii="Times New Roman" w:hAnsi="Times New Roman" w:cs="Times New Roman"/>
+          <w:sz w:val="24"/>
+          <w:szCs w:val="24"/>
+          <w:highlight w:val="yellow"/>
+        </w:rPr>
+        <w:t>claimant_salutation_with_name_last</w:t>
+      </w:r>
+      <w:r>
+        <w:rPr>
+          <w:rFonts w:ascii="Times New Roman" w:hAnsi="Times New Roman" w:cs="Times New Roman"/>
+          <w:sz w:val="24"/>
+          <w:szCs w:val="24"/>
+          <w:highlight w:val="yellow"/>
+        </w:rPr>
+        <w:t>]]</w:t>
+      </w:r>
+      <w:r>
+        <w:rPr>
+          <w:rFonts w:ascii="Times New Roman" w:hAnsi="Times New Roman" w:cs="Times New Roman"/>
+          <w:sz w:val="24"/>
+          <w:szCs w:val="24"/>
+        </w:rPr>
+        <w:t xml:space="preserve"> may earn to fund future medical care. The discount rate is </w:t>
+      </w:r>
+      <w:r>
+        <w:rPr>
+          <w:rFonts w:ascii="Times New Roman" w:hAnsi="Times New Roman" w:cs="Times New Roman"/>
+          <w:sz w:val="24"/>
+          <w:szCs w:val="24"/>
+        </w:rPr>
+        <w:t>laddered,</w:t>
+      </w:r>
+      <w:r>
+        <w:rPr>
+          <w:rFonts w:ascii="Times New Roman" w:hAnsi="Times New Roman" w:cs="Times New Roman"/>
+          <w:sz w:val="24"/>
+          <w:szCs w:val="24"/>
+        </w:rPr>
+        <w:t xml:space="preserve"> allowing investment yields to match the future duration of </w:t>
+      </w:r>
+      <w:r>
+        <w:rPr>
+          <w:rFonts w:ascii="Times New Roman" w:hAnsi="Times New Roman" w:cs="Times New Roman"/>
+          <w:sz w:val="24"/>
+          <w:szCs w:val="24"/>
+        </w:rPr>
+        <w:t>costs,</w:t>
+      </w:r>
+      <w:r>
+        <w:rPr>
+          <w:rFonts w:ascii="Times New Roman" w:hAnsi="Times New Roman" w:cs="Times New Roman"/>
+          <w:sz w:val="24"/>
+          <w:szCs w:val="24"/>
+        </w:rPr>
+        <w:t xml:space="preserve"> which will ensure that any present value award is exhausted at the end of the duration. Discount rates are derived from current benchmark yields on AAA</w:t>
+      </w:r>
+      <w:r>
+        <w:rPr>
+          <w:rFonts w:ascii="Times New Roman" w:hAnsi="Times New Roman" w:cs="Times New Roman"/>
+          <w:sz w:val="24"/>
+          <w:szCs w:val="24"/>
+        </w:rPr>
+        <w:t>-</w:t>
+      </w:r>
+      <w:r>
+        <w:rPr>
+          <w:rFonts w:ascii="Times New Roman" w:hAnsi="Times New Roman" w:cs="Times New Roman"/>
+          <w:sz w:val="24"/>
+          <w:szCs w:val="24"/>
+        </w:rPr>
+        <w:t xml:space="preserve">rated municipal bonds </w:t>
+      </w:r>
+      <w:r>
+        <w:rPr>
+          <w:rFonts w:ascii="Times New Roman" w:hAnsi="Times New Roman" w:cs="Times New Roman"/>
+          <w:sz w:val="24"/>
+          <w:szCs w:val="24"/>
+        </w:rPr>
+        <w:t xml:space="preserve">and </w:t>
+      </w:r>
+      <w:r>
+        <w:rPr>
+          <w:rFonts w:ascii="Times New Roman" w:hAnsi="Times New Roman" w:cs="Times New Roman"/>
+          <w:sz w:val="24"/>
+          <w:szCs w:val="24"/>
+        </w:rPr>
+        <w:t>are enumerated in the figures at the end of this narrative</w:t>
+      </w:r>
+      <w:r>
+        <w:rPr>
+          <w:rFonts w:ascii="Times New Roman" w:hAnsi="Times New Roman" w:cs="Times New Roman"/>
+          <w:sz w:val="24"/>
+          <w:szCs w:val="24"/>
+        </w:rPr>
+        <w:t>.</w:t>
+      </w:r>
+      <w:r>
+        <w:rPr>
+          <w:rFonts w:ascii="Times New Roman" w:hAnsi="Times New Roman" w:cs="Times New Roman"/>
+          <w:sz w:val="24"/>
+          <w:szCs w:val="24"/>
+        </w:rPr>
+        <w:t xml:space="preserve"> </w:t>
+      </w:r>
+      <w:r>
+        <w:rPr>
+          <w:rFonts w:ascii="Times New Roman" w:hAnsi="Times New Roman" w:cs="Times New Roman"/>
+          <w:sz w:val="24"/>
+          <w:szCs w:val="24"/>
+          <w:highlight w:val="green"/>
+        </w:rPr>
+        <w:t>For maturities greater than 30 years</w:t>
+      </w:r>
+      <w:r>
+        <w:rPr>
+          <w:rFonts w:ascii="Times New Roman" w:hAnsi="Times New Roman" w:cs="Times New Roman"/>
+          <w:sz w:val="24"/>
+          <w:szCs w:val="24"/>
+          <w:highlight w:val="green"/>
+        </w:rPr>
+        <w:t>, I use the longest available maturity of</w:t>
+      </w:r>
+      <w:r>
+        <w:rPr>
+          <w:rFonts w:ascii="Times New Roman" w:hAnsi="Times New Roman" w:cs="Times New Roman"/>
+          <w:sz w:val="24"/>
+          <w:szCs w:val="24"/>
+        </w:rPr>
+        <w:t xml:space="preserve"> </w:t>
+      </w:r>
+      <w:r>
+        <w:rPr>
+          <w:rFonts w:ascii="Times New Roman" w:hAnsi="Times New Roman" w:cs="Times New Roman"/>
+          <w:sz w:val="24"/>
+          <w:szCs w:val="24"/>
+          <w:highlight w:val="red"/>
+        </w:rPr>
+        <w:t>[[discount_rate_higher_bound]]</w:t>
+      </w:r>
+      <w:r>
+        <w:rPr>
+          <w:rFonts w:ascii="Times New Roman" w:hAnsi="Times New Roman" w:cs="Times New Roman"/>
+          <w:sz w:val="24"/>
+          <w:szCs w:val="24"/>
+        </w:rPr>
+        <w:t>.</w:t>
+      </w:r>
+      <w:r>
+        <w:rPr>
+          <w:rFonts w:ascii="Times New Roman" w:hAnsi="Times New Roman" w:cs="Times New Roman"/>
+          <w:sz w:val="24"/>
+          <w:szCs w:val="24"/>
+        </w:rPr>
+        <w:t xml:space="preserve"> </w:t>
+      </w:r>
+      <w:r>
+        <w:rPr>
+          <w:rFonts w:ascii="Times New Roman" w:hAnsi="Times New Roman" w:cs="Times New Roman"/>
+          <w:sz w:val="24"/>
+          <w:szCs w:val="24"/>
+        </w:rPr>
+        <w:t xml:space="preserve">Discount rates range from </w:t>
+      </w:r>
+      <w:r>
+        <w:rPr>
+          <w:rFonts w:ascii="Times New Roman" w:hAnsi="Times New Roman" w:cs="Times New Roman"/>
+          <w:sz w:val="24"/>
+          <w:szCs w:val="24"/>
+          <w:highlight w:val="red"/>
+        </w:rPr>
+        <w:t>[[discount_rate_lower_bound]]</w:t>
+      </w:r>
+      <w:r>
+        <w:rPr>
+          <w:rFonts w:ascii="Times New Roman" w:hAnsi="Times New Roman" w:cs="Times New Roman"/>
+          <w:sz w:val="24"/>
+          <w:szCs w:val="24"/>
+        </w:rPr>
+        <w:t xml:space="preserve"> to </w:t>
+      </w:r>
+      <w:r>
+        <w:rPr>
+          <w:rFonts w:ascii="Times New Roman" w:hAnsi="Times New Roman" w:cs="Times New Roman"/>
+          <w:sz w:val="24"/>
+          <w:szCs w:val="24"/>
+          <w:highlight w:val="red"/>
+        </w:rPr>
+        <w:t>[[discount_rate_higher_bound]]</w:t>
+      </w:r>
+      <w:r>
+        <w:rPr>
+          <w:rFonts w:ascii="Times New Roman" w:hAnsi="Times New Roman" w:cs="Times New Roman"/>
+          <w:sz w:val="24"/>
+          <w:szCs w:val="24"/>
+        </w:rPr>
+        <w:t>.</w:t>
       </w:r>
     </w:p>
     <w:p>
       <w:pPr>
+        <w:rPr>
+          <w:rFonts w:ascii="Times New Roman" w:hAnsi="Times New Roman" w:cs="Times New Roman"/>
+          <w:sz w:val="24"/>
+          <w:szCs w:val="24"/>
+        </w:rPr>
+      </w:pPr>
+      <w:r>
+        <w:rPr>
+          <w:rFonts w:ascii="Times New Roman" w:hAnsi="Times New Roman" w:cs="Times New Roman"/>
+          <w:sz w:val="24"/>
+          <w:szCs w:val="24"/>
+        </w:rPr>
+        <w:br w:type="page"/>
+      </w:r>
+    </w:p>
+    <w:p>
+      <w:pPr>
         <w:jc w:val="center"/>
         <w:rPr>
           <w:rFonts w:ascii="Times New Roman" w:hAnsi="Times New Roman" w:cs="Times New Roman"/>
@@ -2511,30 +1600,21 @@
         </w:rPr>
         <w:t xml:space="preserve"> growth rates are estimated for </w:t>
       </w:r>
-      <w:proofErr w:type="gramStart"/>
-      <w:r>
-        <w:rPr>
-          <w:rFonts w:ascii="Times New Roman" w:hAnsi="Times New Roman" w:cs="Times New Roman"/>
-          <w:sz w:val="24"/>
-          <w:szCs w:val="24"/>
-        </w:rPr>
-        <w:t>a time period</w:t>
-      </w:r>
-      <w:proofErr w:type="gramEnd"/>
-      <w:r>
-        <w:rPr>
-          <w:rFonts w:ascii="Times New Roman" w:hAnsi="Times New Roman" w:cs="Times New Roman"/>
-          <w:sz w:val="24"/>
-          <w:szCs w:val="24"/>
-        </w:rPr>
-        <w:t xml:space="preserve"> from </w:t>
-      </w:r>
-      <w:r>
-        <w:rPr>
-          <w:rFonts w:ascii="Times New Roman" w:hAnsi="Times New Roman" w:cs="Times New Roman"/>
-          <w:sz w:val="24"/>
-          <w:szCs w:val="24"/>
-          <w:highlight w:val="yellow"/>
+      <w:r>
+        <w:rPr>
+          <w:rFonts w:ascii="Times New Roman" w:hAnsi="Times New Roman" w:cs="Times New Roman"/>
+          <w:sz w:val="24"/>
+          <w:szCs w:val="24"/>
+        </w:rPr>
+        <w:t xml:space="preserve">a time period from </w:t>
+      </w:r>
+      <w:commentRangeStart w:id="1"/>
+      <w:r>
+        <w:rPr>
+          <w:rFonts w:ascii="Times New Roman" w:hAnsi="Times New Roman" w:cs="Times New Roman"/>
+          <w:sz w:val="24"/>
+          <w:szCs w:val="24"/>
+          <w:highlight w:val="red"/>
         </w:rPr>
         <w:t>1995</w:t>
       </w:r>
@@ -2543,17 +1623,26 @@
           <w:rFonts w:ascii="Times New Roman" w:hAnsi="Times New Roman" w:cs="Times New Roman"/>
           <w:sz w:val="24"/>
           <w:szCs w:val="24"/>
-          <w:highlight w:val="yellow"/>
+          <w:highlight w:val="red"/>
         </w:rPr>
         <w:t xml:space="preserve"> to 2025</w:t>
       </w:r>
       <w:bookmarkEnd w:id="0"/>
-      <w:r>
-        <w:rPr>
-          <w:rFonts w:ascii="Times New Roman" w:hAnsi="Times New Roman" w:cs="Times New Roman"/>
-          <w:sz w:val="24"/>
-          <w:szCs w:val="24"/>
-          <w:highlight w:val="yellow"/>
+      <w:commentRangeEnd w:id="1"/>
+      <w:r>
+        <w:rPr>
+          <w:rStyle w:val="CommentReference"/>
+          <w:rFonts w:ascii="Times New Roman" w:hAnsi="Times New Roman" w:cs="Times New Roman"/>
+          <w:sz w:val="24"/>
+          <w:szCs w:val="24"/>
+        </w:rPr>
+        <w:commentReference w:id="1"/>
+      </w:r>
+      <w:r>
+        <w:rPr>
+          <w:rFonts w:ascii="Times New Roman" w:hAnsi="Times New Roman" w:cs="Times New Roman"/>
+          <w:sz w:val="24"/>
+          <w:szCs w:val="24"/>
         </w:rPr>
         <w:t>,</w:t>
       </w:r>
@@ -2562,7 +1651,6 @@
           <w:rFonts w:ascii="Times New Roman" w:hAnsi="Times New Roman" w:cs="Times New Roman"/>
           <w:sz w:val="24"/>
           <w:szCs w:val="24"/>
-          <w:highlight w:val="yellow"/>
         </w:rPr>
         <w:t xml:space="preserve"> </w:t>
       </w:r>
@@ -2571,7 +1659,7 @@
           <w:rFonts w:ascii="Times New Roman" w:hAnsi="Times New Roman" w:cs="Times New Roman"/>
           <w:sz w:val="24"/>
           <w:szCs w:val="24"/>
-          <w:highlight w:val="yellow"/>
+          <w:highlight w:val="red"/>
         </w:rPr>
         <w:t xml:space="preserve">equivalent to the duration of </w:t>
       </w:r>
@@ -2580,7 +1668,7 @@
           <w:rFonts w:ascii="Times New Roman" w:hAnsi="Times New Roman" w:cs="Times New Roman"/>
           <w:sz w:val="24"/>
           <w:szCs w:val="24"/>
-          <w:highlight w:val="yellow"/>
+          <w:highlight w:val="red"/>
         </w:rPr>
         <w:t>future medical care</w:t>
       </w:r>
@@ -2702,7 +1790,7 @@
                 <w:color w:val="000000"/>
                 <w:sz w:val="24"/>
                 <w:szCs w:val="24"/>
-                <w:highlight w:val="yellow"/>
+                <w:highlight w:val="red"/>
               </w:rPr>
             </w:pPr>
             <w:r>
@@ -2711,7 +1799,7 @@
                 <w:color w:val="000000"/>
                 <w:sz w:val="24"/>
                 <w:szCs w:val="24"/>
-                <w:highlight w:val="yellow"/>
+                <w:highlight w:val="red"/>
               </w:rPr>
               <w:t>Physicians</w:t>
             </w:r>
@@ -2721,7 +1809,7 @@
                 <w:color w:val="000000"/>
                 <w:sz w:val="24"/>
                 <w:szCs w:val="24"/>
-                <w:highlight w:val="yellow"/>
+                <w:highlight w:val="red"/>
               </w:rPr>
               <w:t>’</w:t>
             </w:r>
@@ -2731,7 +1819,7 @@
                 <w:color w:val="000000"/>
                 <w:sz w:val="24"/>
                 <w:szCs w:val="24"/>
-                <w:highlight w:val="yellow"/>
+                <w:highlight w:val="red"/>
               </w:rPr>
               <w:t xml:space="preserve"> Services</w:t>
             </w:r>
@@ -2758,7 +1846,7 @@
                 <w:color w:val="000000"/>
                 <w:sz w:val="24"/>
                 <w:szCs w:val="24"/>
-                <w:highlight w:val="yellow"/>
+                <w:highlight w:val="red"/>
               </w:rPr>
             </w:pPr>
             <w:r>
@@ -2767,7 +1855,7 @@
                 <w:color w:val="000000"/>
                 <w:sz w:val="24"/>
                 <w:szCs w:val="24"/>
-                <w:highlight w:val="yellow"/>
+                <w:highlight w:val="red"/>
               </w:rPr>
               <w:t>2.</w:t>
             </w:r>
@@ -2777,7 +1865,7 @@
                 <w:color w:val="000000"/>
                 <w:sz w:val="24"/>
                 <w:szCs w:val="24"/>
-                <w:highlight w:val="yellow"/>
+                <w:highlight w:val="red"/>
               </w:rPr>
               <w:t>4</w:t>
             </w:r>
@@ -2787,7 +1875,7 @@
                 <w:color w:val="000000"/>
                 <w:sz w:val="24"/>
                 <w:szCs w:val="24"/>
-                <w:highlight w:val="yellow"/>
+                <w:highlight w:val="red"/>
               </w:rPr>
               <w:t>%</w:t>
             </w:r>
@@ -2819,7 +1907,7 @@
                 <w:color w:val="000000"/>
                 <w:sz w:val="24"/>
                 <w:szCs w:val="24"/>
-                <w:highlight w:val="yellow"/>
+                <w:highlight w:val="red"/>
               </w:rPr>
             </w:pPr>
             <w:r>
@@ -2828,7 +1916,7 @@
                 <w:color w:val="000000"/>
                 <w:sz w:val="24"/>
                 <w:szCs w:val="24"/>
-                <w:highlight w:val="yellow"/>
+                <w:highlight w:val="red"/>
               </w:rPr>
               <w:t>Medical Care Services</w:t>
             </w:r>
@@ -2855,7 +1943,7 @@
                 <w:color w:val="000000"/>
                 <w:sz w:val="24"/>
                 <w:szCs w:val="24"/>
-                <w:highlight w:val="yellow"/>
+                <w:highlight w:val="red"/>
               </w:rPr>
             </w:pPr>
             <w:r>
@@ -2864,7 +1952,7 @@
                 <w:color w:val="000000"/>
                 <w:sz w:val="24"/>
                 <w:szCs w:val="24"/>
-                <w:highlight w:val="yellow"/>
+                <w:highlight w:val="red"/>
               </w:rPr>
               <w:t>3.5</w:t>
             </w:r>
@@ -2874,7 +1962,7 @@
                 <w:color w:val="000000"/>
                 <w:sz w:val="24"/>
                 <w:szCs w:val="24"/>
-                <w:highlight w:val="yellow"/>
+                <w:highlight w:val="red"/>
               </w:rPr>
               <w:t>%</w:t>
             </w:r>
@@ -2906,7 +1994,7 @@
                 <w:color w:val="000000"/>
                 <w:sz w:val="24"/>
                 <w:szCs w:val="24"/>
-                <w:highlight w:val="yellow"/>
+                <w:highlight w:val="red"/>
               </w:rPr>
             </w:pPr>
             <w:r>
@@ -2915,7 +2003,7 @@
                 <w:color w:val="000000"/>
                 <w:sz w:val="24"/>
                 <w:szCs w:val="24"/>
-                <w:highlight w:val="yellow"/>
+                <w:highlight w:val="red"/>
               </w:rPr>
               <w:t xml:space="preserve">Services </w:t>
             </w:r>
@@ -2925,7 +2013,7 @@
                 <w:color w:val="000000"/>
                 <w:sz w:val="24"/>
                 <w:szCs w:val="24"/>
-                <w:highlight w:val="yellow"/>
+                <w:highlight w:val="red"/>
               </w:rPr>
               <w:t>b</w:t>
             </w:r>
@@ -2935,7 +2023,7 @@
                 <w:color w:val="000000"/>
                 <w:sz w:val="24"/>
                 <w:szCs w:val="24"/>
-                <w:highlight w:val="yellow"/>
+                <w:highlight w:val="red"/>
               </w:rPr>
               <w:t>y Other Medical Care Professionals</w:t>
             </w:r>
@@ -2962,7 +2050,7 @@
                 <w:color w:val="000000"/>
                 <w:sz w:val="24"/>
                 <w:szCs w:val="24"/>
-                <w:highlight w:val="yellow"/>
+                <w:highlight w:val="red"/>
               </w:rPr>
             </w:pPr>
             <w:r>
@@ -2971,7 +2059,7 @@
                 <w:color w:val="000000"/>
                 <w:sz w:val="24"/>
                 <w:szCs w:val="24"/>
-                <w:highlight w:val="yellow"/>
+                <w:highlight w:val="red"/>
               </w:rPr>
               <w:t>2</w:t>
             </w:r>
@@ -2981,7 +2069,7 @@
                 <w:color w:val="000000"/>
                 <w:sz w:val="24"/>
                 <w:szCs w:val="24"/>
-                <w:highlight w:val="yellow"/>
+                <w:highlight w:val="red"/>
               </w:rPr>
               <w:t>.1</w:t>
             </w:r>
@@ -2991,7 +2079,7 @@
                 <w:color w:val="000000"/>
                 <w:sz w:val="24"/>
                 <w:szCs w:val="24"/>
-                <w:highlight w:val="yellow"/>
+                <w:highlight w:val="red"/>
               </w:rPr>
               <w:t>%</w:t>
             </w:r>
@@ -3022,7 +2110,7 @@
                 <w:color w:val="000000"/>
                 <w:sz w:val="24"/>
                 <w:szCs w:val="24"/>
-                <w:highlight w:val="yellow"/>
+                <w:highlight w:val="red"/>
               </w:rPr>
             </w:pPr>
             <w:r>
@@ -3031,7 +2119,7 @@
                 <w:color w:val="000000"/>
                 <w:sz w:val="24"/>
                 <w:szCs w:val="24"/>
-                <w:highlight w:val="yellow"/>
+                <w:highlight w:val="red"/>
               </w:rPr>
               <w:t>Prescription Drugs</w:t>
             </w:r>
@@ -3057,7 +2145,7 @@
                 <w:color w:val="000000"/>
                 <w:sz w:val="24"/>
                 <w:szCs w:val="24"/>
-                <w:highlight w:val="yellow"/>
+                <w:highlight w:val="red"/>
               </w:rPr>
             </w:pPr>
             <w:r>
@@ -3066,7 +2154,7 @@
                 <w:color w:val="000000"/>
                 <w:sz w:val="24"/>
                 <w:szCs w:val="24"/>
-                <w:highlight w:val="yellow"/>
+                <w:highlight w:val="red"/>
               </w:rPr>
               <w:t>3%</w:t>
             </w:r>
@@ -3147,7 +2235,7 @@
           <w:rFonts w:ascii="Times New Roman" w:hAnsi="Times New Roman" w:cs="Times New Roman"/>
           <w:sz w:val="24"/>
           <w:szCs w:val="24"/>
-          <w:highlight w:val="yellow"/>
+          <w:highlight w:val="green"/>
         </w:rPr>
         <w:t>5-10</w:t>
       </w:r>
@@ -3306,63 +2394,25 @@
           <w:szCs w:val="24"/>
           <w:highlight w:val="yellow"/>
         </w:rPr>
-        <w:fldChar w:fldCharType="begin"/>
-      </w:r>
-      <w:r>
-        <w:rPr>
-          <w:rFonts w:ascii="Times New Roman" w:hAnsi="Times New Roman" w:cs="Times New Roman"/>
-          <w:sz w:val="24"/>
-          <w:szCs w:val="24"/>
-          <w:highlight w:val="yellow"/>
-        </w:rPr>
-        <w:instrText xml:space="preserve"> DOCVARIABLE "zapLink¦2!1!LifeCarePlanner" </w:instrText>
-      </w:r>
-      <w:r>
-        <w:rPr>
-          <w:rFonts w:ascii="Times New Roman" w:hAnsi="Times New Roman" w:cs="Times New Roman"/>
-          <w:sz w:val="24"/>
-          <w:szCs w:val="24"/>
-          <w:highlight w:val="yellow"/>
-        </w:rPr>
-        <w:fldChar w:fldCharType="separate"/>
-      </w:r>
-      <w:r>
-        <w:rPr>
-          <w:rFonts w:ascii="Times New Roman" w:hAnsi="Times New Roman" w:cs="Times New Roman"/>
-          <w:sz w:val="24"/>
-          <w:szCs w:val="24"/>
-          <w:highlight w:val="yellow"/>
-        </w:rPr>
-        <w:t xml:space="preserve">Todd S. </w:t>
-      </w:r>
-      <w:proofErr w:type="spellStart"/>
-      <w:r>
-        <w:rPr>
-          <w:rFonts w:ascii="Times New Roman" w:hAnsi="Times New Roman" w:cs="Times New Roman"/>
-          <w:sz w:val="24"/>
-          <w:szCs w:val="24"/>
-          <w:highlight w:val="yellow"/>
-        </w:rPr>
-        <w:t>Capielano</w:t>
-      </w:r>
-      <w:proofErr w:type="spellEnd"/>
-      <w:r>
-        <w:rPr>
-          <w:rFonts w:ascii="Times New Roman" w:hAnsi="Times New Roman" w:cs="Times New Roman"/>
-          <w:sz w:val="24"/>
-          <w:szCs w:val="24"/>
-          <w:highlight w:val="yellow"/>
-        </w:rPr>
-        <w:t>, CLCP</w:t>
-      </w:r>
-      <w:r>
-        <w:rPr>
-          <w:rFonts w:ascii="Times New Roman" w:hAnsi="Times New Roman" w:cs="Times New Roman"/>
-          <w:sz w:val="24"/>
-          <w:szCs w:val="24"/>
-          <w:highlight w:val="yellow"/>
-        </w:rPr>
-        <w:fldChar w:fldCharType="end"/>
+        <w:t>[[</w:t>
+      </w:r>
+      <w:r>
+        <w:rPr>
+          <w:rFonts w:ascii="Times New Roman" w:hAnsi="Times New Roman" w:cs="Times New Roman"/>
+          <w:sz w:val="24"/>
+          <w:szCs w:val="24"/>
+          <w:highlight w:val="yellow"/>
+        </w:rPr>
+        <w:t>LCP_preparer</w:t>
+      </w:r>
+      <w:r>
+        <w:rPr>
+          <w:rFonts w:ascii="Times New Roman" w:hAnsi="Times New Roman" w:cs="Times New Roman"/>
+          <w:sz w:val="24"/>
+          <w:szCs w:val="24"/>
+          <w:highlight w:val="yellow"/>
+        </w:rPr>
+        <w:t>]]</w:t>
       </w:r>
       <w:r>
         <w:rPr>
@@ -3419,7 +2469,7 @@
           <w:szCs w:val="24"/>
         </w:rPr>
       </w:pPr>
-      <w:bookmarkStart w:id="1" w:name="OLE_LINK1"/>
+      <w:bookmarkStart w:id="2" w:name="OLE_LINK1"/>
       <w:r>
         <w:rPr>
           <w:rFonts w:ascii="Times New Roman" w:eastAsia="Times New Roman" w:hAnsi="Times New Roman" w:cs="Times New Roman"/>
@@ -3504,7 +2554,7 @@
                     <pic:cNvPicPr/>
                   </pic:nvPicPr>
                   <pic:blipFill>
-                    <a:blip r:embed="rId11"/>
+                    <a:blip r:embed="rId15"/>
                     <a:stretch>
                       <a:fillRect/>
                     </a:stretch>
@@ -3546,7 +2596,7 @@
         </w:rPr>
         <w:t>Shael N. Wolfson, PhD</w:t>
       </w:r>
-      <w:bookmarkEnd w:id="1"/>
+      <w:bookmarkEnd w:id="2"/>
     </w:p>
     <w:p>
       <w:pPr>
@@ -3659,7 +2709,7 @@
           <w:szCs w:val="24"/>
           <w:highlight w:val="yellow"/>
         </w:rPr>
-        <w:fldChar w:fldCharType="begin"/>
+        <w:t>[[</w:t>
       </w:r>
       <w:r>
         <w:rPr>
@@ -3668,7 +2718,7 @@
           <w:szCs w:val="24"/>
           <w:highlight w:val="yellow"/>
         </w:rPr>
-        <w:instrText xml:space="preserve"> DOCVARIABLE "zapLink¦2!1!Claimant_Name_First" </w:instrText>
+        <w:t>claimant_name_full</w:t>
       </w:r>
       <w:r>
         <w:rPr>
@@ -3677,79 +2727,7 @@
           <w:szCs w:val="24"/>
           <w:highlight w:val="yellow"/>
         </w:rPr>
-        <w:fldChar w:fldCharType="separate"/>
-      </w:r>
-      <w:r>
-        <w:rPr>
-          <w:rFonts w:ascii="Times New Roman" w:eastAsia="Times New Roman" w:hAnsi="Times New Roman" w:cs="Times New Roman"/>
-          <w:sz w:val="24"/>
-          <w:szCs w:val="24"/>
-          <w:highlight w:val="yellow"/>
-        </w:rPr>
-        <w:t>Mark</w:t>
-      </w:r>
-      <w:r>
-        <w:rPr>
-          <w:rFonts w:ascii="Times New Roman" w:eastAsia="Times New Roman" w:hAnsi="Times New Roman" w:cs="Times New Roman"/>
-          <w:sz w:val="24"/>
-          <w:szCs w:val="24"/>
-          <w:highlight w:val="yellow"/>
-        </w:rPr>
-        <w:fldChar w:fldCharType="end"/>
-      </w:r>
-      <w:r>
-        <w:rPr>
-          <w:rFonts w:ascii="Times New Roman" w:eastAsia="Times New Roman" w:hAnsi="Times New Roman" w:cs="Times New Roman"/>
-          <w:sz w:val="24"/>
-          <w:szCs w:val="24"/>
-          <w:highlight w:val="yellow"/>
-        </w:rPr>
-        <w:t xml:space="preserve"> </w:t>
-      </w:r>
-      <w:r>
-        <w:rPr>
-          <w:rFonts w:ascii="Times New Roman" w:eastAsia="Times New Roman" w:hAnsi="Times New Roman" w:cs="Times New Roman"/>
-          <w:sz w:val="24"/>
-          <w:szCs w:val="24"/>
-          <w:highlight w:val="yellow"/>
-        </w:rPr>
-        <w:fldChar w:fldCharType="begin"/>
-      </w:r>
-      <w:r>
-        <w:rPr>
-          <w:rFonts w:ascii="Times New Roman" w:eastAsia="Times New Roman" w:hAnsi="Times New Roman" w:cs="Times New Roman"/>
-          <w:sz w:val="24"/>
-          <w:szCs w:val="24"/>
-          <w:highlight w:val="yellow"/>
-        </w:rPr>
-        <w:instrText xml:space="preserve"> DOCVARIABLE "zapLink¦2!1!Client_Name_Last" </w:instrText>
-      </w:r>
-      <w:r>
-        <w:rPr>
-          <w:rFonts w:ascii="Times New Roman" w:eastAsia="Times New Roman" w:hAnsi="Times New Roman" w:cs="Times New Roman"/>
-          <w:sz w:val="24"/>
-          <w:szCs w:val="24"/>
-          <w:highlight w:val="yellow"/>
-        </w:rPr>
-        <w:fldChar w:fldCharType="separate"/>
-      </w:r>
-      <w:r>
-        <w:rPr>
-          <w:rFonts w:ascii="Times New Roman" w:eastAsia="Times New Roman" w:hAnsi="Times New Roman" w:cs="Times New Roman"/>
-          <w:sz w:val="24"/>
-          <w:szCs w:val="24"/>
-          <w:highlight w:val="yellow"/>
-        </w:rPr>
-        <w:t>Dunkley</w:t>
-      </w:r>
-      <w:r>
-        <w:rPr>
-          <w:rFonts w:ascii="Times New Roman" w:eastAsia="Times New Roman" w:hAnsi="Times New Roman" w:cs="Times New Roman"/>
-          <w:sz w:val="24"/>
-          <w:szCs w:val="24"/>
-          <w:highlight w:val="yellow"/>
-        </w:rPr>
-        <w:fldChar w:fldCharType="end"/>
+        <w:t>]]</w:t>
       </w:r>
     </w:p>
     <w:p>
@@ -3979,97 +2957,25 @@
           <w:szCs w:val="24"/>
           <w:highlight w:val="yellow"/>
         </w:rPr>
-        <w:fldChar w:fldCharType="begin"/>
-      </w:r>
-      <w:r>
-        <w:rPr>
-          <w:rFonts w:ascii="Times New Roman" w:hAnsi="Times New Roman" w:cs="Times New Roman"/>
-          <w:sz w:val="24"/>
-          <w:szCs w:val="24"/>
-          <w:highlight w:val="yellow"/>
-        </w:rPr>
-        <w:instrText xml:space="preserve"> DOCVARIABLE "zapLink¦2!1!Claimant_Name_First" </w:instrText>
-      </w:r>
-      <w:r>
-        <w:rPr>
-          <w:rFonts w:ascii="Times New Roman" w:hAnsi="Times New Roman" w:cs="Times New Roman"/>
-          <w:sz w:val="24"/>
-          <w:szCs w:val="24"/>
-          <w:highlight w:val="yellow"/>
-        </w:rPr>
-        <w:fldChar w:fldCharType="separate"/>
-      </w:r>
-      <w:r>
-        <w:rPr>
-          <w:rFonts w:ascii="Times New Roman" w:hAnsi="Times New Roman" w:cs="Times New Roman"/>
-          <w:sz w:val="24"/>
-          <w:szCs w:val="24"/>
-          <w:highlight w:val="yellow"/>
-        </w:rPr>
-        <w:t>Mark</w:t>
-      </w:r>
-      <w:r>
-        <w:rPr>
-          <w:rFonts w:ascii="Times New Roman" w:hAnsi="Times New Roman" w:cs="Times New Roman"/>
-          <w:sz w:val="24"/>
-          <w:szCs w:val="24"/>
-          <w:highlight w:val="yellow"/>
-        </w:rPr>
-        <w:fldChar w:fldCharType="end"/>
-      </w:r>
-      <w:r>
-        <w:rPr>
-          <w:rFonts w:ascii="Times New Roman" w:hAnsi="Times New Roman" w:cs="Times New Roman"/>
-          <w:sz w:val="24"/>
-          <w:szCs w:val="24"/>
-          <w:highlight w:val="yellow"/>
-        </w:rPr>
-        <w:t xml:space="preserve"> </w:t>
-      </w:r>
-      <w:r>
-        <w:rPr>
-          <w:rFonts w:ascii="Times New Roman" w:hAnsi="Times New Roman" w:cs="Times New Roman"/>
-          <w:sz w:val="24"/>
-          <w:szCs w:val="24"/>
-          <w:highlight w:val="yellow"/>
-        </w:rPr>
-        <w:fldChar w:fldCharType="begin"/>
-      </w:r>
-      <w:r>
-        <w:rPr>
-          <w:rFonts w:ascii="Times New Roman" w:hAnsi="Times New Roman" w:cs="Times New Roman"/>
-          <w:sz w:val="24"/>
-          <w:szCs w:val="24"/>
-          <w:highlight w:val="yellow"/>
-        </w:rPr>
-        <w:instrText xml:space="preserve"> DOCVARIABLE "zapLink¦2!1!Client_Name_Last" </w:instrText>
-      </w:r>
-      <w:r>
-        <w:rPr>
-          <w:rFonts w:ascii="Times New Roman" w:hAnsi="Times New Roman" w:cs="Times New Roman"/>
-          <w:sz w:val="24"/>
-          <w:szCs w:val="24"/>
-          <w:highlight w:val="yellow"/>
-        </w:rPr>
-        <w:fldChar w:fldCharType="separate"/>
-      </w:r>
-      <w:r>
-        <w:rPr>
-          <w:rFonts w:ascii="Times New Roman" w:hAnsi="Times New Roman" w:cs="Times New Roman"/>
-          <w:sz w:val="24"/>
-          <w:szCs w:val="24"/>
-          <w:highlight w:val="yellow"/>
-        </w:rPr>
-        <w:t>Dunkley</w:t>
-      </w:r>
-      <w:r>
-        <w:rPr>
-          <w:rFonts w:ascii="Times New Roman" w:hAnsi="Times New Roman" w:cs="Times New Roman"/>
-          <w:sz w:val="24"/>
-          <w:szCs w:val="24"/>
-          <w:highlight w:val="yellow"/>
-        </w:rPr>
-        <w:fldChar w:fldCharType="end"/>
+        <w:t>[[</w:t>
+      </w:r>
+      <w:r>
+        <w:rPr>
+          <w:rFonts w:ascii="Times New Roman" w:hAnsi="Times New Roman" w:cs="Times New Roman"/>
+          <w:sz w:val="24"/>
+          <w:szCs w:val="24"/>
+          <w:highlight w:val="yellow"/>
+        </w:rPr>
+        <w:t>claimant_name_full</w:t>
+      </w:r>
+      <w:r>
+        <w:rPr>
+          <w:rFonts w:ascii="Times New Roman" w:hAnsi="Times New Roman" w:cs="Times New Roman"/>
+          <w:sz w:val="24"/>
+          <w:szCs w:val="24"/>
+          <w:highlight w:val="yellow"/>
+        </w:rPr>
+        <w:t>]]</w:t>
       </w:r>
       <w:r>
         <w:rPr>
@@ -4086,63 +2992,25 @@
           <w:szCs w:val="24"/>
           <w:highlight w:val="yellow"/>
         </w:rPr>
-        <w:fldChar w:fldCharType="begin"/>
-      </w:r>
-      <w:r>
-        <w:rPr>
-          <w:rFonts w:ascii="Times New Roman" w:hAnsi="Times New Roman" w:cs="Times New Roman"/>
-          <w:sz w:val="24"/>
-          <w:szCs w:val="24"/>
-          <w:highlight w:val="yellow"/>
-        </w:rPr>
-        <w:instrText xml:space="preserve"> DOCVARIABLE "zapLink¦2!1!LifeCarePlanner" </w:instrText>
-      </w:r>
-      <w:r>
-        <w:rPr>
-          <w:rFonts w:ascii="Times New Roman" w:hAnsi="Times New Roman" w:cs="Times New Roman"/>
-          <w:sz w:val="24"/>
-          <w:szCs w:val="24"/>
-          <w:highlight w:val="yellow"/>
-        </w:rPr>
-        <w:fldChar w:fldCharType="separate"/>
-      </w:r>
-      <w:r>
-        <w:rPr>
-          <w:rFonts w:ascii="Times New Roman" w:hAnsi="Times New Roman" w:cs="Times New Roman"/>
-          <w:sz w:val="24"/>
-          <w:szCs w:val="24"/>
-          <w:highlight w:val="yellow"/>
-        </w:rPr>
-        <w:t xml:space="preserve">Todd S. </w:t>
-      </w:r>
-      <w:proofErr w:type="spellStart"/>
-      <w:r>
-        <w:rPr>
-          <w:rFonts w:ascii="Times New Roman" w:hAnsi="Times New Roman" w:cs="Times New Roman"/>
-          <w:sz w:val="24"/>
-          <w:szCs w:val="24"/>
-          <w:highlight w:val="yellow"/>
-        </w:rPr>
-        <w:t>Capielano</w:t>
-      </w:r>
-      <w:proofErr w:type="spellEnd"/>
-      <w:r>
-        <w:rPr>
-          <w:rFonts w:ascii="Times New Roman" w:hAnsi="Times New Roman" w:cs="Times New Roman"/>
-          <w:sz w:val="24"/>
-          <w:szCs w:val="24"/>
-          <w:highlight w:val="yellow"/>
-        </w:rPr>
-        <w:t>, CLCP</w:t>
-      </w:r>
-      <w:r>
-        <w:rPr>
-          <w:rFonts w:ascii="Times New Roman" w:hAnsi="Times New Roman" w:cs="Times New Roman"/>
-          <w:sz w:val="24"/>
-          <w:szCs w:val="24"/>
-          <w:highlight w:val="yellow"/>
-        </w:rPr>
-        <w:fldChar w:fldCharType="end"/>
+        <w:t>[[</w:t>
+      </w:r>
+      <w:r>
+        <w:rPr>
+          <w:rFonts w:ascii="Times New Roman" w:hAnsi="Times New Roman" w:cs="Times New Roman"/>
+          <w:sz w:val="24"/>
+          <w:szCs w:val="24"/>
+          <w:highlight w:val="yellow"/>
+        </w:rPr>
+        <w:t>LCP_preparer</w:t>
+      </w:r>
+      <w:r>
+        <w:rPr>
+          <w:rFonts w:ascii="Times New Roman" w:hAnsi="Times New Roman" w:cs="Times New Roman"/>
+          <w:sz w:val="24"/>
+          <w:szCs w:val="24"/>
+          <w:highlight w:val="yellow"/>
+        </w:rPr>
+        <w:t>]]</w:t>
       </w:r>
       <w:r>
         <w:rPr>
@@ -4159,43 +3027,43 @@
           <w:szCs w:val="24"/>
           <w:highlight w:val="yellow"/>
         </w:rPr>
-        <w:fldChar w:fldCharType="begin"/>
-      </w:r>
-      <w:r>
-        <w:rPr>
-          <w:rFonts w:ascii="Times New Roman" w:hAnsi="Times New Roman" w:cs="Times New Roman"/>
-          <w:sz w:val="24"/>
-          <w:szCs w:val="24"/>
-          <w:highlight w:val="yellow"/>
-        </w:rPr>
-        <w:instrText xml:space="preserve"> DOCVARIABLE "zapLink¦2!1!LCPReportDate" </w:instrText>
-      </w:r>
-      <w:r>
-        <w:rPr>
-          <w:rFonts w:ascii="Times New Roman" w:hAnsi="Times New Roman" w:cs="Times New Roman"/>
-          <w:sz w:val="24"/>
-          <w:szCs w:val="24"/>
-          <w:highlight w:val="yellow"/>
-        </w:rPr>
-        <w:fldChar w:fldCharType="separate"/>
-      </w:r>
-      <w:r>
-        <w:rPr>
-          <w:rFonts w:ascii="Times New Roman" w:hAnsi="Times New Roman" w:cs="Times New Roman"/>
-          <w:sz w:val="24"/>
-          <w:szCs w:val="24"/>
-          <w:highlight w:val="yellow"/>
-        </w:rPr>
-        <w:t>TBD</w:t>
-      </w:r>
-      <w:r>
-        <w:rPr>
-          <w:rFonts w:ascii="Times New Roman" w:hAnsi="Times New Roman" w:cs="Times New Roman"/>
-          <w:sz w:val="24"/>
-          <w:szCs w:val="24"/>
-          <w:highlight w:val="yellow"/>
-        </w:rPr>
-        <w:fldChar w:fldCharType="end"/>
+        <w:t>[[</w:t>
+      </w:r>
+      <w:r>
+        <w:rPr>
+          <w:rFonts w:ascii="Times New Roman" w:hAnsi="Times New Roman" w:cs="Times New Roman"/>
+          <w:sz w:val="24"/>
+          <w:szCs w:val="24"/>
+          <w:highlight w:val="yellow"/>
+        </w:rPr>
+        <w:t>LCP_report_date</w:t>
+      </w:r>
+      <w:r>
+        <w:rPr>
+          <w:rFonts w:ascii="Times New Roman" w:hAnsi="Times New Roman" w:cs="Times New Roman"/>
+          <w:sz w:val="24"/>
+          <w:szCs w:val="24"/>
+          <w:highlight w:val="yellow"/>
+        </w:rPr>
+        <w:t>_</w:t>
+      </w:r>
+      <w:r>
+        <w:rPr>
+          <w:rFonts w:ascii="Times New Roman" w:hAnsi="Times New Roman" w:cs="Times New Roman"/>
+          <w:sz w:val="24"/>
+          <w:szCs w:val="24"/>
+          <w:highlight w:val="yellow"/>
+        </w:rPr>
+        <w:t>long</w:t>
+      </w:r>
+      <w:r>
+        <w:rPr>
+          <w:rFonts w:ascii="Times New Roman" w:hAnsi="Times New Roman" w:cs="Times New Roman"/>
+          <w:sz w:val="24"/>
+          <w:szCs w:val="24"/>
+          <w:highlight w:val="yellow"/>
+        </w:rPr>
+        <w:t>]]</w:t>
       </w:r>
       <w:r>
         <w:rPr>
@@ -4238,7 +3106,7 @@
           <w:rFonts w:ascii="Times New Roman" w:hAnsi="Times New Roman" w:cs="Times New Roman"/>
           <w:sz w:val="24"/>
           <w:szCs w:val="24"/>
-          <w:highlight w:val="yellow"/>
+          <w:highlight w:val="red"/>
         </w:rPr>
         <w:t>February</w:t>
       </w:r>
@@ -4247,7 +3115,7 @@
           <w:rFonts w:ascii="Times New Roman" w:hAnsi="Times New Roman" w:cs="Times New Roman"/>
           <w:sz w:val="24"/>
           <w:szCs w:val="24"/>
-          <w:highlight w:val="yellow"/>
+          <w:highlight w:val="red"/>
         </w:rPr>
         <w:t xml:space="preserve"> </w:t>
       </w:r>
@@ -4256,7 +3124,7 @@
           <w:rFonts w:ascii="Times New Roman" w:hAnsi="Times New Roman" w:cs="Times New Roman"/>
           <w:sz w:val="24"/>
           <w:szCs w:val="24"/>
-          <w:highlight w:val="yellow"/>
+          <w:highlight w:val="red"/>
         </w:rPr>
         <w:t>2</w:t>
       </w:r>
@@ -4265,25 +3133,16 @@
           <w:rFonts w:ascii="Times New Roman" w:hAnsi="Times New Roman" w:cs="Times New Roman"/>
           <w:sz w:val="24"/>
           <w:szCs w:val="24"/>
-          <w:highlight w:val="yellow"/>
-        </w:rPr>
-        <w:t>, 2</w:t>
-      </w:r>
-      <w:r>
-        <w:rPr>
-          <w:rFonts w:ascii="Times New Roman" w:hAnsi="Times New Roman" w:cs="Times New Roman"/>
-          <w:sz w:val="24"/>
-          <w:szCs w:val="24"/>
-          <w:highlight w:val="yellow"/>
-        </w:rPr>
-        <w:t>02</w:t>
-      </w:r>
-      <w:r>
-        <w:rPr>
-          <w:rFonts w:ascii="Times New Roman" w:hAnsi="Times New Roman" w:cs="Times New Roman"/>
-          <w:sz w:val="24"/>
-          <w:szCs w:val="24"/>
-          <w:highlight w:val="yellow"/>
+          <w:highlight w:val="red"/>
+        </w:rPr>
+        <w:t>, 202</w:t>
+      </w:r>
+      <w:r>
+        <w:rPr>
+          <w:rFonts w:ascii="Times New Roman" w:hAnsi="Times New Roman" w:cs="Times New Roman"/>
+          <w:sz w:val="24"/>
+          <w:szCs w:val="24"/>
+          <w:highlight w:val="red"/>
         </w:rPr>
         <w:t>6</w:t>
       </w:r>
@@ -4395,7 +3254,7 @@
           <w:rFonts w:ascii="Times New Roman" w:hAnsi="Times New Roman" w:cs="Times New Roman"/>
           <w:sz w:val="24"/>
           <w:szCs w:val="24"/>
-          <w:highlight w:val="yellow"/>
+          <w:highlight w:val="red"/>
         </w:rPr>
         <w:t>Medical Care Services (CUUR0000SAM2</w:t>
       </w:r>
@@ -4469,7 +3328,7 @@
           <w:rFonts w:ascii="Times New Roman" w:hAnsi="Times New Roman" w:cs="Times New Roman"/>
           <w:sz w:val="24"/>
           <w:szCs w:val="24"/>
-          <w:highlight w:val="yellow"/>
+          <w:highlight w:val="red"/>
         </w:rPr>
         <w:t>Physicians</w:t>
       </w:r>
@@ -4479,7 +3338,7 @@
           <w:rFonts w:ascii="Times New Roman" w:hAnsi="Times New Roman" w:cs="Times New Roman"/>
           <w:sz w:val="24"/>
           <w:szCs w:val="24"/>
-          <w:highlight w:val="yellow"/>
+          <w:highlight w:val="red"/>
         </w:rPr>
         <w:t>’</w:t>
       </w:r>
@@ -4489,7 +3348,7 @@
           <w:rFonts w:ascii="Times New Roman" w:hAnsi="Times New Roman" w:cs="Times New Roman"/>
           <w:sz w:val="24"/>
           <w:szCs w:val="24"/>
-          <w:highlight w:val="yellow"/>
+          <w:highlight w:val="red"/>
         </w:rPr>
         <w:t xml:space="preserve"> Services (CUUR0000SEMC01, NSA</w:t>
       </w:r>
@@ -4563,7 +3422,7 @@
           <w:rFonts w:ascii="Times New Roman" w:hAnsi="Times New Roman" w:cs="Times New Roman"/>
           <w:sz w:val="24"/>
           <w:szCs w:val="24"/>
-          <w:highlight w:val="yellow"/>
+          <w:highlight w:val="red"/>
         </w:rPr>
         <w:t>Prescription Drugs (CUUR0000SEMF01, NSA</w:t>
       </w:r>
@@ -4646,7 +3505,7 @@
           <w:rFonts w:ascii="Times New Roman" w:hAnsi="Times New Roman" w:cs="Times New Roman"/>
           <w:sz w:val="24"/>
           <w:szCs w:val="24"/>
-          <w:highlight w:val="yellow"/>
+          <w:highlight w:val="red"/>
         </w:rPr>
         <w:t xml:space="preserve">Services </w:t>
       </w:r>
@@ -4656,7 +3515,7 @@
           <w:rFonts w:ascii="Times New Roman" w:hAnsi="Times New Roman" w:cs="Times New Roman"/>
           <w:sz w:val="24"/>
           <w:szCs w:val="24"/>
-          <w:highlight w:val="yellow"/>
+          <w:highlight w:val="red"/>
         </w:rPr>
         <w:t>by</w:t>
       </w:r>
@@ -4666,7 +3525,7 @@
           <w:rFonts w:ascii="Times New Roman" w:hAnsi="Times New Roman" w:cs="Times New Roman"/>
           <w:sz w:val="24"/>
           <w:szCs w:val="24"/>
-          <w:highlight w:val="yellow"/>
+          <w:highlight w:val="red"/>
         </w:rPr>
         <w:t xml:space="preserve"> Other Medical Professionals (CUUR0000SEMC04, NSA</w:t>
       </w:r>
@@ -4748,28 +3607,9 @@
           <w:rFonts w:ascii="Times New Roman" w:hAnsi="Times New Roman" w:cs="Times New Roman"/>
           <w:sz w:val="24"/>
           <w:szCs w:val="24"/>
-          <w:highlight w:val="yellow"/>
-        </w:rPr>
-        <w:t xml:space="preserve">All Items </w:t>
-      </w:r>
-      <w:r>
-        <w:rPr>
-          <w:rStyle w:val="Emphasis"/>
-          <w:rFonts w:ascii="Times New Roman" w:hAnsi="Times New Roman" w:cs="Times New Roman"/>
-          <w:sz w:val="24"/>
-          <w:szCs w:val="24"/>
-        </w:rPr>
-        <w:t>(</w:t>
-      </w:r>
-      <w:r>
-        <w:rPr>
-          <w:rStyle w:val="Emphasis"/>
-          <w:rFonts w:ascii="Times New Roman" w:hAnsi="Times New Roman" w:cs="Times New Roman"/>
-          <w:sz w:val="24"/>
-          <w:szCs w:val="24"/>
-          <w:highlight w:val="yellow"/>
-        </w:rPr>
-        <w:t>CUUR0000SA0</w:t>
+          <w:highlight w:val="red"/>
+        </w:rPr>
+        <w:t>All Items (CUUR0000SA0</w:t>
       </w:r>
       <w:r>
         <w:rPr>
@@ -4848,7 +3688,7 @@
           <w:rFonts w:ascii="Times New Roman" w:hAnsi="Times New Roman" w:cs="Times New Roman"/>
           <w:sz w:val="24"/>
           <w:szCs w:val="24"/>
-          <w:highlight w:val="yellow"/>
+          <w:highlight w:val="red"/>
         </w:rPr>
         <w:t xml:space="preserve">Inpatient </w:t>
       </w:r>
@@ -4858,7 +3698,7 @@
           <w:rFonts w:ascii="Times New Roman" w:hAnsi="Times New Roman" w:cs="Times New Roman"/>
           <w:sz w:val="24"/>
           <w:szCs w:val="24"/>
-          <w:highlight w:val="yellow"/>
+          <w:highlight w:val="red"/>
         </w:rPr>
         <w:t>H</w:t>
       </w:r>
@@ -4868,7 +3708,7 @@
           <w:rFonts w:ascii="Times New Roman" w:hAnsi="Times New Roman" w:cs="Times New Roman"/>
           <w:sz w:val="24"/>
           <w:szCs w:val="24"/>
-          <w:highlight w:val="yellow"/>
+          <w:highlight w:val="red"/>
         </w:rPr>
         <w:t xml:space="preserve">ospital </w:t>
       </w:r>
@@ -4878,7 +3718,7 @@
           <w:rFonts w:ascii="Times New Roman" w:hAnsi="Times New Roman" w:cs="Times New Roman"/>
           <w:sz w:val="24"/>
           <w:szCs w:val="24"/>
-          <w:highlight w:val="yellow"/>
+          <w:highlight w:val="red"/>
         </w:rPr>
         <w:t>S</w:t>
       </w:r>
@@ -4888,28 +3728,9 @@
           <w:rFonts w:ascii="Times New Roman" w:hAnsi="Times New Roman" w:cs="Times New Roman"/>
           <w:sz w:val="24"/>
           <w:szCs w:val="24"/>
-          <w:highlight w:val="yellow"/>
-        </w:rPr>
-        <w:t xml:space="preserve">ervices </w:t>
-      </w:r>
-      <w:r>
-        <w:rPr>
-          <w:rStyle w:val="Emphasis"/>
-          <w:rFonts w:ascii="Times New Roman" w:hAnsi="Times New Roman" w:cs="Times New Roman"/>
-          <w:sz w:val="24"/>
-          <w:szCs w:val="24"/>
-        </w:rPr>
-        <w:t>(</w:t>
-      </w:r>
-      <w:r>
-        <w:rPr>
-          <w:rStyle w:val="Emphasis"/>
-          <w:rFonts w:ascii="Times New Roman" w:hAnsi="Times New Roman" w:cs="Times New Roman"/>
-          <w:sz w:val="24"/>
-          <w:szCs w:val="24"/>
-          <w:highlight w:val="yellow"/>
-        </w:rPr>
-        <w:t>CUUR0000SS5702</w:t>
+          <w:highlight w:val="red"/>
+        </w:rPr>
+        <w:t>ervices (CUUR0000SS5702</w:t>
       </w:r>
       <w:r>
         <w:rPr>
@@ -4988,28 +3809,9 @@
           <w:rFonts w:ascii="Times New Roman" w:hAnsi="Times New Roman" w:cs="Times New Roman"/>
           <w:sz w:val="24"/>
           <w:szCs w:val="24"/>
-          <w:highlight w:val="yellow"/>
-        </w:rPr>
-        <w:t xml:space="preserve">Medical Care Commodities </w:t>
-      </w:r>
-      <w:r>
-        <w:rPr>
-          <w:rStyle w:val="Emphasis"/>
-          <w:rFonts w:ascii="Times New Roman" w:hAnsi="Times New Roman" w:cs="Times New Roman"/>
-          <w:sz w:val="24"/>
-          <w:szCs w:val="24"/>
-        </w:rPr>
-        <w:t>(</w:t>
-      </w:r>
-      <w:r>
-        <w:rPr>
-          <w:rStyle w:val="Emphasis"/>
-          <w:rFonts w:ascii="Times New Roman" w:hAnsi="Times New Roman" w:cs="Times New Roman"/>
-          <w:sz w:val="24"/>
-          <w:szCs w:val="24"/>
-          <w:highlight w:val="yellow"/>
-        </w:rPr>
-        <w:t>CUUR0000SAM1</w:t>
+          <w:highlight w:val="red"/>
+        </w:rPr>
+        <w:t>Medical Care Commodities (CUUR0000SAM1</w:t>
       </w:r>
       <w:r>
         <w:rPr>
@@ -5030,12 +3832,9 @@
       </w:r>
     </w:p>
     <w:sectPr>
-      <w:headerReference w:type="even" r:id="rId12"/>
-      <w:headerReference w:type="default" r:id="rId13"/>
-      <w:footerReference w:type="even" r:id="rId14"/>
-      <w:footerReference w:type="default" r:id="rId15"/>
-      <w:headerReference w:type="first" r:id="rId16"/>
-      <w:footerReference w:type="first" r:id="rId17"/>
+      <w:headerReference w:type="default" r:id="rId16"/>
+      <w:headerReference w:type="first" r:id="rId17"/>
+      <w:footerReference w:type="first" r:id="rId18"/>
       <w:type w:val="continuous"/>
       <w:pgSz w:w="12240" w:h="15840" w:code="1"/>
       <w:pgMar w:top="1886" w:right="1354" w:bottom="1094" w:left="1440" w:header="720" w:footer="720" w:gutter="0"/>
@@ -5047,6 +3846,45 @@
 </w:document>
 </file>
 
+<file path=word/comments.xml><?xml version="1.0" encoding="utf-8"?>
+<w:comments xmlns:wpc="http://schemas.microsoft.com/office/word/2010/wordprocessingCanvas" xmlns:cx="http://schemas.microsoft.com/office/drawing/2014/chartex" xmlns:cx1="http://schemas.microsoft.com/office/drawing/2015/9/8/chartex" xmlns:cx2="http://schemas.microsoft.com/office/drawing/2015/10/21/chartex" xmlns:cx3="http://schemas.microsoft.com/office/drawing/2016/5/9/chartex" xmlns:cx4="http://schemas.microsoft.com/office/drawing/2016/5/10/chartex" xmlns:cx5="http://schemas.microsoft.com/office/drawing/2016/5/11/chartex" xmlns:cx6="http://schemas.microsoft.com/office/drawing/2016/5/12/chartex" xmlns:cx7="http://schemas.microsoft.com/office/drawing/2016/5/13/chartex" xmlns:cx8="http://schemas.microsoft.com/office/drawing/2016/5/14/chartex" xmlns:mc="http://schemas.openxmlformats.org/markup-compatibility/2006" xmlns:aink="http://schemas.microsoft.com/office/drawing/2016/ink" xmlns:am3d="http://schemas.microsoft.com/office/drawing/2017/model3d" xmlns:o="urn:schemas-microsoft-com:office:office" xmlns:oel="http://schemas.microsoft.com/office/2019/extlst" xmlns:r="http://schemas.openxmlformats.org/officeDocument/2006/relationships" xmlns:m="http://schemas.openxmlformats.org/officeDocument/2006/math" xmlns:v="urn:schemas-microsoft-com:vml" xmlns:wp14="http://schemas.microsoft.com/office/word/2010/wordprocessingDrawing" xmlns:wp="http://schemas.openxmlformats.org/drawingml/2006/wordprocessingDrawing" xmlns:w10="urn:schemas-microsoft-com:office:word" xmlns:w="http://schemas.openxmlformats.org/wordprocessingml/2006/main" xmlns:w14="http://schemas.microsoft.com/office/word/2010/wordml" xmlns:w15="http://schemas.microsoft.com/office/word/2012/wordml" xmlns:w16cex="http://schemas.microsoft.com/office/word/2018/wordml/cex" xmlns:w16cid="http://schemas.microsoft.com/office/word/2016/wordml/cid" xmlns:w16="http://schemas.microsoft.com/office/word/2018/wordml" xmlns:w16du="http://schemas.microsoft.com/office/word/2023/wordml/word16du" xmlns:w16sdtdh="http://schemas.microsoft.com/office/word/2020/wordml/sdtdatahash" xmlns:w16sdtfl="http://schemas.microsoft.com/office/word/2024/wordml/sdtformatlock" xmlns:w16se="http://schemas.microsoft.com/office/word/2015/wordml/symex" xmlns:wpg="http://schemas.microsoft.com/office/word/2010/wordprocessingGroup" xmlns:wpi="http://schemas.microsoft.com/office/word/2010/wordprocessingInk" xmlns:wne="http://schemas.microsoft.com/office/word/2006/wordml" xmlns:wps="http://schemas.microsoft.com/office/word/2010/wordprocessingShape" mc:Ignorable="w14 w15 w16se w16cid w16 w16cex w16sdtdh w16sdtfl w16du wp14">
+  <w:comment w:id="1" w:author="Eric Bussey" w:date="2026-04-17T16:24:00Z" w:initials="EB">
+    <w:p>
+      <w:pPr>
+        <w:pStyle w:val="CommentText"/>
+      </w:pPr>
+      <w:r>
+        <w:rPr>
+          <w:rStyle w:val="CommentReference"/>
+        </w:rPr>
+        <w:annotationRef/>
+      </w:r>
+      <w:r>
+        <w:t>There is some start date variance on a per-category basis</w:t>
+      </w:r>
+    </w:p>
+  </w:comment>
+</w:comments>
+</file>
+
+<file path=word/commentsExtended.xml><?xml version="1.0" encoding="utf-8"?>
+<w15:commentsEx xmlns:wpc="http://schemas.microsoft.com/office/word/2010/wordprocessingCanvas" xmlns:cx="http://schemas.microsoft.com/office/drawing/2014/chartex" xmlns:cx1="http://schemas.microsoft.com/office/drawing/2015/9/8/chartex" xmlns:cx2="http://schemas.microsoft.com/office/drawing/2015/10/21/chartex" xmlns:cx3="http://schemas.microsoft.com/office/drawing/2016/5/9/chartex" xmlns:cx4="http://schemas.microsoft.com/office/drawing/2016/5/10/chartex" xmlns:cx5="http://schemas.microsoft.com/office/drawing/2016/5/11/chartex" xmlns:cx6="http://schemas.microsoft.com/office/drawing/2016/5/12/chartex" xmlns:cx7="http://schemas.microsoft.com/office/drawing/2016/5/13/chartex" xmlns:cx8="http://schemas.microsoft.com/office/drawing/2016/5/14/chartex" xmlns:mc="http://schemas.openxmlformats.org/markup-compatibility/2006" xmlns:aink="http://schemas.microsoft.com/office/drawing/2016/ink" xmlns:am3d="http://schemas.microsoft.com/office/drawing/2017/model3d" xmlns:o="urn:schemas-microsoft-com:office:office" xmlns:oel="http://schemas.microsoft.com/office/2019/extlst" xmlns:r="http://schemas.openxmlformats.org/officeDocument/2006/relationships" xmlns:m="http://schemas.openxmlformats.org/officeDocument/2006/math" xmlns:v="urn:schemas-microsoft-com:vml" xmlns:wp14="http://schemas.microsoft.com/office/word/2010/wordprocessingDrawing" xmlns:wp="http://schemas.openxmlformats.org/drawingml/2006/wordprocessingDrawing" xmlns:w10="urn:schemas-microsoft-com:office:word" xmlns:w="http://schemas.openxmlformats.org/wordprocessingml/2006/main" xmlns:w14="http://schemas.microsoft.com/office/word/2010/wordml" xmlns:w15="http://schemas.microsoft.com/office/word/2012/wordml" xmlns:w16cex="http://schemas.microsoft.com/office/word/2018/wordml/cex" xmlns:w16cid="http://schemas.microsoft.com/office/word/2016/wordml/cid" xmlns:w16="http://schemas.microsoft.com/office/word/2018/wordml" xmlns:w16du="http://schemas.microsoft.com/office/word/2023/wordml/word16du" xmlns:w16sdtdh="http://schemas.microsoft.com/office/word/2020/wordml/sdtdatahash" xmlns:w16sdtfl="http://schemas.microsoft.com/office/word/2024/wordml/sdtformatlock" xmlns:w16se="http://schemas.microsoft.com/office/word/2015/wordml/symex" xmlns:wpg="http://schemas.microsoft.com/office/word/2010/wordprocessingGroup" xmlns:wpi="http://schemas.microsoft.com/office/word/2010/wordprocessingInk" xmlns:wne="http://schemas.microsoft.com/office/word/2006/wordml" xmlns:wps="http://schemas.microsoft.com/office/word/2010/wordprocessingShape" mc:Ignorable="w14 w15 w16se w16cid w16 w16cex w16sdtdh w16sdtfl w16du wp14">
+  <w15:commentEx w15:paraId="1652E33F" w15:done="0"/>
+</w15:commentsEx>
+</file>
+
+<file path=word/commentsExtensible.xml><?xml version="1.0" encoding="utf-8"?>
+<w16cex:commentsExtensible xmlns:wpc="http://schemas.microsoft.com/office/word/2010/wordprocessingCanvas" xmlns:cx="http://schemas.microsoft.com/office/drawing/2014/chartex" xmlns:cx1="http://schemas.microsoft.com/office/drawing/2015/9/8/chartex" xmlns:cx2="http://schemas.microsoft.com/office/drawing/2015/10/21/chartex" xmlns:cx3="http://schemas.microsoft.com/office/drawing/2016/5/9/chartex" xmlns:cx4="http://schemas.microsoft.com/office/drawing/2016/5/10/chartex" xmlns:cx5="http://schemas.microsoft.com/office/drawing/2016/5/11/chartex" xmlns:cx6="http://schemas.microsoft.com/office/drawing/2016/5/12/chartex" xmlns:cx7="http://schemas.microsoft.com/office/drawing/2016/5/13/chartex" xmlns:cx8="http://schemas.microsoft.com/office/drawing/2016/5/14/chartex" xmlns:cr="http://schemas.microsoft.com/office/comments/2020/reactions" xmlns:mc="http://schemas.openxmlformats.org/markup-compatibility/2006" xmlns:aink="http://schemas.microsoft.com/office/drawing/2016/ink" xmlns:am3d="http://schemas.microsoft.com/office/drawing/2017/model3d" xmlns:o="urn:schemas-microsoft-com:office:office" xmlns:oel="http://schemas.microsoft.com/office/2019/extlst" xmlns:r="http://schemas.openxmlformats.org/officeDocument/2006/relationships" xmlns:m="http://schemas.openxmlformats.org/officeDocument/2006/math" xmlns:v="urn:schemas-microsoft-com:vml" xmlns:wp14="http://schemas.microsoft.com/office/word/2010/wordprocessingDrawing" xmlns:wp="http://schemas.openxmlformats.org/drawingml/2006/wordprocessingDrawing" xmlns:w10="urn:schemas-microsoft-com:office:word" xmlns:w="http://schemas.openxmlformats.org/wordprocessingml/2006/main" xmlns:w14="http://schemas.microsoft.com/office/word/2010/wordml" xmlns:w15="http://schemas.microsoft.com/office/word/2012/wordml" xmlns:w16cex="http://schemas.microsoft.com/office/word/2018/wordml/cex" xmlns:w16cid="http://schemas.microsoft.com/office/word/2016/wordml/cid" xmlns:w16="http://schemas.microsoft.com/office/word/2018/wordml" xmlns:w16du="http://schemas.microsoft.com/office/word/2023/wordml/word16du" xmlns:w16sdtdh="http://schemas.microsoft.com/office/word/2020/wordml/sdtdatahash" xmlns:w16sdtfl="http://schemas.microsoft.com/office/word/2024/wordml/sdtformatlock" xmlns:w16se="http://schemas.microsoft.com/office/word/2015/wordml/symex" xmlns:wpg="http://schemas.microsoft.com/office/word/2010/wordprocessingGroup" xmlns:wpi="http://schemas.microsoft.com/office/word/2010/wordprocessingInk" xmlns:wne="http://schemas.microsoft.com/office/word/2006/wordml" xmlns:wps="http://schemas.microsoft.com/office/word/2010/wordprocessingShape" mc:Ignorable="w14 w15 w16se w16cid w16 w16cex w16sdtdh w16sdtfl cr w16du wp14">
+  <w16cex:commentExtensible w16cex:durableId="2E3FA4AB" w16cex:dateUtc="2026-04-17T21:24:00Z"/>
+</w16cex:commentsExtensible>
+</file>
+
+<file path=word/commentsIds.xml><?xml version="1.0" encoding="utf-8"?>
+<w16cid:commentsIds xmlns:wpc="http://schemas.microsoft.com/office/word/2010/wordprocessingCanvas" xmlns:cx="http://schemas.microsoft.com/office/drawing/2014/chartex" xmlns:cx1="http://schemas.microsoft.com/office/drawing/2015/9/8/chartex" xmlns:cx2="http://schemas.microsoft.com/office/drawing/2015/10/21/chartex" xmlns:cx3="http://schemas.microsoft.com/office/drawing/2016/5/9/chartex" xmlns:cx4="http://schemas.microsoft.com/office/drawing/2016/5/10/chartex" xmlns:cx5="http://schemas.microsoft.com/office/drawing/2016/5/11/chartex" xmlns:cx6="http://schemas.microsoft.com/office/drawing/2016/5/12/chartex" xmlns:cx7="http://schemas.microsoft.com/office/drawing/2016/5/13/chartex" xmlns:cx8="http://schemas.microsoft.com/office/drawing/2016/5/14/chartex" xmlns:mc="http://schemas.openxmlformats.org/markup-compatibility/2006" xmlns:aink="http://schemas.microsoft.com/office/drawing/2016/ink" xmlns:am3d="http://schemas.microsoft.com/office/drawing/2017/model3d" xmlns:o="urn:schemas-microsoft-com:office:office" xmlns:oel="http://schemas.microsoft.com/office/2019/extlst" xmlns:r="http://schemas.openxmlformats.org/officeDocument/2006/relationships" xmlns:m="http://schemas.openxmlformats.org/officeDocument/2006/math" xmlns:v="urn:schemas-microsoft-com:vml" xmlns:wp14="http://schemas.microsoft.com/office/word/2010/wordprocessingDrawing" xmlns:wp="http://schemas.openxmlformats.org/drawingml/2006/wordprocessingDrawing" xmlns:w10="urn:schemas-microsoft-com:office:word" xmlns:w="http://schemas.openxmlformats.org/wordprocessingml/2006/main" xmlns:w14="http://schemas.microsoft.com/office/word/2010/wordml" xmlns:w15="http://schemas.microsoft.com/office/word/2012/wordml" xmlns:w16cex="http://schemas.microsoft.com/office/word/2018/wordml/cex" xmlns:w16cid="http://schemas.microsoft.com/office/word/2016/wordml/cid" xmlns:w16="http://schemas.microsoft.com/office/word/2018/wordml" xmlns:w16du="http://schemas.microsoft.com/office/word/2023/wordml/word16du" xmlns:w16sdtdh="http://schemas.microsoft.com/office/word/2020/wordml/sdtdatahash" xmlns:w16sdtfl="http://schemas.microsoft.com/office/word/2024/wordml/sdtformatlock" xmlns:w16se="http://schemas.microsoft.com/office/word/2015/wordml/symex" xmlns:wpg="http://schemas.microsoft.com/office/word/2010/wordprocessingGroup" xmlns:wpi="http://schemas.microsoft.com/office/word/2010/wordprocessingInk" xmlns:wne="http://schemas.microsoft.com/office/word/2006/wordml" xmlns:wps="http://schemas.microsoft.com/office/word/2010/wordprocessingShape" mc:Ignorable="w14 w15 w16se w16cid w16 w16cex w16sdtdh w16sdtfl w16du wp14">
+  <w16cid:commentId w16cid:paraId="1652E33F" w16cid:durableId="2E3FA4AB"/>
+</w16cid:commentsIds>
+</file>
+
 <file path=word/endnotes.xml><?xml version="1.0" encoding="utf-8"?>
 <w:endnotes xmlns:wpc="http://schemas.microsoft.com/office/word/2010/wordprocessingCanvas" xmlns:cx="http://schemas.microsoft.com/office/drawing/2014/chartex" xmlns:cx1="http://schemas.microsoft.com/office/drawing/2015/9/8/chartex" xmlns:cx2="http://schemas.microsoft.com/office/drawing/2015/10/21/chartex" xmlns:cx3="http://schemas.microsoft.com/office/drawing/2016/5/9/chartex" xmlns:cx4="http://schemas.microsoft.com/office/drawing/2016/5/10/chartex" xmlns:cx5="http://schemas.microsoft.com/office/drawing/2016/5/11/chartex" xmlns:cx6="http://schemas.microsoft.com/office/drawing/2016/5/12/chartex" xmlns:cx7="http://schemas.microsoft.com/office/drawing/2016/5/13/chartex" xmlns:cx8="http://schemas.microsoft.com/office/drawing/2016/5/14/chartex" xmlns:mc="http://schemas.openxmlformats.org/markup-compatibility/2006" xmlns:aink="http://schemas.microsoft.com/office/drawing/2016/ink" xmlns:am3d="http://schemas.microsoft.com/office/drawing/2017/model3d" xmlns:o="urn:schemas-microsoft-com:office:office" xmlns:oel="http://schemas.microsoft.com/office/2019/extlst" xmlns:r="http://schemas.openxmlformats.org/officeDocument/2006/relationships" xmlns:m="http://schemas.openxmlformats.org/officeDocument/2006/math" xmlns:v="urn:schemas-microsoft-com:vml" xmlns:wp14="http://schemas.microsoft.com/office/word/2010/wordprocessingDrawing" xmlns:wp="http://schemas.openxmlformats.org/drawingml/2006/wordprocessingDrawing" xmlns:w10="urn:schemas-microsoft-com:office:word" xmlns:w="http://schemas.openxmlformats.org/wordprocessingml/2006/main" xmlns:w14="http://schemas.microsoft.com/office/word/2010/wordml" xmlns:w15="http://schemas.microsoft.com/office/word/2012/wordml" xmlns:w16cex="http://schemas.microsoft.com/office/word/2018/wordml/cex" xmlns:w16cid="http://schemas.microsoft.com/office/word/2016/wordml/cid" xmlns:w16="http://schemas.microsoft.com/office/word/2018/wordml" xmlns:w16du="http://schemas.microsoft.com/office/word/2023/wordml/word16du" xmlns:w16sdtdh="http://schemas.microsoft.com/office/word/2020/wordml/sdtdatahash" xmlns:w16sdtfl="http://schemas.microsoft.com/office/word/2024/wordml/sdtformatlock" xmlns:w16se="http://schemas.microsoft.com/office/word/2015/wordml/symex" xmlns:wpg="http://schemas.microsoft.com/office/word/2010/wordprocessingGroup" xmlns:wpi="http://schemas.microsoft.com/office/word/2010/wordprocessingInk" xmlns:wne="http://schemas.microsoft.com/office/word/2006/wordml" xmlns:wps="http://schemas.microsoft.com/office/word/2010/wordprocessingShape" mc:Ignorable="w14 w15 w16se w16cid w16 w16cex w16sdtdh w16sdtfl w16du wp14">
   <w:endnote w:type="separator" w:id="-1">
@@ -5073,26 +3911,6 @@
 </file>
 
 <file path=word/footer1.xml><?xml version="1.0" encoding="utf-8"?>
-<w:ftr xmlns:wpc="http://schemas.microsoft.com/office/word/2010/wordprocessingCanvas" xmlns:cx="http://schemas.microsoft.com/office/drawing/2014/chartex" xmlns:cx1="http://schemas.microsoft.com/office/drawing/2015/9/8/chartex" xmlns:cx2="http://schemas.microsoft.com/office/drawing/2015/10/21/chartex" xmlns:cx3="http://schemas.microsoft.com/office/drawing/2016/5/9/chartex" xmlns:cx4="http://schemas.microsoft.com/office/drawing/2016/5/10/chartex" xmlns:cx5="http://schemas.microsoft.com/office/drawing/2016/5/11/chartex" xmlns:cx6="http://schemas.microsoft.com/office/drawing/2016/5/12/chartex" xmlns:cx7="http://schemas.microsoft.com/office/drawing/2016/5/13/chartex" xmlns:cx8="http://schemas.microsoft.com/office/drawing/2016/5/14/chartex" xmlns:mc="http://schemas.openxmlformats.org/markup-compatibility/2006" xmlns:aink="http://schemas.microsoft.com/office/drawing/2016/ink" xmlns:am3d="http://schemas.microsoft.com/office/drawing/2017/model3d" xmlns:o="urn:schemas-microsoft-com:office:office" xmlns:oel="http://schemas.microsoft.com/office/2019/extlst" xmlns:r="http://schemas.openxmlformats.org/officeDocument/2006/relationships" xmlns:m="http://schemas.openxmlformats.org/officeDocument/2006/math" xmlns:v="urn:schemas-microsoft-com:vml" xmlns:wp14="http://schemas.microsoft.com/office/word/2010/wordprocessingDrawing" xmlns:wp="http://schemas.openxmlformats.org/drawingml/2006/wordprocessingDrawing" xmlns:w10="urn:schemas-microsoft-com:office:word" xmlns:w="http://schemas.openxmlformats.org/wordprocessingml/2006/main" xmlns:w14="http://schemas.microsoft.com/office/word/2010/wordml" xmlns:w15="http://schemas.microsoft.com/office/word/2012/wordml" xmlns:w16cex="http://schemas.microsoft.com/office/word/2018/wordml/cex" xmlns:w16cid="http://schemas.microsoft.com/office/word/2016/wordml/cid" xmlns:w16="http://schemas.microsoft.com/office/word/2018/wordml" xmlns:w16du="http://schemas.microsoft.com/office/word/2023/wordml/word16du" xmlns:w16sdtdh="http://schemas.microsoft.com/office/word/2020/wordml/sdtdatahash" xmlns:w16sdtfl="http://schemas.microsoft.com/office/word/2024/wordml/sdtformatlock" xmlns:w16se="http://schemas.microsoft.com/office/word/2015/wordml/symex" xmlns:wpg="http://schemas.microsoft.com/office/word/2010/wordprocessingGroup" xmlns:wpi="http://schemas.microsoft.com/office/word/2010/wordprocessingInk" xmlns:wne="http://schemas.microsoft.com/office/word/2006/wordml" xmlns:wps="http://schemas.microsoft.com/office/word/2010/wordprocessingShape" mc:Ignorable="w14 w15 w16se w16cid w16 w16cex w16sdtdh w16sdtfl w16du wp14">
-  <w:p>
-    <w:pPr>
-      <w:pStyle w:val="Footer"/>
-    </w:pPr>
-  </w:p>
-</w:ftr>
-</file>
-
-<file path=word/footer2.xml><?xml version="1.0" encoding="utf-8"?>
-<w:ftr xmlns:wpc="http://schemas.microsoft.com/office/word/2010/wordprocessingCanvas" xmlns:cx="http://schemas.microsoft.com/office/drawing/2014/chartex" xmlns:cx1="http://schemas.microsoft.com/office/drawing/2015/9/8/chartex" xmlns:cx2="http://schemas.microsoft.com/office/drawing/2015/10/21/chartex" xmlns:cx3="http://schemas.microsoft.com/office/drawing/2016/5/9/chartex" xmlns:cx4="http://schemas.microsoft.com/office/drawing/2016/5/10/chartex" xmlns:cx5="http://schemas.microsoft.com/office/drawing/2016/5/11/chartex" xmlns:cx6="http://schemas.microsoft.com/office/drawing/2016/5/12/chartex" xmlns:cx7="http://schemas.microsoft.com/office/drawing/2016/5/13/chartex" xmlns:cx8="http://schemas.microsoft.com/office/drawing/2016/5/14/chartex" xmlns:mc="http://schemas.openxmlformats.org/markup-compatibility/2006" xmlns:aink="http://schemas.microsoft.com/office/drawing/2016/ink" xmlns:am3d="http://schemas.microsoft.com/office/drawing/2017/model3d" xmlns:o="urn:schemas-microsoft-com:office:office" xmlns:oel="http://schemas.microsoft.com/office/2019/extlst" xmlns:r="http://schemas.openxmlformats.org/officeDocument/2006/relationships" xmlns:m="http://schemas.openxmlformats.org/officeDocument/2006/math" xmlns:v="urn:schemas-microsoft-com:vml" xmlns:wp14="http://schemas.microsoft.com/office/word/2010/wordprocessingDrawing" xmlns:wp="http://schemas.openxmlformats.org/drawingml/2006/wordprocessingDrawing" xmlns:w10="urn:schemas-microsoft-com:office:word" xmlns:w="http://schemas.openxmlformats.org/wordprocessingml/2006/main" xmlns:w14="http://schemas.microsoft.com/office/word/2010/wordml" xmlns:w15="http://schemas.microsoft.com/office/word/2012/wordml" xmlns:w16cex="http://schemas.microsoft.com/office/word/2018/wordml/cex" xmlns:w16cid="http://schemas.microsoft.com/office/word/2016/wordml/cid" xmlns:w16="http://schemas.microsoft.com/office/word/2018/wordml" xmlns:w16du="http://schemas.microsoft.com/office/word/2023/wordml/word16du" xmlns:w16sdtdh="http://schemas.microsoft.com/office/word/2020/wordml/sdtdatahash" xmlns:w16sdtfl="http://schemas.microsoft.com/office/word/2024/wordml/sdtformatlock" xmlns:w16se="http://schemas.microsoft.com/office/word/2015/wordml/symex" xmlns:wpg="http://schemas.microsoft.com/office/word/2010/wordprocessingGroup" xmlns:wpi="http://schemas.microsoft.com/office/word/2010/wordprocessingInk" xmlns:wne="http://schemas.microsoft.com/office/word/2006/wordml" xmlns:wps="http://schemas.microsoft.com/office/word/2010/wordprocessingShape" mc:Ignorable="w14 w15 w16se w16cid w16 w16cex w16sdtdh w16sdtfl w16du wp14">
-  <w:p>
-    <w:pPr>
-      <w:pStyle w:val="Footer"/>
-    </w:pPr>
-  </w:p>
-</w:ftr>
-</file>
-
-<file path=word/footer3.xml><?xml version="1.0" encoding="utf-8"?>
 <w:ftr xmlns:wpc="http://schemas.microsoft.com/office/word/2010/wordprocessingCanvas" xmlns:cx="http://schemas.microsoft.com/office/drawing/2014/chartex" xmlns:cx1="http://schemas.microsoft.com/office/drawing/2015/9/8/chartex" xmlns:cx2="http://schemas.microsoft.com/office/drawing/2015/10/21/chartex" xmlns:cx3="http://schemas.microsoft.com/office/drawing/2016/5/9/chartex" xmlns:cx4="http://schemas.microsoft.com/office/drawing/2016/5/10/chartex" xmlns:cx5="http://schemas.microsoft.com/office/drawing/2016/5/11/chartex" xmlns:cx6="http://schemas.microsoft.com/office/drawing/2016/5/12/chartex" xmlns:cx7="http://schemas.microsoft.com/office/drawing/2016/5/13/chartex" xmlns:cx8="http://schemas.microsoft.com/office/drawing/2016/5/14/chartex" xmlns:mc="http://schemas.openxmlformats.org/markup-compatibility/2006" xmlns:aink="http://schemas.microsoft.com/office/drawing/2016/ink" xmlns:am3d="http://schemas.microsoft.com/office/drawing/2017/model3d" xmlns:o="urn:schemas-microsoft-com:office:office" xmlns:oel="http://schemas.microsoft.com/office/2019/extlst" xmlns:r="http://schemas.openxmlformats.org/officeDocument/2006/relationships" xmlns:m="http://schemas.openxmlformats.org/officeDocument/2006/math" xmlns:v="urn:schemas-microsoft-com:vml" xmlns:wp14="http://schemas.microsoft.com/office/word/2010/wordprocessingDrawing" xmlns:wp="http://schemas.openxmlformats.org/drawingml/2006/wordprocessingDrawing" xmlns:w10="urn:schemas-microsoft-com:office:word" xmlns:w="http://schemas.openxmlformats.org/wordprocessingml/2006/main" xmlns:w14="http://schemas.microsoft.com/office/word/2010/wordml" xmlns:w15="http://schemas.microsoft.com/office/word/2012/wordml" xmlns:w16cex="http://schemas.microsoft.com/office/word/2018/wordml/cex" xmlns:w16cid="http://schemas.microsoft.com/office/word/2016/wordml/cid" xmlns:w16="http://schemas.microsoft.com/office/word/2018/wordml" xmlns:w16du="http://schemas.microsoft.com/office/word/2023/wordml/word16du" xmlns:w16sdtdh="http://schemas.microsoft.com/office/word/2020/wordml/sdtdatahash" xmlns:w16sdtfl="http://schemas.microsoft.com/office/word/2024/wordml/sdtformatlock" xmlns:w16se="http://schemas.microsoft.com/office/word/2015/wordml/symex" xmlns:wpg="http://schemas.microsoft.com/office/word/2010/wordprocessingGroup" xmlns:wpi="http://schemas.microsoft.com/office/word/2010/wordprocessingInk" xmlns:wne="http://schemas.microsoft.com/office/word/2006/wordml" xmlns:wps="http://schemas.microsoft.com/office/word/2010/wordprocessingShape" mc:Ignorable="w14 w15 w16se w16cid w16 w16cex w16sdtdh w16sdtfl w16du wp14">
   <w:p>
     <w:pPr>
@@ -5191,16 +4009,6 @@
 <w:hdr xmlns:wpc="http://schemas.microsoft.com/office/word/2010/wordprocessingCanvas" xmlns:cx="http://schemas.microsoft.com/office/drawing/2014/chartex" xmlns:cx1="http://schemas.microsoft.com/office/drawing/2015/9/8/chartex" xmlns:cx2="http://schemas.microsoft.com/office/drawing/2015/10/21/chartex" xmlns:cx3="http://schemas.microsoft.com/office/drawing/2016/5/9/chartex" xmlns:cx4="http://schemas.microsoft.com/office/drawing/2016/5/10/chartex" xmlns:cx5="http://schemas.microsoft.com/office/drawing/2016/5/11/chartex" xmlns:cx6="http://schemas.microsoft.com/office/drawing/2016/5/12/chartex" xmlns:cx7="http://schemas.microsoft.com/office/drawing/2016/5/13/chartex" xmlns:cx8="http://schemas.microsoft.com/office/drawing/2016/5/14/chartex" xmlns:mc="http://schemas.openxmlformats.org/markup-compatibility/2006" xmlns:aink="http://schemas.microsoft.com/office/drawing/2016/ink" xmlns:am3d="http://schemas.microsoft.com/office/drawing/2017/model3d" xmlns:o="urn:schemas-microsoft-com:office:office" xmlns:oel="http://schemas.microsoft.com/office/2019/extlst" xmlns:r="http://schemas.openxmlformats.org/officeDocument/2006/relationships" xmlns:m="http://schemas.openxmlformats.org/officeDocument/2006/math" xmlns:v="urn:schemas-microsoft-com:vml" xmlns:wp14="http://schemas.microsoft.com/office/word/2010/wordprocessingDrawing" xmlns:wp="http://schemas.openxmlformats.org/drawingml/2006/wordprocessingDrawing" xmlns:w10="urn:schemas-microsoft-com:office:word" xmlns:w="http://schemas.openxmlformats.org/wordprocessingml/2006/main" xmlns:w14="http://schemas.microsoft.com/office/word/2010/wordml" xmlns:w15="http://schemas.microsoft.com/office/word/2012/wordml" xmlns:w16cex="http://schemas.microsoft.com/office/word/2018/wordml/cex" xmlns:w16cid="http://schemas.microsoft.com/office/word/2016/wordml/cid" xmlns:w16="http://schemas.microsoft.com/office/word/2018/wordml" xmlns:w16du="http://schemas.microsoft.com/office/word/2023/wordml/word16du" xmlns:w16sdtdh="http://schemas.microsoft.com/office/word/2020/wordml/sdtdatahash" xmlns:w16sdtfl="http://schemas.microsoft.com/office/word/2024/wordml/sdtformatlock" xmlns:w16se="http://schemas.microsoft.com/office/word/2015/wordml/symex" xmlns:wpg="http://schemas.microsoft.com/office/word/2010/wordprocessingGroup" xmlns:wpi="http://schemas.microsoft.com/office/word/2010/wordprocessingInk" xmlns:wne="http://schemas.microsoft.com/office/word/2006/wordml" xmlns:wps="http://schemas.microsoft.com/office/word/2010/wordprocessingShape" mc:Ignorable="w14 w15 w16se w16cid w16 w16cex w16sdtdh w16sdtfl w16du wp14">
   <w:p>
     <w:pPr>
-      <w:pStyle w:val="Header"/>
-    </w:pPr>
-  </w:p>
-</w:hdr>
-</file>
-
-<file path=word/header2.xml><?xml version="1.0" encoding="utf-8"?>
-<w:hdr xmlns:wpc="http://schemas.microsoft.com/office/word/2010/wordprocessingCanvas" xmlns:cx="http://schemas.microsoft.com/office/drawing/2014/chartex" xmlns:cx1="http://schemas.microsoft.com/office/drawing/2015/9/8/chartex" xmlns:cx2="http://schemas.microsoft.com/office/drawing/2015/10/21/chartex" xmlns:cx3="http://schemas.microsoft.com/office/drawing/2016/5/9/chartex" xmlns:cx4="http://schemas.microsoft.com/office/drawing/2016/5/10/chartex" xmlns:cx5="http://schemas.microsoft.com/office/drawing/2016/5/11/chartex" xmlns:cx6="http://schemas.microsoft.com/office/drawing/2016/5/12/chartex" xmlns:cx7="http://schemas.microsoft.com/office/drawing/2016/5/13/chartex" xmlns:cx8="http://schemas.microsoft.com/office/drawing/2016/5/14/chartex" xmlns:mc="http://schemas.openxmlformats.org/markup-compatibility/2006" xmlns:aink="http://schemas.microsoft.com/office/drawing/2016/ink" xmlns:am3d="http://schemas.microsoft.com/office/drawing/2017/model3d" xmlns:o="urn:schemas-microsoft-com:office:office" xmlns:oel="http://schemas.microsoft.com/office/2019/extlst" xmlns:r="http://schemas.openxmlformats.org/officeDocument/2006/relationships" xmlns:m="http://schemas.openxmlformats.org/officeDocument/2006/math" xmlns:v="urn:schemas-microsoft-com:vml" xmlns:wp14="http://schemas.microsoft.com/office/word/2010/wordprocessingDrawing" xmlns:wp="http://schemas.openxmlformats.org/drawingml/2006/wordprocessingDrawing" xmlns:w10="urn:schemas-microsoft-com:office:word" xmlns:w="http://schemas.openxmlformats.org/wordprocessingml/2006/main" xmlns:w14="http://schemas.microsoft.com/office/word/2010/wordml" xmlns:w15="http://schemas.microsoft.com/office/word/2012/wordml" xmlns:w16cex="http://schemas.microsoft.com/office/word/2018/wordml/cex" xmlns:w16cid="http://schemas.microsoft.com/office/word/2016/wordml/cid" xmlns:w16="http://schemas.microsoft.com/office/word/2018/wordml" xmlns:w16du="http://schemas.microsoft.com/office/word/2023/wordml/word16du" xmlns:w16sdtdh="http://schemas.microsoft.com/office/word/2020/wordml/sdtdatahash" xmlns:w16sdtfl="http://schemas.microsoft.com/office/word/2024/wordml/sdtformatlock" xmlns:w16se="http://schemas.microsoft.com/office/word/2015/wordml/symex" xmlns:wpg="http://schemas.microsoft.com/office/word/2010/wordprocessingGroup" xmlns:wpi="http://schemas.microsoft.com/office/word/2010/wordprocessingInk" xmlns:wne="http://schemas.microsoft.com/office/word/2006/wordml" xmlns:wps="http://schemas.microsoft.com/office/word/2010/wordprocessingShape" mc:Ignorable="w14 w15 w16se w16cid w16 w16cex w16sdtdh w16sdtfl w16du wp14">
-  <w:p>
-    <w:pPr>
       <w:tabs>
         <w:tab w:val="center" w:pos="4320"/>
         <w:tab w:val="right" w:pos="8640"/>
@@ -5219,7 +4027,7 @@
         <w:szCs w:val="24"/>
         <w:highlight w:val="yellow"/>
       </w:rPr>
-      <w:fldChar w:fldCharType="begin"/>
+      <w:t>[[</w:t>
     </w:r>
     <w:r>
       <w:rPr>
@@ -5228,7 +4036,7 @@
         <w:szCs w:val="24"/>
         <w:highlight w:val="yellow"/>
       </w:rPr>
-      <w:instrText xml:space="preserve"> DOCVARIABLE "zapLink¦2!1!AttorneySalutation" </w:instrText>
+      <w:t>attorney_salutation_with_name_full</w:t>
     </w:r>
     <w:r>
       <w:rPr>
@@ -5237,124 +4045,7 @@
         <w:szCs w:val="24"/>
         <w:highlight w:val="yellow"/>
       </w:rPr>
-      <w:fldChar w:fldCharType="separate"/>
-    </w:r>
-    <w:r>
-      <w:rPr>
-        <w:rFonts w:ascii="Times New Roman" w:eastAsia="Times New Roman" w:hAnsi="Times New Roman" w:cs="Times New Roman"/>
-        <w:sz w:val="24"/>
-        <w:szCs w:val="24"/>
-        <w:highlight w:val="yellow"/>
-      </w:rPr>
-      <w:t xml:space="preserve">Mr. </w:t>
-    </w:r>
-    <w:r>
-      <w:rPr>
-        <w:rFonts w:ascii="Times New Roman" w:eastAsia="Times New Roman" w:hAnsi="Times New Roman" w:cs="Times New Roman"/>
-        <w:sz w:val="24"/>
-        <w:szCs w:val="24"/>
-        <w:highlight w:val="yellow"/>
-      </w:rPr>
-      <w:fldChar w:fldCharType="end"/>
-    </w:r>
-    <w:r>
-      <w:rPr>
-        <w:rFonts w:ascii="Times New Roman" w:eastAsia="Times New Roman" w:hAnsi="Times New Roman" w:cs="Times New Roman"/>
-        <w:sz w:val="24"/>
-        <w:szCs w:val="24"/>
-        <w:highlight w:val="yellow"/>
-      </w:rPr>
-      <w:fldChar w:fldCharType="begin"/>
-    </w:r>
-    <w:r>
-      <w:rPr>
-        <w:rFonts w:ascii="Times New Roman" w:eastAsia="Times New Roman" w:hAnsi="Times New Roman" w:cs="Times New Roman"/>
-        <w:sz w:val="24"/>
-        <w:szCs w:val="24"/>
-        <w:highlight w:val="yellow"/>
-      </w:rPr>
-      <w:instrText xml:space="preserve"> DOCVARIABLE "zapLink¦2!1!Attorney_First_Name" </w:instrText>
-    </w:r>
-    <w:r>
-      <w:rPr>
-        <w:rFonts w:ascii="Times New Roman" w:eastAsia="Times New Roman" w:hAnsi="Times New Roman" w:cs="Times New Roman"/>
-        <w:sz w:val="24"/>
-        <w:szCs w:val="24"/>
-        <w:highlight w:val="yellow"/>
-      </w:rPr>
-      <w:fldChar w:fldCharType="separate"/>
-    </w:r>
-    <w:r>
-      <w:rPr>
-        <w:rFonts w:ascii="Times New Roman" w:eastAsia="Times New Roman" w:hAnsi="Times New Roman" w:cs="Times New Roman"/>
-        <w:sz w:val="24"/>
-        <w:szCs w:val="24"/>
-        <w:highlight w:val="yellow"/>
-      </w:rPr>
-      <w:t>William</w:t>
-    </w:r>
-    <w:r>
-      <w:rPr>
-        <w:rFonts w:ascii="Times New Roman" w:eastAsia="Times New Roman" w:hAnsi="Times New Roman" w:cs="Times New Roman"/>
-        <w:sz w:val="24"/>
-        <w:szCs w:val="24"/>
-        <w:highlight w:val="yellow"/>
-      </w:rPr>
-      <w:fldChar w:fldCharType="end"/>
-    </w:r>
-    <w:r>
-      <w:rPr>
-        <w:rFonts w:ascii="Times New Roman" w:eastAsia="Times New Roman" w:hAnsi="Times New Roman" w:cs="Times New Roman"/>
-        <w:sz w:val="24"/>
-        <w:szCs w:val="24"/>
-        <w:highlight w:val="yellow"/>
-      </w:rPr>
-      <w:t xml:space="preserve"> </w:t>
-    </w:r>
-    <w:r>
-      <w:rPr>
-        <w:rFonts w:ascii="Times New Roman" w:eastAsia="Times New Roman" w:hAnsi="Times New Roman" w:cs="Times New Roman"/>
-        <w:sz w:val="24"/>
-        <w:szCs w:val="24"/>
-        <w:highlight w:val="yellow"/>
-      </w:rPr>
-      <w:fldChar w:fldCharType="begin"/>
-    </w:r>
-    <w:r>
-      <w:rPr>
-        <w:rFonts w:ascii="Times New Roman" w:eastAsia="Times New Roman" w:hAnsi="Times New Roman" w:cs="Times New Roman"/>
-        <w:sz w:val="24"/>
-        <w:szCs w:val="24"/>
-        <w:highlight w:val="yellow"/>
-      </w:rPr>
-      <w:instrText xml:space="preserve"> DOCVARIABLE "zapLink¦2!1!Attorney_Last_Name" </w:instrText>
-    </w:r>
-    <w:r>
-      <w:rPr>
-        <w:rFonts w:ascii="Times New Roman" w:eastAsia="Times New Roman" w:hAnsi="Times New Roman" w:cs="Times New Roman"/>
-        <w:sz w:val="24"/>
-        <w:szCs w:val="24"/>
-        <w:highlight w:val="yellow"/>
-      </w:rPr>
-      <w:fldChar w:fldCharType="separate"/>
-    </w:r>
-    <w:r>
-      <w:rPr>
-        <w:rFonts w:ascii="Times New Roman" w:eastAsia="Times New Roman" w:hAnsi="Times New Roman" w:cs="Times New Roman"/>
-        <w:sz w:val="24"/>
-        <w:szCs w:val="24"/>
-        <w:highlight w:val="yellow"/>
-      </w:rPr>
-      <w:t>Pate</w:t>
-    </w:r>
-    <w:r>
-      <w:rPr>
-        <w:rFonts w:ascii="Times New Roman" w:eastAsia="Times New Roman" w:hAnsi="Times New Roman" w:cs="Times New Roman"/>
-        <w:sz w:val="24"/>
-        <w:szCs w:val="24"/>
-        <w:highlight w:val="yellow"/>
-      </w:rPr>
-      <w:fldChar w:fldCharType="end"/>
+      <w:t>]]</w:t>
     </w:r>
     <w:r>
       <w:rPr>
@@ -5384,7 +4075,7 @@
         <w:sz w:val="24"/>
         <w:szCs w:val="24"/>
       </w:rPr>
-      <w:t xml:space="preserve">Re: </w:t>
+      <w:t>Re:</w:t>
     </w:r>
     <w:r>
       <w:rPr>
@@ -5401,7 +4092,7 @@
         <w:szCs w:val="24"/>
         <w:highlight w:val="yellow"/>
       </w:rPr>
-      <w:fldChar w:fldCharType="begin"/>
+      <w:t>[[</w:t>
     </w:r>
     <w:r>
       <w:rPr>
@@ -5410,7 +4101,7 @@
         <w:szCs w:val="24"/>
         <w:highlight w:val="yellow"/>
       </w:rPr>
-      <w:instrText xml:space="preserve"> DOCVARIABLE "zapLink¦2!1!Claimant_Name_First" </w:instrText>
+      <w:t>claimant_name_full</w:t>
     </w:r>
     <w:r>
       <w:rPr>
@@ -5419,79 +4110,7 @@
         <w:szCs w:val="24"/>
         <w:highlight w:val="yellow"/>
       </w:rPr>
-      <w:fldChar w:fldCharType="separate"/>
-    </w:r>
-    <w:r>
-      <w:rPr>
-        <w:rFonts w:ascii="Times New Roman" w:eastAsia="Times New Roman" w:hAnsi="Times New Roman" w:cs="Times New Roman"/>
-        <w:sz w:val="24"/>
-        <w:szCs w:val="24"/>
-        <w:highlight w:val="yellow"/>
-      </w:rPr>
-      <w:t>Mark</w:t>
-    </w:r>
-    <w:r>
-      <w:rPr>
-        <w:rFonts w:ascii="Times New Roman" w:eastAsia="Times New Roman" w:hAnsi="Times New Roman" w:cs="Times New Roman"/>
-        <w:sz w:val="24"/>
-        <w:szCs w:val="24"/>
-        <w:highlight w:val="yellow"/>
-      </w:rPr>
-      <w:fldChar w:fldCharType="end"/>
-    </w:r>
-    <w:r>
-      <w:rPr>
-        <w:rFonts w:ascii="Times New Roman" w:eastAsia="Times New Roman" w:hAnsi="Times New Roman" w:cs="Times New Roman"/>
-        <w:sz w:val="24"/>
-        <w:szCs w:val="24"/>
-        <w:highlight w:val="yellow"/>
-      </w:rPr>
-      <w:t xml:space="preserve"> </w:t>
-    </w:r>
-    <w:r>
-      <w:rPr>
-        <w:rFonts w:ascii="Times New Roman" w:eastAsia="Times New Roman" w:hAnsi="Times New Roman" w:cs="Times New Roman"/>
-        <w:sz w:val="24"/>
-        <w:szCs w:val="24"/>
-        <w:highlight w:val="yellow"/>
-      </w:rPr>
-      <w:fldChar w:fldCharType="begin"/>
-    </w:r>
-    <w:r>
-      <w:rPr>
-        <w:rFonts w:ascii="Times New Roman" w:eastAsia="Times New Roman" w:hAnsi="Times New Roman" w:cs="Times New Roman"/>
-        <w:sz w:val="24"/>
-        <w:szCs w:val="24"/>
-        <w:highlight w:val="yellow"/>
-      </w:rPr>
-      <w:instrText xml:space="preserve"> DOCVARIABLE "zapLink¦2!1!Client_Name_Last" </w:instrText>
-    </w:r>
-    <w:r>
-      <w:rPr>
-        <w:rFonts w:ascii="Times New Roman" w:eastAsia="Times New Roman" w:hAnsi="Times New Roman" w:cs="Times New Roman"/>
-        <w:sz w:val="24"/>
-        <w:szCs w:val="24"/>
-        <w:highlight w:val="yellow"/>
-      </w:rPr>
-      <w:fldChar w:fldCharType="separate"/>
-    </w:r>
-    <w:r>
-      <w:rPr>
-        <w:rFonts w:ascii="Times New Roman" w:eastAsia="Times New Roman" w:hAnsi="Times New Roman" w:cs="Times New Roman"/>
-        <w:sz w:val="24"/>
-        <w:szCs w:val="24"/>
-        <w:highlight w:val="yellow"/>
-      </w:rPr>
-      <w:t>Dunkley</w:t>
-    </w:r>
-    <w:r>
-      <w:rPr>
-        <w:rFonts w:ascii="Times New Roman" w:eastAsia="Times New Roman" w:hAnsi="Times New Roman" w:cs="Times New Roman"/>
-        <w:sz w:val="24"/>
-        <w:szCs w:val="24"/>
-        <w:highlight w:val="yellow"/>
-      </w:rPr>
-      <w:fldChar w:fldCharType="end"/>
+      <w:t>]]</w:t>
     </w:r>
   </w:p>
   <w:p>
@@ -5564,7 +4183,7 @@
 </w:hdr>
 </file>
 
-<file path=word/header3.xml><?xml version="1.0" encoding="utf-8"?>
+<file path=word/header2.xml><?xml version="1.0" encoding="utf-8"?>
 <w:hdr xmlns:wpc="http://schemas.microsoft.com/office/word/2010/wordprocessingCanvas" xmlns:cx="http://schemas.microsoft.com/office/drawing/2014/chartex" xmlns:cx1="http://schemas.microsoft.com/office/drawing/2015/9/8/chartex" xmlns:cx2="http://schemas.microsoft.com/office/drawing/2015/10/21/chartex" xmlns:cx3="http://schemas.microsoft.com/office/drawing/2016/5/9/chartex" xmlns:cx4="http://schemas.microsoft.com/office/drawing/2016/5/10/chartex" xmlns:cx5="http://schemas.microsoft.com/office/drawing/2016/5/11/chartex" xmlns:cx6="http://schemas.microsoft.com/office/drawing/2016/5/12/chartex" xmlns:cx7="http://schemas.microsoft.com/office/drawing/2016/5/13/chartex" xmlns:cx8="http://schemas.microsoft.com/office/drawing/2016/5/14/chartex" xmlns:mc="http://schemas.openxmlformats.org/markup-compatibility/2006" xmlns:aink="http://schemas.microsoft.com/office/drawing/2016/ink" xmlns:am3d="http://schemas.microsoft.com/office/drawing/2017/model3d" xmlns:o="urn:schemas-microsoft-com:office:office" xmlns:oel="http://schemas.microsoft.com/office/2019/extlst" xmlns:r="http://schemas.openxmlformats.org/officeDocument/2006/relationships" xmlns:m="http://schemas.openxmlformats.org/officeDocument/2006/math" xmlns:v="urn:schemas-microsoft-com:vml" xmlns:wp14="http://schemas.microsoft.com/office/word/2010/wordprocessingDrawing" xmlns:wp="http://schemas.openxmlformats.org/drawingml/2006/wordprocessingDrawing" xmlns:w10="urn:schemas-microsoft-com:office:word" xmlns:w="http://schemas.openxmlformats.org/wordprocessingml/2006/main" xmlns:w14="http://schemas.microsoft.com/office/word/2010/wordml" xmlns:w15="http://schemas.microsoft.com/office/word/2012/wordml" xmlns:w16cex="http://schemas.microsoft.com/office/word/2018/wordml/cex" xmlns:w16cid="http://schemas.microsoft.com/office/word/2016/wordml/cid" xmlns:w16="http://schemas.microsoft.com/office/word/2018/wordml" xmlns:w16du="http://schemas.microsoft.com/office/word/2023/wordml/word16du" xmlns:w16sdtdh="http://schemas.microsoft.com/office/word/2020/wordml/sdtdatahash" xmlns:w16sdtfl="http://schemas.microsoft.com/office/word/2024/wordml/sdtformatlock" xmlns:w16se="http://schemas.microsoft.com/office/word/2015/wordml/symex" xmlns:wpg="http://schemas.microsoft.com/office/word/2010/wordprocessingGroup" xmlns:wpi="http://schemas.microsoft.com/office/word/2010/wordprocessingInk" xmlns:wne="http://schemas.microsoft.com/office/word/2006/wordml" xmlns:wps="http://schemas.microsoft.com/office/word/2010/wordprocessingShape" mc:Ignorable="w14 w15 w16se w16cid w16 w16cex w16sdtdh w16sdtfl w16du wp14">
   <w:p>
     <w:pPr>
@@ -5688,12 +4307,12 @@
       </w:rPr>
       <w:tab/>
     </w:r>
-    <w:bookmarkStart w:id="2" w:name="_Hlk43130415"/>
-    <w:bookmarkStart w:id="3" w:name="_Hlk43130416"/>
-    <w:bookmarkStart w:id="4" w:name="_Hlk43820416"/>
-    <w:bookmarkStart w:id="5" w:name="_Hlk43820417"/>
-    <w:bookmarkStart w:id="6" w:name="_Hlk51061012"/>
-    <w:bookmarkStart w:id="7" w:name="_Hlk51061013"/>
+    <w:bookmarkStart w:id="3" w:name="_Hlk43130415"/>
+    <w:bookmarkStart w:id="4" w:name="_Hlk43130416"/>
+    <w:bookmarkStart w:id="5" w:name="_Hlk43820416"/>
+    <w:bookmarkStart w:id="6" w:name="_Hlk43820417"/>
+    <w:bookmarkStart w:id="7" w:name="_Hlk51061012"/>
+    <w:bookmarkStart w:id="8" w:name="_Hlk51061013"/>
     <w:r>
       <w:rPr>
         <w:rFonts w:ascii="Bitter" w:hAnsi="Bitter"/>
@@ -5847,12 +4466,12 @@
       <w:t>500.2808</w:t>
     </w:r>
   </w:p>
-  <w:bookmarkEnd w:id="2"/>
   <w:bookmarkEnd w:id="3"/>
   <w:bookmarkEnd w:id="4"/>
   <w:bookmarkEnd w:id="5"/>
   <w:bookmarkEnd w:id="6"/>
   <w:bookmarkEnd w:id="7"/>
+  <w:bookmarkEnd w:id="8"/>
   <w:p>
     <w:pPr>
       <w:pStyle w:val="Header"/>
@@ -6296,6 +4915,14 @@
     <w:abstractNumId w:val="2"/>
   </w:num>
 </w:numbering>
+</file>
+
+<file path=word/people.xml><?xml version="1.0" encoding="utf-8"?>
+<w15:people xmlns:wpc="http://schemas.microsoft.com/office/word/2010/wordprocessingCanvas" xmlns:cx="http://schemas.microsoft.com/office/drawing/2014/chartex" xmlns:cx1="http://schemas.microsoft.com/office/drawing/2015/9/8/chartex" xmlns:cx2="http://schemas.microsoft.com/office/drawing/2015/10/21/chartex" xmlns:cx3="http://schemas.microsoft.com/office/drawing/2016/5/9/chartex" xmlns:cx4="http://schemas.microsoft.com/office/drawing/2016/5/10/chartex" xmlns:cx5="http://schemas.microsoft.com/office/drawing/2016/5/11/chartex" xmlns:cx6="http://schemas.microsoft.com/office/drawing/2016/5/12/chartex" xmlns:cx7="http://schemas.microsoft.com/office/drawing/2016/5/13/chartex" xmlns:cx8="http://schemas.microsoft.com/office/drawing/2016/5/14/chartex" xmlns:mc="http://schemas.openxmlformats.org/markup-compatibility/2006" xmlns:aink="http://schemas.microsoft.com/office/drawing/2016/ink" xmlns:am3d="http://schemas.microsoft.com/office/drawing/2017/model3d" xmlns:o="urn:schemas-microsoft-com:office:office" xmlns:oel="http://schemas.microsoft.com/office/2019/extlst" xmlns:r="http://schemas.openxmlformats.org/officeDocument/2006/relationships" xmlns:m="http://schemas.openxmlformats.org/officeDocument/2006/math" xmlns:v="urn:schemas-microsoft-com:vml" xmlns:wp14="http://schemas.microsoft.com/office/word/2010/wordprocessingDrawing" xmlns:wp="http://schemas.openxmlformats.org/drawingml/2006/wordprocessingDrawing" xmlns:w10="urn:schemas-microsoft-com:office:word" xmlns:w="http://schemas.openxmlformats.org/wordprocessingml/2006/main" xmlns:w14="http://schemas.microsoft.com/office/word/2010/wordml" xmlns:w15="http://schemas.microsoft.com/office/word/2012/wordml" xmlns:w16cex="http://schemas.microsoft.com/office/word/2018/wordml/cex" xmlns:w16cid="http://schemas.microsoft.com/office/word/2016/wordml/cid" xmlns:w16="http://schemas.microsoft.com/office/word/2018/wordml" xmlns:w16du="http://schemas.microsoft.com/office/word/2023/wordml/word16du" xmlns:w16sdtdh="http://schemas.microsoft.com/office/word/2020/wordml/sdtdatahash" xmlns:w16sdtfl="http://schemas.microsoft.com/office/word/2024/wordml/sdtformatlock" xmlns:w16se="http://schemas.microsoft.com/office/word/2015/wordml/symex" xmlns:wpg="http://schemas.microsoft.com/office/word/2010/wordprocessingGroup" xmlns:wpi="http://schemas.microsoft.com/office/word/2010/wordprocessingInk" xmlns:wne="http://schemas.microsoft.com/office/word/2006/wordml" xmlns:wps="http://schemas.microsoft.com/office/word/2010/wordprocessingShape" mc:Ignorable="w14 w15 w16se w16cid w16 w16cex w16sdtdh w16sdtfl w16du wp14">
+  <w15:person w15:author="Eric Bussey">
+    <w15:presenceInfo w15:providerId="AD" w15:userId="S::ebussey@stokes-associates.com::17d037d4-636b-48f5-9fa0-15b0feea31b5"/>
+  </w15:person>
+</w15:people>
 </file>
 
 <file path=word/styles.xml><?xml version="1.0" encoding="utf-8"?>
@@ -6886,6 +5513,72 @@
       <w:contextualSpacing/>
     </w:pPr>
   </w:style>
+  <w:style w:type="character" w:styleId="CommentReference">
+    <w:name w:val="annotation reference"/>
+    <w:basedOn w:val="DefaultParagraphFont"/>
+    <w:uiPriority w:val="99"/>
+    <w:semiHidden/>
+    <w:unhideWhenUsed/>
+    <w:rsid w:val="00C53A4B"/>
+    <w:rPr>
+      <w:sz w:val="16"/>
+      <w:szCs w:val="16"/>
+    </w:rPr>
+  </w:style>
+  <w:style w:type="paragraph" w:styleId="CommentText">
+    <w:name w:val="annotation text"/>
+    <w:basedOn w:val="Normal"/>
+    <w:link w:val="CommentTextChar"/>
+    <w:uiPriority w:val="99"/>
+    <w:unhideWhenUsed/>
+    <w:rsid w:val="00C53A4B"/>
+    <w:pPr>
+      <w:spacing w:line="240" w:lineRule="auto"/>
+    </w:pPr>
+    <w:rPr>
+      <w:sz w:val="20"/>
+      <w:szCs w:val="20"/>
+    </w:rPr>
+  </w:style>
+  <w:style w:type="character" w:customStyle="1" w:styleId="CommentTextChar">
+    <w:name w:val="Comment Text Char"/>
+    <w:basedOn w:val="DefaultParagraphFont"/>
+    <w:link w:val="CommentText"/>
+    <w:uiPriority w:val="99"/>
+    <w:rsid w:val="00C53A4B"/>
+    <w:rPr>
+      <w:sz w:val="20"/>
+      <w:szCs w:val="20"/>
+    </w:rPr>
+  </w:style>
+  <w:style w:type="paragraph" w:styleId="CommentSubject">
+    <w:name w:val="annotation subject"/>
+    <w:basedOn w:val="CommentText"/>
+    <w:next w:val="CommentText"/>
+    <w:link w:val="CommentSubjectChar"/>
+    <w:uiPriority w:val="99"/>
+    <w:semiHidden/>
+    <w:unhideWhenUsed/>
+    <w:rsid w:val="00C53A4B"/>
+    <w:rPr>
+      <w:b/>
+      <w:bCs/>
+    </w:rPr>
+  </w:style>
+  <w:style w:type="character" w:customStyle="1" w:styleId="CommentSubjectChar">
+    <w:name w:val="Comment Subject Char"/>
+    <w:basedOn w:val="CommentTextChar"/>
+    <w:link w:val="CommentSubject"/>
+    <w:uiPriority w:val="99"/>
+    <w:semiHidden/>
+    <w:rsid w:val="00C53A4B"/>
+    <w:rPr>
+      <w:b/>
+      <w:bCs/>
+      <w:sz w:val="20"/>
+      <w:szCs w:val="20"/>
+    </w:rPr>
+  </w:style>
 </w:styles>
 </file>
 
@@ -7207,10 +5900,27 @@
 </file>
 
 <file path=customXml/item1.xml><?xml version="1.0" encoding="utf-8"?>
+<?mso-contentType ?>
+<FormTemplates xmlns="http://schemas.microsoft.com/sharepoint/v3/contenttype/forms">
+  <Display>DocumentLibraryForm</Display>
+  <Edit>DocumentLibraryForm</Edit>
+  <New>DocumentLibraryForm</New>
+</FormTemplates>
+</file>
+
+<file path=customXml/item2.xml><?xml version="1.0" encoding="utf-8"?>
+<p:properties xmlns:p="http://schemas.microsoft.com/office/2006/metadata/properties" xmlns:xsi="http://www.w3.org/2001/XMLSchema-instance" xmlns:pc="http://schemas.microsoft.com/office/infopath/2007/PartnerControls">
+  <documentManagement>
+    <_activity xmlns="91172594-76f2-42b4-b6c8-5686d13fb17f" xsi:nil="true"/>
+  </documentManagement>
+</p:properties>
+</file>
+
+<file path=customXml/item3.xml><?xml version="1.0" encoding="utf-8"?>
 <b:Sources xmlns:b="http://schemas.openxmlformats.org/officeDocument/2006/bibliography" xmlns="http://schemas.openxmlformats.org/officeDocument/2006/bibliography" SelectedStyle="\APASixthEditionOfficeOnline.xsl" StyleName="APA" Version="6"/>
 </file>
 
-<file path=customXml/item2.xml><?xml version="1.0" encoding="utf-8"?>
+<file path=customXml/item4.xml><?xml version="1.0" encoding="utf-8"?>
 <ct:contentTypeSchema xmlns:ct="http://schemas.microsoft.com/office/2006/metadata/contentType" xmlns:ma="http://schemas.microsoft.com/office/2006/metadata/properties/metaAttributes" ct:_="" ma:_="" ma:contentTypeName="Document" ma:contentTypeID="0x010100085B5888F14DAE46912A6E0F6FCFCB07" ma:contentTypeVersion="9" ma:contentTypeDescription="Create a new document." ma:contentTypeScope="" ma:versionID="2185b18d6fd5c46c37ca5df071e41de6">
   <xsd:schema xmlns:xsd="http://www.w3.org/2001/XMLSchema" xmlns:xs="http://www.w3.org/2001/XMLSchema" xmlns:p="http://schemas.microsoft.com/office/2006/metadata/properties" xmlns:ns3="91172594-76f2-42b4-b6c8-5686d13fb17f" targetNamespace="http://schemas.microsoft.com/office/2006/metadata/properties" ma:root="true" ma:fieldsID="3ce95284eb097024ce56720a48b923a2" ns3:_="">
     <xsd:import namespace="91172594-76f2-42b4-b6c8-5686d13fb17f"/>
@@ -7386,24 +6096,25 @@
 </ct:contentTypeSchema>
 </file>
 
-<file path=customXml/item3.xml><?xml version="1.0" encoding="utf-8"?>
-<?mso-contentType ?>
-<FormTemplates xmlns="http://schemas.microsoft.com/sharepoint/v3/contenttype/forms">
-  <Display>DocumentLibraryForm</Display>
-  <Edit>DocumentLibraryForm</Edit>
-  <New>DocumentLibraryForm</New>
-</FormTemplates>
+<file path=customXml/itemProps1.xml><?xml version="1.0" encoding="utf-8"?>
+<ds:datastoreItem xmlns:ds="http://schemas.openxmlformats.org/officeDocument/2006/customXml" ds:itemID="{510AB3BD-BC06-4C1C-BE0E-F78D828DF9A1}">
+  <ds:schemaRefs>
+    <ds:schemaRef ds:uri="http://schemas.microsoft.com/sharepoint/v3/contenttype/forms"/>
+  </ds:schemaRefs>
+</ds:datastoreItem>
 </file>
 
-<file path=customXml/item4.xml><?xml version="1.0" encoding="utf-8"?>
-<p:properties xmlns:p="http://schemas.microsoft.com/office/2006/metadata/properties" xmlns:xsi="http://www.w3.org/2001/XMLSchema-instance" xmlns:pc="http://schemas.microsoft.com/office/infopath/2007/PartnerControls">
-  <documentManagement>
-    <_activity xmlns="91172594-76f2-42b4-b6c8-5686d13fb17f" xsi:nil="true"/>
-  </documentManagement>
-</p:properties>
+<file path=customXml/itemProps2.xml><?xml version="1.0" encoding="utf-8"?>
+<ds:datastoreItem xmlns:ds="http://schemas.openxmlformats.org/officeDocument/2006/customXml" ds:itemID="{B4565CB4-100A-4A3D-B4D6-384A4DEF81CB}">
+  <ds:schemaRefs>
+    <ds:schemaRef ds:uri="http://schemas.microsoft.com/office/2006/metadata/properties"/>
+    <ds:schemaRef ds:uri="http://schemas.microsoft.com/office/infopath/2007/PartnerControls"/>
+    <ds:schemaRef ds:uri="91172594-76f2-42b4-b6c8-5686d13fb17f"/>
+  </ds:schemaRefs>
+</ds:datastoreItem>
 </file>
 
-<file path=customXml/itemProps1.xml><?xml version="1.0" encoding="utf-8"?>
+<file path=customXml/itemProps3.xml><?xml version="1.0" encoding="utf-8"?>
 <ds:datastoreItem xmlns:ds="http://schemas.openxmlformats.org/officeDocument/2006/customXml" ds:itemID="{FCC1ACD0-7293-47C9-BE0B-4D879715608C}">
   <ds:schemaRefs>
     <ds:schemaRef ds:uri="http://schemas.openxmlformats.org/officeDocument/2006/bibliography"/>
@@ -7411,7 +6122,7 @@
 </ds:datastoreItem>
 </file>
 
-<file path=customXml/itemProps2.xml><?xml version="1.0" encoding="utf-8"?>
+<file path=customXml/itemProps4.xml><?xml version="1.0" encoding="utf-8"?>
 <ds:datastoreItem xmlns:ds="http://schemas.openxmlformats.org/officeDocument/2006/customXml" ds:itemID="{8A7A12AC-3EA6-42CF-BE43-5DF49F85A7B6}">
   <ds:schemaRefs>
     <ds:schemaRef ds:uri="http://schemas.microsoft.com/office/2006/metadata/contentType"/>
@@ -7427,22 +6138,4 @@
     <ds:schemaRef ds:uri="http://schemas.microsoft.com/internal/obd"/>
   </ds:schemaRefs>
 </ds:datastoreItem>
-</file>
-
-<file path=customXml/itemProps3.xml><?xml version="1.0" encoding="utf-8"?>
-<ds:datastoreItem xmlns:ds="http://schemas.openxmlformats.org/officeDocument/2006/customXml" ds:itemID="{510AB3BD-BC06-4C1C-BE0E-F78D828DF9A1}">
-  <ds:schemaRefs>
-    <ds:schemaRef ds:uri="http://schemas.microsoft.com/sharepoint/v3/contenttype/forms"/>
-  </ds:schemaRefs>
-</ds:datastoreItem>
-</file>
-
-<file path=customXml/itemProps4.xml><?xml version="1.0" encoding="utf-8"?>
-<ds:datastoreItem xmlns:ds="http://schemas.openxmlformats.org/officeDocument/2006/customXml" ds:itemID="{B4565CB4-100A-4A3D-B4D6-384A4DEF81CB}">
-  <ds:schemaRefs>
-    <ds:schemaRef ds:uri="http://schemas.microsoft.com/office/2006/metadata/properties"/>
-    <ds:schemaRef ds:uri="http://schemas.microsoft.com/office/infopath/2007/PartnerControls"/>
-    <ds:schemaRef ds:uri="91172594-76f2-42b4-b6c8-5686d13fb17f"/>
-  </ds:schemaRefs>
-</ds:datastoreItem>
 </file>
</xml_diff>

<commit_message>
ea binary file changes
</commit_message>
<xml_diff>
--- a/EconAutomation/src/supporting_docs/econ_report_templates/LCP_mastertemplate_report_template.docx
+++ b/EconAutomation/src/supporting_docs/econ_report_templates/LCP_mastertemplate_report_template.docx
@@ -51,7 +51,7 @@
           <w:sz w:val="24"/>
           <w:szCs w:val="24"/>
         </w:rPr>
-        <w:t>April 17, 2026</w:t>
+        <w:t>April 20, 2026</w:t>
       </w:r>
       <w:r>
         <w:rPr>
@@ -1372,6 +1372,7 @@
         </w:rPr>
         <w:t xml:space="preserve"> </w:t>
       </w:r>
+      <w:commentRangeStart w:id="0"/>
       <w:r>
         <w:rPr>
           <w:rFonts w:ascii="Times New Roman" w:hAnsi="Times New Roman" w:cs="Times New Roman"/>
@@ -1438,6 +1439,17 @@
           <w:szCs w:val="24"/>
         </w:rPr>
         <w:t>.</w:t>
+      </w:r>
+      <w:commentRangeEnd w:id="0"/>
+      <w:r>
+        <w:rPr>
+          <w:rStyle w:val="CommentReference"/>
+          <w:rFonts w:ascii="Times New Roman" w:hAnsi="Times New Roman" w:cs="Times New Roman"/>
+          <w:sz w:val="24"/>
+          <w:szCs w:val="24"/>
+          <w:highlight w:val="yellow"/>
+        </w:rPr>
+        <w:commentReference w:id="0"/>
       </w:r>
     </w:p>
     <w:p>
@@ -1575,7 +1587,7 @@
         </w:rPr>
         <w:t xml:space="preserve">ve average historic growth rates are calculated for the indicated categories and are applied throughout the analysis. </w:t>
       </w:r>
-      <w:bookmarkStart w:id="0" w:name="_Hlk211350200"/>
+      <w:bookmarkStart w:id="1" w:name="_Hlk211350200"/>
       <w:r>
         <w:rPr>
           <w:rFonts w:ascii="Times New Roman" w:hAnsi="Times New Roman" w:cs="Times New Roman"/>
@@ -1608,7 +1620,7 @@
         </w:rPr>
         <w:t xml:space="preserve">a time period from </w:t>
       </w:r>
-      <w:commentRangeStart w:id="1"/>
+      <w:commentRangeStart w:id="2"/>
       <w:r>
         <w:rPr>
           <w:rFonts w:ascii="Times New Roman" w:hAnsi="Times New Roman" w:cs="Times New Roman"/>
@@ -1627,8 +1639,8 @@
         </w:rPr>
         <w:t xml:space="preserve"> to 2025</w:t>
       </w:r>
-      <w:bookmarkEnd w:id="0"/>
-      <w:commentRangeEnd w:id="1"/>
+      <w:bookmarkEnd w:id="1"/>
+      <w:commentRangeEnd w:id="2"/>
       <w:r>
         <w:rPr>
           <w:rStyle w:val="CommentReference"/>
@@ -1636,7 +1648,7 @@
           <w:sz w:val="24"/>
           <w:szCs w:val="24"/>
         </w:rPr>
-        <w:commentReference w:id="1"/>
+        <w:commentReference w:id="2"/>
       </w:r>
       <w:r>
         <w:rPr>
@@ -2113,6 +2125,7 @@
                 <w:highlight w:val="red"/>
               </w:rPr>
             </w:pPr>
+            <w:commentRangeStart w:id="3"/>
             <w:r>
               <w:rPr>
                 <w:rFonts w:ascii="Times New Roman" w:hAnsi="Times New Roman" w:cs="Times New Roman"/>
@@ -2158,6 +2171,18 @@
               </w:rPr>
               <w:t>3%</w:t>
             </w:r>
+            <w:commentRangeEnd w:id="3"/>
+            <w:r>
+              <w:rPr>
+                <w:rStyle w:val="CommentReference"/>
+                <w:rFonts w:ascii="Times New Roman" w:hAnsi="Times New Roman" w:cs="Times New Roman"/>
+                <w:color w:val="000000"/>
+                <w:sz w:val="24"/>
+                <w:szCs w:val="24"/>
+                <w:highlight w:val="red"/>
+              </w:rPr>
+              <w:commentReference w:id="3"/>
+            </w:r>
           </w:p>
         </w:tc>
       </w:tr>
@@ -2469,7 +2494,7 @@
           <w:szCs w:val="24"/>
         </w:rPr>
       </w:pPr>
-      <w:bookmarkStart w:id="2" w:name="OLE_LINK1"/>
+      <w:bookmarkStart w:id="4" w:name="OLE_LINK1"/>
       <w:r>
         <w:rPr>
           <w:rFonts w:ascii="Times New Roman" w:eastAsia="Times New Roman" w:hAnsi="Times New Roman" w:cs="Times New Roman"/>
@@ -2596,7 +2621,7 @@
         </w:rPr>
         <w:t>Shael N. Wolfson, PhD</w:t>
       </w:r>
-      <w:bookmarkEnd w:id="2"/>
+      <w:bookmarkEnd w:id="4"/>
     </w:p>
     <w:p>
       <w:pPr>
@@ -2678,6 +2703,7 @@
           <w:szCs w:val="24"/>
         </w:rPr>
       </w:pPr>
+      <w:commentRangeStart w:id="5"/>
       <w:r>
         <w:rPr>
           <w:rFonts w:ascii="Times New Roman" w:eastAsia="Times New Roman" w:hAnsi="Times New Roman" w:cs="Times New Roman"/>
@@ -2700,7 +2726,25 @@
           <w:sz w:val="24"/>
           <w:szCs w:val="24"/>
         </w:rPr>
-        <w:t xml:space="preserve">Future Medical Care: </w:t>
+        <w:t>Future Medical Care</w:t>
+      </w:r>
+      <w:commentRangeEnd w:id="5"/>
+      <w:r>
+        <w:rPr>
+          <w:rStyle w:val="CommentReference"/>
+          <w:rFonts w:ascii="Times New Roman" w:eastAsia="Times New Roman" w:hAnsi="Times New Roman" w:cs="Times New Roman"/>
+          <w:sz w:val="24"/>
+          <w:szCs w:val="24"/>
+        </w:rPr>
+        <w:commentReference w:id="5"/>
+      </w:r>
+      <w:r>
+        <w:rPr>
+          <w:rFonts w:ascii="Times New Roman" w:eastAsia="Times New Roman" w:hAnsi="Times New Roman" w:cs="Times New Roman"/>
+          <w:sz w:val="24"/>
+          <w:szCs w:val="24"/>
+        </w:rPr>
+        <w:t xml:space="preserve">: </w:t>
       </w:r>
       <w:r>
         <w:rPr>
@@ -3101,6 +3145,7 @@
         </w:rPr>
         <w:t>Municipal Securities Rulemaking Board. (</w:t>
       </w:r>
+      <w:commentRangeStart w:id="6"/>
       <w:r>
         <w:rPr>
           <w:rFonts w:ascii="Times New Roman" w:hAnsi="Times New Roman" w:cs="Times New Roman"/>
@@ -3118,6 +3163,17 @@
           <w:highlight w:val="red"/>
         </w:rPr>
         <w:t xml:space="preserve"> </w:t>
+      </w:r>
+      <w:commentRangeEnd w:id="6"/>
+      <w:r>
+        <w:rPr>
+          <w:rStyle w:val="CommentReference"/>
+          <w:rFonts w:ascii="Times New Roman" w:hAnsi="Times New Roman" w:cs="Times New Roman"/>
+          <w:sz w:val="24"/>
+          <w:szCs w:val="24"/>
+          <w:highlight w:val="red"/>
+        </w:rPr>
+        <w:commentReference w:id="6"/>
       </w:r>
       <w:r>
         <w:rPr>
@@ -3206,6 +3262,7 @@
           <w:szCs w:val="24"/>
         </w:rPr>
       </w:pPr>
+      <w:commentRangeStart w:id="7"/>
       <w:r>
         <w:rPr>
           <w:rFonts w:ascii="Times New Roman" w:hAnsi="Times New Roman" w:cs="Times New Roman"/>
@@ -3829,6 +3886,16 @@
           <w:szCs w:val="24"/>
         </w:rPr>
         <w:t>. Retrieved from https://download.bls.gov/pub/time.series/cu/cu.data.15.USMedical</w:t>
+      </w:r>
+      <w:commentRangeEnd w:id="7"/>
+      <w:r>
+        <w:rPr>
+          <w:rStyle w:val="CommentReference"/>
+          <w:rFonts w:ascii="Times New Roman" w:hAnsi="Times New Roman" w:cs="Times New Roman"/>
+          <w:sz w:val="24"/>
+          <w:szCs w:val="24"/>
+        </w:rPr>
+        <w:commentReference w:id="7"/>
       </w:r>
     </w:p>
     <w:sectPr>
@@ -3848,7 +3915,7 @@
 
 <file path=word/comments.xml><?xml version="1.0" encoding="utf-8"?>
 <w:comments xmlns:wpc="http://schemas.microsoft.com/office/word/2010/wordprocessingCanvas" xmlns:cx="http://schemas.microsoft.com/office/drawing/2014/chartex" xmlns:cx1="http://schemas.microsoft.com/office/drawing/2015/9/8/chartex" xmlns:cx2="http://schemas.microsoft.com/office/drawing/2015/10/21/chartex" xmlns:cx3="http://schemas.microsoft.com/office/drawing/2016/5/9/chartex" xmlns:cx4="http://schemas.microsoft.com/office/drawing/2016/5/10/chartex" xmlns:cx5="http://schemas.microsoft.com/office/drawing/2016/5/11/chartex" xmlns:cx6="http://schemas.microsoft.com/office/drawing/2016/5/12/chartex" xmlns:cx7="http://schemas.microsoft.com/office/drawing/2016/5/13/chartex" xmlns:cx8="http://schemas.microsoft.com/office/drawing/2016/5/14/chartex" xmlns:mc="http://schemas.openxmlformats.org/markup-compatibility/2006" xmlns:aink="http://schemas.microsoft.com/office/drawing/2016/ink" xmlns:am3d="http://schemas.microsoft.com/office/drawing/2017/model3d" xmlns:o="urn:schemas-microsoft-com:office:office" xmlns:oel="http://schemas.microsoft.com/office/2019/extlst" xmlns:r="http://schemas.openxmlformats.org/officeDocument/2006/relationships" xmlns:m="http://schemas.openxmlformats.org/officeDocument/2006/math" xmlns:v="urn:schemas-microsoft-com:vml" xmlns:wp14="http://schemas.microsoft.com/office/word/2010/wordprocessingDrawing" xmlns:wp="http://schemas.openxmlformats.org/drawingml/2006/wordprocessingDrawing" xmlns:w10="urn:schemas-microsoft-com:office:word" xmlns:w="http://schemas.openxmlformats.org/wordprocessingml/2006/main" xmlns:w14="http://schemas.microsoft.com/office/word/2010/wordml" xmlns:w15="http://schemas.microsoft.com/office/word/2012/wordml" xmlns:w16cex="http://schemas.microsoft.com/office/word/2018/wordml/cex" xmlns:w16cid="http://schemas.microsoft.com/office/word/2016/wordml/cid" xmlns:w16="http://schemas.microsoft.com/office/word/2018/wordml" xmlns:w16du="http://schemas.microsoft.com/office/word/2023/wordml/word16du" xmlns:w16sdtdh="http://schemas.microsoft.com/office/word/2020/wordml/sdtdatahash" xmlns:w16sdtfl="http://schemas.microsoft.com/office/word/2024/wordml/sdtformatlock" xmlns:w16se="http://schemas.microsoft.com/office/word/2015/wordml/symex" xmlns:wpg="http://schemas.microsoft.com/office/word/2010/wordprocessingGroup" xmlns:wpi="http://schemas.microsoft.com/office/word/2010/wordprocessingInk" xmlns:wne="http://schemas.microsoft.com/office/word/2006/wordml" xmlns:wps="http://schemas.microsoft.com/office/word/2010/wordprocessingShape" mc:Ignorable="w14 w15 w16se w16cid w16 w16cex w16sdtdh w16sdtfl w16du wp14">
-  <w:comment w:id="1" w:author="Eric Bussey" w:date="2026-04-17T16:24:00Z" w:initials="EB">
+  <w:comment w:id="0" w:author="Eric Bussey" w:date="2026-04-20T11:48:00Z" w:initials="EB">
     <w:p>
       <w:pPr>
         <w:pStyle w:val="CommentText"/>
@@ -3860,7 +3927,491 @@
         <w:annotationRef/>
       </w:r>
       <w:r>
+        <w:t xml:space="preserve">Current data derived from Working Calc -&gt; </w:t>
+      </w:r>
+      <w:r>
+        <w:rPr>
+          <w:b/>
+          <w:bCs/>
+          <w:u w:val="single"/>
+        </w:rPr>
+        <w:t>Bloomberg sheet</w:t>
+      </w:r>
+      <w:r>
+        <w:t xml:space="preserve">, relevant rates within Bloomberg pulled from Working Calc -&gt; </w:t>
+      </w:r>
+      <w:r>
+        <w:rPr>
+          <w:b/>
+          <w:bCs/>
+          <w:u w:val="single"/>
+        </w:rPr>
+        <w:t>Roll Up</w:t>
+      </w:r>
+      <w:r>
+        <w:t xml:space="preserve"> </w:t>
+      </w:r>
+      <w:r>
+        <w:rPr>
+          <w:b/>
+          <w:bCs/>
+          <w:u w:val="single"/>
+        </w:rPr>
+        <w:t>sheet (columns AL:AN)</w:t>
+      </w:r>
+    </w:p>
+  </w:comment>
+  <w:comment w:id="2" w:author="Eric Bussey" w:date="2026-04-17T16:24:00Z" w:initials="EB">
+    <w:p>
+      <w:pPr>
+        <w:pStyle w:val="CommentText"/>
+      </w:pPr>
+      <w:r>
+        <w:rPr>
+          <w:rStyle w:val="CommentReference"/>
+        </w:rPr>
+        <w:annotationRef/>
+      </w:r>
+      <w:r>
         <w:t>There is some start date variance on a per-category basis</w:t>
+      </w:r>
+    </w:p>
+  </w:comment>
+  <w:comment w:id="3" w:author="Eric Bussey" w:date="2026-04-20T11:48:00Z" w:initials="EB">
+    <w:p>
+      <w:pPr>
+        <w:pStyle w:val="CommentText"/>
+      </w:pPr>
+      <w:r>
+        <w:rPr>
+          <w:rStyle w:val="CommentReference"/>
+        </w:rPr>
+        <w:annotationRef/>
+      </w:r>
+      <w:r>
+        <w:t xml:space="preserve">Pulled from </w:t>
+      </w:r>
+      <w:r>
+        <w:rPr>
+          <w:b/>
+          <w:bCs/>
+          <w:u w:val="single"/>
+        </w:rPr>
+        <w:t>Working Calc -&gt; CPI</w:t>
+      </w:r>
+      <w:r>
+        <w:t xml:space="preserve">, categories determined by </w:t>
+      </w:r>
+      <w:r>
+        <w:rPr>
+          <w:b/>
+          <w:bCs/>
+          <w:i/>
+          <w:iCs/>
+        </w:rPr>
+        <w:t>items in LCP</w:t>
+      </w:r>
+    </w:p>
+  </w:comment>
+  <w:comment w:id="5" w:author="Eric Bussey" w:date="2026-04-20T11:56:00Z" w:initials="EB">
+    <w:p>
+      <w:pPr>
+        <w:pStyle w:val="CommentText"/>
+      </w:pPr>
+      <w:r>
+        <w:rPr>
+          <w:rStyle w:val="CommentReference"/>
+        </w:rPr>
+        <w:annotationRef/>
+      </w:r>
+      <w:r>
+        <w:t xml:space="preserve">GENERATED ON </w:t>
+      </w:r>
+      <w:r>
+        <w:rPr>
+          <w:b/>
+          <w:bCs/>
+          <w:u w:val="single"/>
+        </w:rPr>
+        <w:t>WORKING CALC -&gt; PV_SUMMARY_NO_ROUNDING</w:t>
+      </w:r>
+    </w:p>
+    <w:p>
+      <w:pPr>
+        <w:pStyle w:val="CommentText"/>
+      </w:pPr>
+    </w:p>
+    <w:p>
+      <w:pPr>
+        <w:pStyle w:val="CommentText"/>
+      </w:pPr>
+    </w:p>
+    <w:p>
+      <w:pPr>
+        <w:pStyle w:val="CommentText"/>
+      </w:pPr>
+      <w:r>
+        <w:t xml:space="preserve">Items provided on Working Calc -&gt; Item Inputs, then use </w:t>
+      </w:r>
+      <w:r>
+        <w:rPr>
+          <w:b/>
+          <w:bCs/>
+          <w:u w:val="single"/>
+        </w:rPr>
+        <w:t>Data Tab</w:t>
+      </w:r>
+      <w:r>
+        <w:t xml:space="preserve">  -&gt; </w:t>
+      </w:r>
+      <w:r>
+        <w:rPr>
+          <w:b/>
+          <w:bCs/>
+          <w:i/>
+          <w:iCs/>
+        </w:rPr>
+        <w:t xml:space="preserve">Refresh All </w:t>
+      </w:r>
+      <w:r>
+        <w:t xml:space="preserve">to generate chart (which unfortunately recalculates everything. </w:t>
+      </w:r>
+      <w:r>
+        <w:rPr>
+          <w:b/>
+          <w:bCs/>
+          <w:u w:val="single"/>
+        </w:rPr>
+        <w:t>sometimes discount rates are put in the “custom discount tab” to lock them in/not refresh</w:t>
+      </w:r>
+      <w:r>
+        <w:t>)</w:t>
+      </w:r>
+    </w:p>
+    <w:p>
+      <w:pPr>
+        <w:pStyle w:val="CommentText"/>
+      </w:pPr>
+    </w:p>
+    <w:p>
+      <w:pPr>
+        <w:pStyle w:val="CommentText"/>
+      </w:pPr>
+    </w:p>
+    <w:p>
+      <w:pPr>
+        <w:pStyle w:val="CommentText"/>
+      </w:pPr>
+      <w:r>
+        <w:rPr>
+          <w:b/>
+          <w:bCs/>
+          <w:u w:val="single"/>
+        </w:rPr>
+        <w:t>FORMATTING CHART:</w:t>
+      </w:r>
+    </w:p>
+    <w:p>
+      <w:pPr>
+        <w:pStyle w:val="CommentText"/>
+      </w:pPr>
+    </w:p>
+    <w:p>
+      <w:pPr>
+        <w:pStyle w:val="CommentText"/>
+      </w:pPr>
+      <w:r>
+        <w:t xml:space="preserve">DECIMAL CURRENCY VALUES ARE </w:t>
+      </w:r>
+      <w:r>
+        <w:rPr>
+          <w:b/>
+          <w:bCs/>
+          <w:i/>
+          <w:iCs/>
+          <w:u w:val="single"/>
+        </w:rPr>
+        <w:t>ALWAYS EXCLUDED EVERYWHERE</w:t>
+      </w:r>
+    </w:p>
+    <w:p>
+      <w:pPr>
+        <w:pStyle w:val="CommentText"/>
+      </w:pPr>
+    </w:p>
+    <w:p>
+      <w:pPr>
+        <w:pStyle w:val="CommentText"/>
+        <w:numPr>
+          <w:ilvl w:val="0"/>
+          <w:numId w:val="10"/>
+        </w:numPr>
+      </w:pPr>
+      <w:r>
+        <w:rPr>
+          <w:b/>
+          <w:bCs/>
+        </w:rPr>
+        <w:t>NO GRIDLINES</w:t>
+      </w:r>
+    </w:p>
+    <w:p>
+      <w:pPr>
+        <w:pStyle w:val="CommentText"/>
+      </w:pPr>
+    </w:p>
+    <w:p>
+      <w:pPr>
+        <w:pStyle w:val="CommentText"/>
+        <w:numPr>
+          <w:ilvl w:val="0"/>
+          <w:numId w:val="11"/>
+        </w:numPr>
+      </w:pPr>
+      <w:r>
+        <w:rPr>
+          <w:b/>
+          <w:bCs/>
+        </w:rPr>
+        <w:t>REGULAR OUTLINE</w:t>
+      </w:r>
+      <w:r>
+        <w:rPr>
+          <w:b/>
+          <w:bCs/>
+          <w:i/>
+          <w:iCs/>
+        </w:rPr>
+        <w:t xml:space="preserve"> </w:t>
+      </w:r>
+      <w:r>
+        <w:t xml:space="preserve">AROUND </w:t>
+      </w:r>
+      <w:r>
+        <w:rPr>
+          <w:u w:val="single"/>
+        </w:rPr>
+        <w:t>ENTIRE CHART</w:t>
+      </w:r>
+      <w:r>
+        <w:t xml:space="preserve">, </w:t>
+      </w:r>
+      <w:r>
+        <w:rPr>
+          <w:u w:val="single"/>
+        </w:rPr>
+        <w:t>FIRST LINE</w:t>
+      </w:r>
+      <w:r>
+        <w:t xml:space="preserve">, AND </w:t>
+      </w:r>
+      <w:r>
+        <w:rPr>
+          <w:u w:val="single"/>
+        </w:rPr>
+        <w:t xml:space="preserve">LAST LINE </w:t>
+      </w:r>
+      <w:r>
+        <w:rPr>
+          <w:b/>
+          <w:bCs/>
+          <w:i/>
+          <w:iCs/>
+        </w:rPr>
+        <w:t>ONLY</w:t>
+      </w:r>
+    </w:p>
+    <w:p>
+      <w:pPr>
+        <w:pStyle w:val="CommentText"/>
+      </w:pPr>
+    </w:p>
+    <w:p>
+      <w:pPr>
+        <w:pStyle w:val="CommentText"/>
+        <w:numPr>
+          <w:ilvl w:val="0"/>
+          <w:numId w:val="12"/>
+        </w:numPr>
+      </w:pPr>
+      <w:r>
+        <w:rPr>
+          <w:b/>
+          <w:bCs/>
+        </w:rPr>
+        <w:t>LIGHT GRAY BACKGROUND</w:t>
+      </w:r>
+      <w:r>
+        <w:t xml:space="preserve"> FOR </w:t>
+      </w:r>
+      <w:r>
+        <w:rPr>
+          <w:u w:val="single"/>
+        </w:rPr>
+        <w:t>FIRST LINE</w:t>
+      </w:r>
+      <w:r>
+        <w:t xml:space="preserve">, </w:t>
+      </w:r>
+      <w:r>
+        <w:rPr>
+          <w:u w:val="single"/>
+        </w:rPr>
+        <w:t>LAST LINE</w:t>
+      </w:r>
+      <w:r>
+        <w:t xml:space="preserve">, AND EACH </w:t>
+      </w:r>
+      <w:r>
+        <w:rPr>
+          <w:u w:val="single"/>
+        </w:rPr>
+        <w:t>SECTION HEADER</w:t>
+      </w:r>
+    </w:p>
+    <w:p>
+      <w:pPr>
+        <w:pStyle w:val="CommentText"/>
+      </w:pPr>
+    </w:p>
+    <w:p>
+      <w:pPr>
+        <w:pStyle w:val="CommentText"/>
+        <w:numPr>
+          <w:ilvl w:val="0"/>
+          <w:numId w:val="13"/>
+        </w:numPr>
+      </w:pPr>
+      <w:r>
+        <w:rPr>
+          <w:u w:val="single"/>
+        </w:rPr>
+        <w:t>FIRST LINE HEADERS</w:t>
+      </w:r>
+      <w:r>
+        <w:t xml:space="preserve"> </w:t>
+      </w:r>
+      <w:r>
+        <w:rPr>
+          <w:b/>
+          <w:bCs/>
+        </w:rPr>
+        <w:t>CENTERED</w:t>
+      </w:r>
+    </w:p>
+    <w:p>
+      <w:pPr>
+        <w:pStyle w:val="CommentText"/>
+      </w:pPr>
+    </w:p>
+    <w:p>
+      <w:pPr>
+        <w:pStyle w:val="CommentText"/>
+        <w:numPr>
+          <w:ilvl w:val="0"/>
+          <w:numId w:val="14"/>
+        </w:numPr>
+      </w:pPr>
+      <w:r>
+        <w:rPr>
+          <w:b/>
+          <w:bCs/>
+        </w:rPr>
+        <w:t>DELETE ANY ZEROS</w:t>
+      </w:r>
+      <w:r>
+        <w:t xml:space="preserve"> IN </w:t>
+      </w:r>
+      <w:r>
+        <w:rPr>
+          <w:u w:val="single"/>
+        </w:rPr>
+        <w:t>SECTION TITLES</w:t>
+      </w:r>
+    </w:p>
+    <w:p>
+      <w:pPr>
+        <w:pStyle w:val="CommentText"/>
+      </w:pPr>
+    </w:p>
+    <w:p>
+      <w:pPr>
+        <w:pStyle w:val="CommentText"/>
+        <w:numPr>
+          <w:ilvl w:val="0"/>
+          <w:numId w:val="15"/>
+        </w:numPr>
+      </w:pPr>
+      <w:r>
+        <w:t xml:space="preserve">LIKES </w:t>
+      </w:r>
+      <w:r>
+        <w:rPr>
+          <w:b/>
+          <w:bCs/>
+        </w:rPr>
+        <w:t>ALL CAPS</w:t>
+      </w:r>
+      <w:r>
+        <w:t xml:space="preserve"> FOR </w:t>
+      </w:r>
+      <w:r>
+        <w:rPr>
+          <w:u w:val="single"/>
+        </w:rPr>
+        <w:t>FIRST LINE/SECTION HEADERS</w:t>
+      </w:r>
+    </w:p>
+  </w:comment>
+  <w:comment w:id="6" w:author="Eric Bussey" w:date="2026-04-20T11:49:00Z" w:initials="EB">
+    <w:p>
+      <w:pPr>
+        <w:pStyle w:val="CommentText"/>
+      </w:pPr>
+      <w:r>
+        <w:rPr>
+          <w:rStyle w:val="CommentReference"/>
+        </w:rPr>
+        <w:annotationRef/>
+      </w:r>
+      <w:r>
+        <w:t>This is Bloomberg data citation</w:t>
+      </w:r>
+    </w:p>
+  </w:comment>
+  <w:comment w:id="7" w:author="Eric Bussey" w:date="2026-04-20T11:49:00Z" w:initials="EB">
+    <w:p>
+      <w:pPr>
+        <w:pStyle w:val="CommentText"/>
+      </w:pPr>
+      <w:r>
+        <w:rPr>
+          <w:rStyle w:val="CommentReference"/>
+        </w:rPr>
+        <w:annotationRef/>
+      </w:r>
+      <w:r>
+        <w:t xml:space="preserve">All pulled from </w:t>
+      </w:r>
+      <w:r>
+        <w:rPr>
+          <w:b/>
+          <w:bCs/>
+          <w:u w:val="single"/>
+        </w:rPr>
+        <w:t>Working Calc -&gt; CPI</w:t>
+      </w:r>
+      <w:r>
+        <w:t xml:space="preserve">, categories determined by </w:t>
+      </w:r>
+      <w:r>
+        <w:rPr>
+          <w:b/>
+          <w:bCs/>
+          <w:i/>
+          <w:iCs/>
+        </w:rPr>
+        <w:t>items in LCP</w:t>
       </w:r>
     </w:p>
   </w:comment>
@@ -3869,19 +4420,34 @@
 
 <file path=word/commentsExtended.xml><?xml version="1.0" encoding="utf-8"?>
 <w15:commentsEx xmlns:wpc="http://schemas.microsoft.com/office/word/2010/wordprocessingCanvas" xmlns:cx="http://schemas.microsoft.com/office/drawing/2014/chartex" xmlns:cx1="http://schemas.microsoft.com/office/drawing/2015/9/8/chartex" xmlns:cx2="http://schemas.microsoft.com/office/drawing/2015/10/21/chartex" xmlns:cx3="http://schemas.microsoft.com/office/drawing/2016/5/9/chartex" xmlns:cx4="http://schemas.microsoft.com/office/drawing/2016/5/10/chartex" xmlns:cx5="http://schemas.microsoft.com/office/drawing/2016/5/11/chartex" xmlns:cx6="http://schemas.microsoft.com/office/drawing/2016/5/12/chartex" xmlns:cx7="http://schemas.microsoft.com/office/drawing/2016/5/13/chartex" xmlns:cx8="http://schemas.microsoft.com/office/drawing/2016/5/14/chartex" xmlns:mc="http://schemas.openxmlformats.org/markup-compatibility/2006" xmlns:aink="http://schemas.microsoft.com/office/drawing/2016/ink" xmlns:am3d="http://schemas.microsoft.com/office/drawing/2017/model3d" xmlns:o="urn:schemas-microsoft-com:office:office" xmlns:oel="http://schemas.microsoft.com/office/2019/extlst" xmlns:r="http://schemas.openxmlformats.org/officeDocument/2006/relationships" xmlns:m="http://schemas.openxmlformats.org/officeDocument/2006/math" xmlns:v="urn:schemas-microsoft-com:vml" xmlns:wp14="http://schemas.microsoft.com/office/word/2010/wordprocessingDrawing" xmlns:wp="http://schemas.openxmlformats.org/drawingml/2006/wordprocessingDrawing" xmlns:w10="urn:schemas-microsoft-com:office:word" xmlns:w="http://schemas.openxmlformats.org/wordprocessingml/2006/main" xmlns:w14="http://schemas.microsoft.com/office/word/2010/wordml" xmlns:w15="http://schemas.microsoft.com/office/word/2012/wordml" xmlns:w16cex="http://schemas.microsoft.com/office/word/2018/wordml/cex" xmlns:w16cid="http://schemas.microsoft.com/office/word/2016/wordml/cid" xmlns:w16="http://schemas.microsoft.com/office/word/2018/wordml" xmlns:w16du="http://schemas.microsoft.com/office/word/2023/wordml/word16du" xmlns:w16sdtdh="http://schemas.microsoft.com/office/word/2020/wordml/sdtdatahash" xmlns:w16sdtfl="http://schemas.microsoft.com/office/word/2024/wordml/sdtformatlock" xmlns:w16se="http://schemas.microsoft.com/office/word/2015/wordml/symex" xmlns:wpg="http://schemas.microsoft.com/office/word/2010/wordprocessingGroup" xmlns:wpi="http://schemas.microsoft.com/office/word/2010/wordprocessingInk" xmlns:wne="http://schemas.microsoft.com/office/word/2006/wordml" xmlns:wps="http://schemas.microsoft.com/office/word/2010/wordprocessingShape" mc:Ignorable="w14 w15 w16se w16cid w16 w16cex w16sdtdh w16sdtfl w16du wp14">
+  <w15:commentEx w15:paraId="685DDBC2" w15:done="0"/>
   <w15:commentEx w15:paraId="1652E33F" w15:done="0"/>
+  <w15:commentEx w15:paraId="3C9C6B18" w15:done="0"/>
+  <w15:commentEx w15:paraId="2496C88D" w15:done="0"/>
+  <w15:commentEx w15:paraId="56030A41" w15:done="0"/>
+  <w15:commentEx w15:paraId="0E51D427" w15:done="0"/>
 </w15:commentsEx>
 </file>
 
 <file path=word/commentsExtensible.xml><?xml version="1.0" encoding="utf-8"?>
 <w16cex:commentsExtensible xmlns:wpc="http://schemas.microsoft.com/office/word/2010/wordprocessingCanvas" xmlns:cx="http://schemas.microsoft.com/office/drawing/2014/chartex" xmlns:cx1="http://schemas.microsoft.com/office/drawing/2015/9/8/chartex" xmlns:cx2="http://schemas.microsoft.com/office/drawing/2015/10/21/chartex" xmlns:cx3="http://schemas.microsoft.com/office/drawing/2016/5/9/chartex" xmlns:cx4="http://schemas.microsoft.com/office/drawing/2016/5/10/chartex" xmlns:cx5="http://schemas.microsoft.com/office/drawing/2016/5/11/chartex" xmlns:cx6="http://schemas.microsoft.com/office/drawing/2016/5/12/chartex" xmlns:cx7="http://schemas.microsoft.com/office/drawing/2016/5/13/chartex" xmlns:cx8="http://schemas.microsoft.com/office/drawing/2016/5/14/chartex" xmlns:cr="http://schemas.microsoft.com/office/comments/2020/reactions" xmlns:mc="http://schemas.openxmlformats.org/markup-compatibility/2006" xmlns:aink="http://schemas.microsoft.com/office/drawing/2016/ink" xmlns:am3d="http://schemas.microsoft.com/office/drawing/2017/model3d" xmlns:o="urn:schemas-microsoft-com:office:office" xmlns:oel="http://schemas.microsoft.com/office/2019/extlst" xmlns:r="http://schemas.openxmlformats.org/officeDocument/2006/relationships" xmlns:m="http://schemas.openxmlformats.org/officeDocument/2006/math" xmlns:v="urn:schemas-microsoft-com:vml" xmlns:wp14="http://schemas.microsoft.com/office/word/2010/wordprocessingDrawing" xmlns:wp="http://schemas.openxmlformats.org/drawingml/2006/wordprocessingDrawing" xmlns:w10="urn:schemas-microsoft-com:office:word" xmlns:w="http://schemas.openxmlformats.org/wordprocessingml/2006/main" xmlns:w14="http://schemas.microsoft.com/office/word/2010/wordml" xmlns:w15="http://schemas.microsoft.com/office/word/2012/wordml" xmlns:w16cex="http://schemas.microsoft.com/office/word/2018/wordml/cex" xmlns:w16cid="http://schemas.microsoft.com/office/word/2016/wordml/cid" xmlns:w16="http://schemas.microsoft.com/office/word/2018/wordml" xmlns:w16du="http://schemas.microsoft.com/office/word/2023/wordml/word16du" xmlns:w16sdtdh="http://schemas.microsoft.com/office/word/2020/wordml/sdtdatahash" xmlns:w16sdtfl="http://schemas.microsoft.com/office/word/2024/wordml/sdtformatlock" xmlns:w16se="http://schemas.microsoft.com/office/word/2015/wordml/symex" xmlns:wpg="http://schemas.microsoft.com/office/word/2010/wordprocessingGroup" xmlns:wpi="http://schemas.microsoft.com/office/word/2010/wordprocessingInk" xmlns:wne="http://schemas.microsoft.com/office/word/2006/wordml" xmlns:wps="http://schemas.microsoft.com/office/word/2010/wordprocessingShape" mc:Ignorable="w14 w15 w16se w16cid w16 w16cex w16sdtdh w16sdtfl cr w16du wp14">
+  <w16cex:commentExtensible w16cex:durableId="4D6F360A" w16cex:dateUtc="2026-04-20T16:48:00Z"/>
   <w16cex:commentExtensible w16cex:durableId="2E3FA4AB" w16cex:dateUtc="2026-04-17T21:24:00Z"/>
+  <w16cex:commentExtensible w16cex:durableId="0B670C8D" w16cex:dateUtc="2026-04-20T16:48:00Z"/>
+  <w16cex:commentExtensible w16cex:durableId="79C44B0A" w16cex:dateUtc="2026-04-20T16:56:00Z"/>
+  <w16cex:commentExtensible w16cex:durableId="081EC7C4" w16cex:dateUtc="2026-04-20T16:49:00Z"/>
+  <w16cex:commentExtensible w16cex:durableId="68B62712" w16cex:dateUtc="2026-04-20T16:49:00Z"/>
 </w16cex:commentsExtensible>
 </file>
 
 <file path=word/commentsIds.xml><?xml version="1.0" encoding="utf-8"?>
 <w16cid:commentsIds xmlns:wpc="http://schemas.microsoft.com/office/word/2010/wordprocessingCanvas" xmlns:cx="http://schemas.microsoft.com/office/drawing/2014/chartex" xmlns:cx1="http://schemas.microsoft.com/office/drawing/2015/9/8/chartex" xmlns:cx2="http://schemas.microsoft.com/office/drawing/2015/10/21/chartex" xmlns:cx3="http://schemas.microsoft.com/office/drawing/2016/5/9/chartex" xmlns:cx4="http://schemas.microsoft.com/office/drawing/2016/5/10/chartex" xmlns:cx5="http://schemas.microsoft.com/office/drawing/2016/5/11/chartex" xmlns:cx6="http://schemas.microsoft.com/office/drawing/2016/5/12/chartex" xmlns:cx7="http://schemas.microsoft.com/office/drawing/2016/5/13/chartex" xmlns:cx8="http://schemas.microsoft.com/office/drawing/2016/5/14/chartex" xmlns:mc="http://schemas.openxmlformats.org/markup-compatibility/2006" xmlns:aink="http://schemas.microsoft.com/office/drawing/2016/ink" xmlns:am3d="http://schemas.microsoft.com/office/drawing/2017/model3d" xmlns:o="urn:schemas-microsoft-com:office:office" xmlns:oel="http://schemas.microsoft.com/office/2019/extlst" xmlns:r="http://schemas.openxmlformats.org/officeDocument/2006/relationships" xmlns:m="http://schemas.openxmlformats.org/officeDocument/2006/math" xmlns:v="urn:schemas-microsoft-com:vml" xmlns:wp14="http://schemas.microsoft.com/office/word/2010/wordprocessingDrawing" xmlns:wp="http://schemas.openxmlformats.org/drawingml/2006/wordprocessingDrawing" xmlns:w10="urn:schemas-microsoft-com:office:word" xmlns:w="http://schemas.openxmlformats.org/wordprocessingml/2006/main" xmlns:w14="http://schemas.microsoft.com/office/word/2010/wordml" xmlns:w15="http://schemas.microsoft.com/office/word/2012/wordml" xmlns:w16cex="http://schemas.microsoft.com/office/word/2018/wordml/cex" xmlns:w16cid="http://schemas.microsoft.com/office/word/2016/wordml/cid" xmlns:w16="http://schemas.microsoft.com/office/word/2018/wordml" xmlns:w16du="http://schemas.microsoft.com/office/word/2023/wordml/word16du" xmlns:w16sdtdh="http://schemas.microsoft.com/office/word/2020/wordml/sdtdatahash" xmlns:w16sdtfl="http://schemas.microsoft.com/office/word/2024/wordml/sdtformatlock" xmlns:w16se="http://schemas.microsoft.com/office/word/2015/wordml/symex" xmlns:wpg="http://schemas.microsoft.com/office/word/2010/wordprocessingGroup" xmlns:wpi="http://schemas.microsoft.com/office/word/2010/wordprocessingInk" xmlns:wne="http://schemas.microsoft.com/office/word/2006/wordml" xmlns:wps="http://schemas.microsoft.com/office/word/2010/wordprocessingShape" mc:Ignorable="w14 w15 w16se w16cid w16 w16cex w16sdtdh w16sdtfl w16du wp14">
+  <w16cid:commentId w16cid:paraId="685DDBC2" w16cid:durableId="4D6F360A"/>
   <w16cid:commentId w16cid:paraId="1652E33F" w16cid:durableId="2E3FA4AB"/>
+  <w16cid:commentId w16cid:paraId="3C9C6B18" w16cid:durableId="0B670C8D"/>
+  <w16cid:commentId w16cid:paraId="2496C88D" w16cid:durableId="79C44B0A"/>
+  <w16cid:commentId w16cid:paraId="56030A41" w16cid:durableId="081EC7C4"/>
+  <w16cid:commentId w16cid:paraId="0E51D427" w16cid:durableId="68B62712"/>
 </w16cid:commentsIds>
 </file>
 
@@ -4307,12 +4873,12 @@
       </w:rPr>
       <w:tab/>
     </w:r>
-    <w:bookmarkStart w:id="3" w:name="_Hlk43130415"/>
-    <w:bookmarkStart w:id="4" w:name="_Hlk43130416"/>
-    <w:bookmarkStart w:id="5" w:name="_Hlk43820416"/>
-    <w:bookmarkStart w:id="6" w:name="_Hlk43820417"/>
-    <w:bookmarkStart w:id="7" w:name="_Hlk51061012"/>
-    <w:bookmarkStart w:id="8" w:name="_Hlk51061013"/>
+    <w:bookmarkStart w:id="8" w:name="_Hlk43130415"/>
+    <w:bookmarkStart w:id="9" w:name="_Hlk43130416"/>
+    <w:bookmarkStart w:id="10" w:name="_Hlk43820416"/>
+    <w:bookmarkStart w:id="11" w:name="_Hlk43820417"/>
+    <w:bookmarkStart w:id="12" w:name="_Hlk51061012"/>
+    <w:bookmarkStart w:id="13" w:name="_Hlk51061013"/>
     <w:r>
       <w:rPr>
         <w:rFonts w:ascii="Bitter" w:hAnsi="Bitter"/>
@@ -4466,12 +5032,12 @@
       <w:t>500.2808</w:t>
     </w:r>
   </w:p>
-  <w:bookmarkEnd w:id="3"/>
-  <w:bookmarkEnd w:id="4"/>
-  <w:bookmarkEnd w:id="5"/>
-  <w:bookmarkEnd w:id="6"/>
-  <w:bookmarkEnd w:id="7"/>
   <w:bookmarkEnd w:id="8"/>
+  <w:bookmarkEnd w:id="9"/>
+  <w:bookmarkEnd w:id="10"/>
+  <w:bookmarkEnd w:id="11"/>
+  <w:bookmarkEnd w:id="12"/>
+  <w:bookmarkEnd w:id="13"/>
   <w:p>
     <w:pPr>
       <w:pStyle w:val="Header"/>
@@ -4567,6 +5133,1249 @@
 <file path=word/numbering.xml><?xml version="1.0" encoding="utf-8"?>
 <w:numbering xmlns:wpc="http://schemas.microsoft.com/office/word/2010/wordprocessingCanvas" xmlns:cx="http://schemas.microsoft.com/office/drawing/2014/chartex" xmlns:cx1="http://schemas.microsoft.com/office/drawing/2015/9/8/chartex" xmlns:cx2="http://schemas.microsoft.com/office/drawing/2015/10/21/chartex" xmlns:cx3="http://schemas.microsoft.com/office/drawing/2016/5/9/chartex" xmlns:cx4="http://schemas.microsoft.com/office/drawing/2016/5/10/chartex" xmlns:cx5="http://schemas.microsoft.com/office/drawing/2016/5/11/chartex" xmlns:cx6="http://schemas.microsoft.com/office/drawing/2016/5/12/chartex" xmlns:cx7="http://schemas.microsoft.com/office/drawing/2016/5/13/chartex" xmlns:cx8="http://schemas.microsoft.com/office/drawing/2016/5/14/chartex" xmlns:mc="http://schemas.openxmlformats.org/markup-compatibility/2006" xmlns:aink="http://schemas.microsoft.com/office/drawing/2016/ink" xmlns:am3d="http://schemas.microsoft.com/office/drawing/2017/model3d" xmlns:o="urn:schemas-microsoft-com:office:office" xmlns:oel="http://schemas.microsoft.com/office/2019/extlst" xmlns:r="http://schemas.openxmlformats.org/officeDocument/2006/relationships" xmlns:m="http://schemas.openxmlformats.org/officeDocument/2006/math" xmlns:v="urn:schemas-microsoft-com:vml" xmlns:wp14="http://schemas.microsoft.com/office/word/2010/wordprocessingDrawing" xmlns:wp="http://schemas.openxmlformats.org/drawingml/2006/wordprocessingDrawing" xmlns:w10="urn:schemas-microsoft-com:office:word" xmlns:w="http://schemas.openxmlformats.org/wordprocessingml/2006/main" xmlns:w14="http://schemas.microsoft.com/office/word/2010/wordml" xmlns:w15="http://schemas.microsoft.com/office/word/2012/wordml" xmlns:w16cex="http://schemas.microsoft.com/office/word/2018/wordml/cex" xmlns:w16cid="http://schemas.microsoft.com/office/word/2016/wordml/cid" xmlns:w16="http://schemas.microsoft.com/office/word/2018/wordml" xmlns:w16du="http://schemas.microsoft.com/office/word/2023/wordml/word16du" xmlns:w16sdtdh="http://schemas.microsoft.com/office/word/2020/wordml/sdtdatahash" xmlns:w16sdtfl="http://schemas.microsoft.com/office/word/2024/wordml/sdtformatlock" xmlns:w16se="http://schemas.microsoft.com/office/word/2015/wordml/symex" xmlns:wpg="http://schemas.microsoft.com/office/word/2010/wordprocessingGroup" xmlns:wpi="http://schemas.microsoft.com/office/word/2010/wordprocessingInk" xmlns:wne="http://schemas.microsoft.com/office/word/2006/wordml" xmlns:wps="http://schemas.microsoft.com/office/word/2010/wordprocessingShape" mc:Ignorable="w14 w15 w16se w16cid w16 w16cex w16sdtdh w16sdtfl w16du wp14">
   <w:abstractNum w:abstractNumId="0" w15:restartNumberingAfterBreak="0">
+    <w:nsid w:val="054D7A6E"/>
+    <w:multiLevelType w:val="hybridMultilevel"/>
+    <w:tmpl w:val="2416CD40"/>
+    <w:lvl w:ilvl="0" w:tplc="BAC4717E">
+      <w:start w:val="1"/>
+      <w:numFmt w:val="bullet"/>
+      <w:lvlText w:val=""/>
+      <w:lvlJc w:val="left"/>
+      <w:pPr>
+        <w:ind w:left="720" w:hanging="360"/>
+      </w:pPr>
+      <w:rPr>
+        <w:rFonts w:ascii="Symbol" w:hAnsi="Symbol"/>
+      </w:rPr>
+    </w:lvl>
+    <w:lvl w:ilvl="1" w:tplc="72908602">
+      <w:start w:val="1"/>
+      <w:numFmt w:val="bullet"/>
+      <w:lvlText w:val=""/>
+      <w:lvlJc w:val="left"/>
+      <w:pPr>
+        <w:ind w:left="720" w:hanging="360"/>
+      </w:pPr>
+      <w:rPr>
+        <w:rFonts w:ascii="Symbol" w:hAnsi="Symbol"/>
+      </w:rPr>
+    </w:lvl>
+    <w:lvl w:ilvl="2" w:tplc="98C41874">
+      <w:start w:val="1"/>
+      <w:numFmt w:val="bullet"/>
+      <w:lvlText w:val=""/>
+      <w:lvlJc w:val="left"/>
+      <w:pPr>
+        <w:ind w:left="720" w:hanging="360"/>
+      </w:pPr>
+      <w:rPr>
+        <w:rFonts w:ascii="Symbol" w:hAnsi="Symbol"/>
+      </w:rPr>
+    </w:lvl>
+    <w:lvl w:ilvl="3" w:tplc="95B60C8A">
+      <w:start w:val="1"/>
+      <w:numFmt w:val="bullet"/>
+      <w:lvlText w:val=""/>
+      <w:lvlJc w:val="left"/>
+      <w:pPr>
+        <w:ind w:left="720" w:hanging="360"/>
+      </w:pPr>
+      <w:rPr>
+        <w:rFonts w:ascii="Symbol" w:hAnsi="Symbol"/>
+      </w:rPr>
+    </w:lvl>
+    <w:lvl w:ilvl="4" w:tplc="87D4431C">
+      <w:start w:val="1"/>
+      <w:numFmt w:val="bullet"/>
+      <w:lvlText w:val=""/>
+      <w:lvlJc w:val="left"/>
+      <w:pPr>
+        <w:ind w:left="720" w:hanging="360"/>
+      </w:pPr>
+      <w:rPr>
+        <w:rFonts w:ascii="Symbol" w:hAnsi="Symbol"/>
+      </w:rPr>
+    </w:lvl>
+    <w:lvl w:ilvl="5" w:tplc="D9B6BE5A">
+      <w:start w:val="1"/>
+      <w:numFmt w:val="bullet"/>
+      <w:lvlText w:val=""/>
+      <w:lvlJc w:val="left"/>
+      <w:pPr>
+        <w:ind w:left="720" w:hanging="360"/>
+      </w:pPr>
+      <w:rPr>
+        <w:rFonts w:ascii="Symbol" w:hAnsi="Symbol"/>
+      </w:rPr>
+    </w:lvl>
+    <w:lvl w:ilvl="6" w:tplc="19D0C38A">
+      <w:start w:val="1"/>
+      <w:numFmt w:val="bullet"/>
+      <w:lvlText w:val=""/>
+      <w:lvlJc w:val="left"/>
+      <w:pPr>
+        <w:ind w:left="720" w:hanging="360"/>
+      </w:pPr>
+      <w:rPr>
+        <w:rFonts w:ascii="Symbol" w:hAnsi="Symbol"/>
+      </w:rPr>
+    </w:lvl>
+    <w:lvl w:ilvl="7" w:tplc="05EEC5C8">
+      <w:start w:val="1"/>
+      <w:numFmt w:val="bullet"/>
+      <w:lvlText w:val=""/>
+      <w:lvlJc w:val="left"/>
+      <w:pPr>
+        <w:ind w:left="720" w:hanging="360"/>
+      </w:pPr>
+      <w:rPr>
+        <w:rFonts w:ascii="Symbol" w:hAnsi="Symbol"/>
+      </w:rPr>
+    </w:lvl>
+    <w:lvl w:ilvl="8" w:tplc="1944A9B6">
+      <w:start w:val="1"/>
+      <w:numFmt w:val="bullet"/>
+      <w:lvlText w:val=""/>
+      <w:lvlJc w:val="left"/>
+      <w:pPr>
+        <w:ind w:left="720" w:hanging="360"/>
+      </w:pPr>
+      <w:rPr>
+        <w:rFonts w:ascii="Symbol" w:hAnsi="Symbol"/>
+      </w:rPr>
+    </w:lvl>
+  </w:abstractNum>
+  <w:abstractNum w:abstractNumId="1" w15:restartNumberingAfterBreak="0">
+    <w:nsid w:val="055D7A63"/>
+    <w:multiLevelType w:val="hybridMultilevel"/>
+    <w:tmpl w:val="F6221C34"/>
+    <w:lvl w:ilvl="0" w:tplc="436E2D3A">
+      <w:start w:val="1"/>
+      <w:numFmt w:val="bullet"/>
+      <w:lvlText w:val=""/>
+      <w:lvlJc w:val="left"/>
+      <w:pPr>
+        <w:ind w:left="720" w:hanging="360"/>
+      </w:pPr>
+      <w:rPr>
+        <w:rFonts w:ascii="Symbol" w:hAnsi="Symbol"/>
+      </w:rPr>
+    </w:lvl>
+    <w:lvl w:ilvl="1" w:tplc="52A4C89C">
+      <w:start w:val="1"/>
+      <w:numFmt w:val="bullet"/>
+      <w:lvlText w:val=""/>
+      <w:lvlJc w:val="left"/>
+      <w:pPr>
+        <w:ind w:left="720" w:hanging="360"/>
+      </w:pPr>
+      <w:rPr>
+        <w:rFonts w:ascii="Symbol" w:hAnsi="Symbol"/>
+      </w:rPr>
+    </w:lvl>
+    <w:lvl w:ilvl="2" w:tplc="ABA455A8">
+      <w:start w:val="1"/>
+      <w:numFmt w:val="bullet"/>
+      <w:lvlText w:val=""/>
+      <w:lvlJc w:val="left"/>
+      <w:pPr>
+        <w:ind w:left="720" w:hanging="360"/>
+      </w:pPr>
+      <w:rPr>
+        <w:rFonts w:ascii="Symbol" w:hAnsi="Symbol"/>
+      </w:rPr>
+    </w:lvl>
+    <w:lvl w:ilvl="3" w:tplc="641851A0">
+      <w:start w:val="1"/>
+      <w:numFmt w:val="bullet"/>
+      <w:lvlText w:val=""/>
+      <w:lvlJc w:val="left"/>
+      <w:pPr>
+        <w:ind w:left="720" w:hanging="360"/>
+      </w:pPr>
+      <w:rPr>
+        <w:rFonts w:ascii="Symbol" w:hAnsi="Symbol"/>
+      </w:rPr>
+    </w:lvl>
+    <w:lvl w:ilvl="4" w:tplc="FE1E641E">
+      <w:start w:val="1"/>
+      <w:numFmt w:val="bullet"/>
+      <w:lvlText w:val=""/>
+      <w:lvlJc w:val="left"/>
+      <w:pPr>
+        <w:ind w:left="720" w:hanging="360"/>
+      </w:pPr>
+      <w:rPr>
+        <w:rFonts w:ascii="Symbol" w:hAnsi="Symbol"/>
+      </w:rPr>
+    </w:lvl>
+    <w:lvl w:ilvl="5" w:tplc="52340A42">
+      <w:start w:val="1"/>
+      <w:numFmt w:val="bullet"/>
+      <w:lvlText w:val=""/>
+      <w:lvlJc w:val="left"/>
+      <w:pPr>
+        <w:ind w:left="720" w:hanging="360"/>
+      </w:pPr>
+      <w:rPr>
+        <w:rFonts w:ascii="Symbol" w:hAnsi="Symbol"/>
+      </w:rPr>
+    </w:lvl>
+    <w:lvl w:ilvl="6" w:tplc="EB244C30">
+      <w:start w:val="1"/>
+      <w:numFmt w:val="bullet"/>
+      <w:lvlText w:val=""/>
+      <w:lvlJc w:val="left"/>
+      <w:pPr>
+        <w:ind w:left="720" w:hanging="360"/>
+      </w:pPr>
+      <w:rPr>
+        <w:rFonts w:ascii="Symbol" w:hAnsi="Symbol"/>
+      </w:rPr>
+    </w:lvl>
+    <w:lvl w:ilvl="7" w:tplc="59A0E74C">
+      <w:start w:val="1"/>
+      <w:numFmt w:val="bullet"/>
+      <w:lvlText w:val=""/>
+      <w:lvlJc w:val="left"/>
+      <w:pPr>
+        <w:ind w:left="720" w:hanging="360"/>
+      </w:pPr>
+      <w:rPr>
+        <w:rFonts w:ascii="Symbol" w:hAnsi="Symbol"/>
+      </w:rPr>
+    </w:lvl>
+    <w:lvl w:ilvl="8" w:tplc="DE0626BC">
+      <w:start w:val="1"/>
+      <w:numFmt w:val="bullet"/>
+      <w:lvlText w:val=""/>
+      <w:lvlJc w:val="left"/>
+      <w:pPr>
+        <w:ind w:left="720" w:hanging="360"/>
+      </w:pPr>
+      <w:rPr>
+        <w:rFonts w:ascii="Symbol" w:hAnsi="Symbol"/>
+      </w:rPr>
+    </w:lvl>
+  </w:abstractNum>
+  <w:abstractNum w:abstractNumId="2" w15:restartNumberingAfterBreak="0">
+    <w:nsid w:val="0FCC2F13"/>
+    <w:multiLevelType w:val="hybridMultilevel"/>
+    <w:tmpl w:val="6060AB6A"/>
+    <w:lvl w:ilvl="0" w:tplc="973EA368">
+      <w:start w:val="1"/>
+      <w:numFmt w:val="bullet"/>
+      <w:lvlText w:val=""/>
+      <w:lvlJc w:val="left"/>
+      <w:pPr>
+        <w:ind w:left="720" w:hanging="360"/>
+      </w:pPr>
+      <w:rPr>
+        <w:rFonts w:ascii="Symbol" w:hAnsi="Symbol"/>
+      </w:rPr>
+    </w:lvl>
+    <w:lvl w:ilvl="1" w:tplc="600AFB2A">
+      <w:start w:val="1"/>
+      <w:numFmt w:val="bullet"/>
+      <w:lvlText w:val=""/>
+      <w:lvlJc w:val="left"/>
+      <w:pPr>
+        <w:ind w:left="720" w:hanging="360"/>
+      </w:pPr>
+      <w:rPr>
+        <w:rFonts w:ascii="Symbol" w:hAnsi="Symbol"/>
+      </w:rPr>
+    </w:lvl>
+    <w:lvl w:ilvl="2" w:tplc="1EAC0B90">
+      <w:start w:val="1"/>
+      <w:numFmt w:val="bullet"/>
+      <w:lvlText w:val=""/>
+      <w:lvlJc w:val="left"/>
+      <w:pPr>
+        <w:ind w:left="720" w:hanging="360"/>
+      </w:pPr>
+      <w:rPr>
+        <w:rFonts w:ascii="Symbol" w:hAnsi="Symbol"/>
+      </w:rPr>
+    </w:lvl>
+    <w:lvl w:ilvl="3" w:tplc="DD909E94">
+      <w:start w:val="1"/>
+      <w:numFmt w:val="bullet"/>
+      <w:lvlText w:val=""/>
+      <w:lvlJc w:val="left"/>
+      <w:pPr>
+        <w:ind w:left="720" w:hanging="360"/>
+      </w:pPr>
+      <w:rPr>
+        <w:rFonts w:ascii="Symbol" w:hAnsi="Symbol"/>
+      </w:rPr>
+    </w:lvl>
+    <w:lvl w:ilvl="4" w:tplc="2AF0978E">
+      <w:start w:val="1"/>
+      <w:numFmt w:val="bullet"/>
+      <w:lvlText w:val=""/>
+      <w:lvlJc w:val="left"/>
+      <w:pPr>
+        <w:ind w:left="720" w:hanging="360"/>
+      </w:pPr>
+      <w:rPr>
+        <w:rFonts w:ascii="Symbol" w:hAnsi="Symbol"/>
+      </w:rPr>
+    </w:lvl>
+    <w:lvl w:ilvl="5" w:tplc="A2BA65FE">
+      <w:start w:val="1"/>
+      <w:numFmt w:val="bullet"/>
+      <w:lvlText w:val=""/>
+      <w:lvlJc w:val="left"/>
+      <w:pPr>
+        <w:ind w:left="720" w:hanging="360"/>
+      </w:pPr>
+      <w:rPr>
+        <w:rFonts w:ascii="Symbol" w:hAnsi="Symbol"/>
+      </w:rPr>
+    </w:lvl>
+    <w:lvl w:ilvl="6" w:tplc="52F01C0A">
+      <w:start w:val="1"/>
+      <w:numFmt w:val="bullet"/>
+      <w:lvlText w:val=""/>
+      <w:lvlJc w:val="left"/>
+      <w:pPr>
+        <w:ind w:left="720" w:hanging="360"/>
+      </w:pPr>
+      <w:rPr>
+        <w:rFonts w:ascii="Symbol" w:hAnsi="Symbol"/>
+      </w:rPr>
+    </w:lvl>
+    <w:lvl w:ilvl="7" w:tplc="FE303500">
+      <w:start w:val="1"/>
+      <w:numFmt w:val="bullet"/>
+      <w:lvlText w:val=""/>
+      <w:lvlJc w:val="left"/>
+      <w:pPr>
+        <w:ind w:left="720" w:hanging="360"/>
+      </w:pPr>
+      <w:rPr>
+        <w:rFonts w:ascii="Symbol" w:hAnsi="Symbol"/>
+      </w:rPr>
+    </w:lvl>
+    <w:lvl w:ilvl="8" w:tplc="9CBC76A8">
+      <w:start w:val="1"/>
+      <w:numFmt w:val="bullet"/>
+      <w:lvlText w:val=""/>
+      <w:lvlJc w:val="left"/>
+      <w:pPr>
+        <w:ind w:left="720" w:hanging="360"/>
+      </w:pPr>
+      <w:rPr>
+        <w:rFonts w:ascii="Symbol" w:hAnsi="Symbol"/>
+      </w:rPr>
+    </w:lvl>
+  </w:abstractNum>
+  <w:abstractNum w:abstractNumId="3" w15:restartNumberingAfterBreak="0">
+    <w:nsid w:val="17710876"/>
+    <w:multiLevelType w:val="hybridMultilevel"/>
+    <w:tmpl w:val="B2E21482"/>
+    <w:lvl w:ilvl="0" w:tplc="292ABCC6">
+      <w:start w:val="1"/>
+      <w:numFmt w:val="bullet"/>
+      <w:lvlText w:val=""/>
+      <w:lvlJc w:val="left"/>
+      <w:pPr>
+        <w:ind w:left="720" w:hanging="360"/>
+      </w:pPr>
+      <w:rPr>
+        <w:rFonts w:ascii="Symbol" w:hAnsi="Symbol"/>
+      </w:rPr>
+    </w:lvl>
+    <w:lvl w:ilvl="1" w:tplc="7FBA8884">
+      <w:start w:val="1"/>
+      <w:numFmt w:val="bullet"/>
+      <w:lvlText w:val=""/>
+      <w:lvlJc w:val="left"/>
+      <w:pPr>
+        <w:ind w:left="720" w:hanging="360"/>
+      </w:pPr>
+      <w:rPr>
+        <w:rFonts w:ascii="Symbol" w:hAnsi="Symbol"/>
+      </w:rPr>
+    </w:lvl>
+    <w:lvl w:ilvl="2" w:tplc="C2C6B0CA">
+      <w:start w:val="1"/>
+      <w:numFmt w:val="bullet"/>
+      <w:lvlText w:val=""/>
+      <w:lvlJc w:val="left"/>
+      <w:pPr>
+        <w:ind w:left="720" w:hanging="360"/>
+      </w:pPr>
+      <w:rPr>
+        <w:rFonts w:ascii="Symbol" w:hAnsi="Symbol"/>
+      </w:rPr>
+    </w:lvl>
+    <w:lvl w:ilvl="3" w:tplc="DC265A8E">
+      <w:start w:val="1"/>
+      <w:numFmt w:val="bullet"/>
+      <w:lvlText w:val=""/>
+      <w:lvlJc w:val="left"/>
+      <w:pPr>
+        <w:ind w:left="720" w:hanging="360"/>
+      </w:pPr>
+      <w:rPr>
+        <w:rFonts w:ascii="Symbol" w:hAnsi="Symbol"/>
+      </w:rPr>
+    </w:lvl>
+    <w:lvl w:ilvl="4" w:tplc="600C1BB0">
+      <w:start w:val="1"/>
+      <w:numFmt w:val="bullet"/>
+      <w:lvlText w:val=""/>
+      <w:lvlJc w:val="left"/>
+      <w:pPr>
+        <w:ind w:left="720" w:hanging="360"/>
+      </w:pPr>
+      <w:rPr>
+        <w:rFonts w:ascii="Symbol" w:hAnsi="Symbol"/>
+      </w:rPr>
+    </w:lvl>
+    <w:lvl w:ilvl="5" w:tplc="98022830">
+      <w:start w:val="1"/>
+      <w:numFmt w:val="bullet"/>
+      <w:lvlText w:val=""/>
+      <w:lvlJc w:val="left"/>
+      <w:pPr>
+        <w:ind w:left="720" w:hanging="360"/>
+      </w:pPr>
+      <w:rPr>
+        <w:rFonts w:ascii="Symbol" w:hAnsi="Symbol"/>
+      </w:rPr>
+    </w:lvl>
+    <w:lvl w:ilvl="6" w:tplc="29CA82A0">
+      <w:start w:val="1"/>
+      <w:numFmt w:val="bullet"/>
+      <w:lvlText w:val=""/>
+      <w:lvlJc w:val="left"/>
+      <w:pPr>
+        <w:ind w:left="720" w:hanging="360"/>
+      </w:pPr>
+      <w:rPr>
+        <w:rFonts w:ascii="Symbol" w:hAnsi="Symbol"/>
+      </w:rPr>
+    </w:lvl>
+    <w:lvl w:ilvl="7" w:tplc="963C1D2C">
+      <w:start w:val="1"/>
+      <w:numFmt w:val="bullet"/>
+      <w:lvlText w:val=""/>
+      <w:lvlJc w:val="left"/>
+      <w:pPr>
+        <w:ind w:left="720" w:hanging="360"/>
+      </w:pPr>
+      <w:rPr>
+        <w:rFonts w:ascii="Symbol" w:hAnsi="Symbol"/>
+      </w:rPr>
+    </w:lvl>
+    <w:lvl w:ilvl="8" w:tplc="63FAE1C2">
+      <w:start w:val="1"/>
+      <w:numFmt w:val="bullet"/>
+      <w:lvlText w:val=""/>
+      <w:lvlJc w:val="left"/>
+      <w:pPr>
+        <w:ind w:left="720" w:hanging="360"/>
+      </w:pPr>
+      <w:rPr>
+        <w:rFonts w:ascii="Symbol" w:hAnsi="Symbol"/>
+      </w:rPr>
+    </w:lvl>
+  </w:abstractNum>
+  <w:abstractNum w:abstractNumId="4" w15:restartNumberingAfterBreak="0">
+    <w:nsid w:val="1D905F6F"/>
+    <w:multiLevelType w:val="hybridMultilevel"/>
+    <w:tmpl w:val="FC063CB0"/>
+    <w:lvl w:ilvl="0" w:tplc="A88EE718">
+      <w:start w:val="1"/>
+      <w:numFmt w:val="bullet"/>
+      <w:lvlText w:val=""/>
+      <w:lvlJc w:val="left"/>
+      <w:pPr>
+        <w:ind w:left="720" w:hanging="360"/>
+      </w:pPr>
+      <w:rPr>
+        <w:rFonts w:ascii="Symbol" w:hAnsi="Symbol"/>
+      </w:rPr>
+    </w:lvl>
+    <w:lvl w:ilvl="1" w:tplc="2074829C">
+      <w:start w:val="1"/>
+      <w:numFmt w:val="bullet"/>
+      <w:lvlText w:val=""/>
+      <w:lvlJc w:val="left"/>
+      <w:pPr>
+        <w:ind w:left="720" w:hanging="360"/>
+      </w:pPr>
+      <w:rPr>
+        <w:rFonts w:ascii="Symbol" w:hAnsi="Symbol"/>
+      </w:rPr>
+    </w:lvl>
+    <w:lvl w:ilvl="2" w:tplc="20888988">
+      <w:start w:val="1"/>
+      <w:numFmt w:val="bullet"/>
+      <w:lvlText w:val=""/>
+      <w:lvlJc w:val="left"/>
+      <w:pPr>
+        <w:ind w:left="720" w:hanging="360"/>
+      </w:pPr>
+      <w:rPr>
+        <w:rFonts w:ascii="Symbol" w:hAnsi="Symbol"/>
+      </w:rPr>
+    </w:lvl>
+    <w:lvl w:ilvl="3" w:tplc="92B47FFA">
+      <w:start w:val="1"/>
+      <w:numFmt w:val="bullet"/>
+      <w:lvlText w:val=""/>
+      <w:lvlJc w:val="left"/>
+      <w:pPr>
+        <w:ind w:left="720" w:hanging="360"/>
+      </w:pPr>
+      <w:rPr>
+        <w:rFonts w:ascii="Symbol" w:hAnsi="Symbol"/>
+      </w:rPr>
+    </w:lvl>
+    <w:lvl w:ilvl="4" w:tplc="29E25224">
+      <w:start w:val="1"/>
+      <w:numFmt w:val="bullet"/>
+      <w:lvlText w:val=""/>
+      <w:lvlJc w:val="left"/>
+      <w:pPr>
+        <w:ind w:left="720" w:hanging="360"/>
+      </w:pPr>
+      <w:rPr>
+        <w:rFonts w:ascii="Symbol" w:hAnsi="Symbol"/>
+      </w:rPr>
+    </w:lvl>
+    <w:lvl w:ilvl="5" w:tplc="AA4CD4B6">
+      <w:start w:val="1"/>
+      <w:numFmt w:val="bullet"/>
+      <w:lvlText w:val=""/>
+      <w:lvlJc w:val="left"/>
+      <w:pPr>
+        <w:ind w:left="720" w:hanging="360"/>
+      </w:pPr>
+      <w:rPr>
+        <w:rFonts w:ascii="Symbol" w:hAnsi="Symbol"/>
+      </w:rPr>
+    </w:lvl>
+    <w:lvl w:ilvl="6" w:tplc="C422C528">
+      <w:start w:val="1"/>
+      <w:numFmt w:val="bullet"/>
+      <w:lvlText w:val=""/>
+      <w:lvlJc w:val="left"/>
+      <w:pPr>
+        <w:ind w:left="720" w:hanging="360"/>
+      </w:pPr>
+      <w:rPr>
+        <w:rFonts w:ascii="Symbol" w:hAnsi="Symbol"/>
+      </w:rPr>
+    </w:lvl>
+    <w:lvl w:ilvl="7" w:tplc="44FAA9CE">
+      <w:start w:val="1"/>
+      <w:numFmt w:val="bullet"/>
+      <w:lvlText w:val=""/>
+      <w:lvlJc w:val="left"/>
+      <w:pPr>
+        <w:ind w:left="720" w:hanging="360"/>
+      </w:pPr>
+      <w:rPr>
+        <w:rFonts w:ascii="Symbol" w:hAnsi="Symbol"/>
+      </w:rPr>
+    </w:lvl>
+    <w:lvl w:ilvl="8" w:tplc="F6909B68">
+      <w:start w:val="1"/>
+      <w:numFmt w:val="bullet"/>
+      <w:lvlText w:val=""/>
+      <w:lvlJc w:val="left"/>
+      <w:pPr>
+        <w:ind w:left="720" w:hanging="360"/>
+      </w:pPr>
+      <w:rPr>
+        <w:rFonts w:ascii="Symbol" w:hAnsi="Symbol"/>
+      </w:rPr>
+    </w:lvl>
+  </w:abstractNum>
+  <w:abstractNum w:abstractNumId="5" w15:restartNumberingAfterBreak="0">
+    <w:nsid w:val="221E0694"/>
+    <w:multiLevelType w:val="hybridMultilevel"/>
+    <w:tmpl w:val="192ABBB6"/>
+    <w:lvl w:ilvl="0" w:tplc="A6CC6F80">
+      <w:start w:val="1"/>
+      <w:numFmt w:val="bullet"/>
+      <w:lvlText w:val=""/>
+      <w:lvlJc w:val="left"/>
+      <w:pPr>
+        <w:ind w:left="720" w:hanging="360"/>
+      </w:pPr>
+      <w:rPr>
+        <w:rFonts w:ascii="Symbol" w:hAnsi="Symbol"/>
+      </w:rPr>
+    </w:lvl>
+    <w:lvl w:ilvl="1" w:tplc="10E47082">
+      <w:start w:val="1"/>
+      <w:numFmt w:val="bullet"/>
+      <w:lvlText w:val=""/>
+      <w:lvlJc w:val="left"/>
+      <w:pPr>
+        <w:ind w:left="720" w:hanging="360"/>
+      </w:pPr>
+      <w:rPr>
+        <w:rFonts w:ascii="Symbol" w:hAnsi="Symbol"/>
+      </w:rPr>
+    </w:lvl>
+    <w:lvl w:ilvl="2" w:tplc="8A265074">
+      <w:start w:val="1"/>
+      <w:numFmt w:val="bullet"/>
+      <w:lvlText w:val=""/>
+      <w:lvlJc w:val="left"/>
+      <w:pPr>
+        <w:ind w:left="720" w:hanging="360"/>
+      </w:pPr>
+      <w:rPr>
+        <w:rFonts w:ascii="Symbol" w:hAnsi="Symbol"/>
+      </w:rPr>
+    </w:lvl>
+    <w:lvl w:ilvl="3" w:tplc="04523B24">
+      <w:start w:val="1"/>
+      <w:numFmt w:val="bullet"/>
+      <w:lvlText w:val=""/>
+      <w:lvlJc w:val="left"/>
+      <w:pPr>
+        <w:ind w:left="720" w:hanging="360"/>
+      </w:pPr>
+      <w:rPr>
+        <w:rFonts w:ascii="Symbol" w:hAnsi="Symbol"/>
+      </w:rPr>
+    </w:lvl>
+    <w:lvl w:ilvl="4" w:tplc="3E48E544">
+      <w:start w:val="1"/>
+      <w:numFmt w:val="bullet"/>
+      <w:lvlText w:val=""/>
+      <w:lvlJc w:val="left"/>
+      <w:pPr>
+        <w:ind w:left="720" w:hanging="360"/>
+      </w:pPr>
+      <w:rPr>
+        <w:rFonts w:ascii="Symbol" w:hAnsi="Symbol"/>
+      </w:rPr>
+    </w:lvl>
+    <w:lvl w:ilvl="5" w:tplc="DD0CBCB2">
+      <w:start w:val="1"/>
+      <w:numFmt w:val="bullet"/>
+      <w:lvlText w:val=""/>
+      <w:lvlJc w:val="left"/>
+      <w:pPr>
+        <w:ind w:left="720" w:hanging="360"/>
+      </w:pPr>
+      <w:rPr>
+        <w:rFonts w:ascii="Symbol" w:hAnsi="Symbol"/>
+      </w:rPr>
+    </w:lvl>
+    <w:lvl w:ilvl="6" w:tplc="9D8A63C4">
+      <w:start w:val="1"/>
+      <w:numFmt w:val="bullet"/>
+      <w:lvlText w:val=""/>
+      <w:lvlJc w:val="left"/>
+      <w:pPr>
+        <w:ind w:left="720" w:hanging="360"/>
+      </w:pPr>
+      <w:rPr>
+        <w:rFonts w:ascii="Symbol" w:hAnsi="Symbol"/>
+      </w:rPr>
+    </w:lvl>
+    <w:lvl w:ilvl="7" w:tplc="B72C93B2">
+      <w:start w:val="1"/>
+      <w:numFmt w:val="bullet"/>
+      <w:lvlText w:val=""/>
+      <w:lvlJc w:val="left"/>
+      <w:pPr>
+        <w:ind w:left="720" w:hanging="360"/>
+      </w:pPr>
+      <w:rPr>
+        <w:rFonts w:ascii="Symbol" w:hAnsi="Symbol"/>
+      </w:rPr>
+    </w:lvl>
+    <w:lvl w:ilvl="8" w:tplc="7B7CCF9C">
+      <w:start w:val="1"/>
+      <w:numFmt w:val="bullet"/>
+      <w:lvlText w:val=""/>
+      <w:lvlJc w:val="left"/>
+      <w:pPr>
+        <w:ind w:left="720" w:hanging="360"/>
+      </w:pPr>
+      <w:rPr>
+        <w:rFonts w:ascii="Symbol" w:hAnsi="Symbol"/>
+      </w:rPr>
+    </w:lvl>
+  </w:abstractNum>
+  <w:abstractNum w:abstractNumId="6" w15:restartNumberingAfterBreak="0">
+    <w:nsid w:val="222B74AC"/>
+    <w:multiLevelType w:val="hybridMultilevel"/>
+    <w:tmpl w:val="8D2E948A"/>
+    <w:lvl w:ilvl="0" w:tplc="DC7ACF68">
+      <w:start w:val="1"/>
+      <w:numFmt w:val="bullet"/>
+      <w:lvlText w:val=""/>
+      <w:lvlJc w:val="left"/>
+      <w:pPr>
+        <w:ind w:left="720" w:hanging="360"/>
+      </w:pPr>
+      <w:rPr>
+        <w:rFonts w:ascii="Symbol" w:hAnsi="Symbol"/>
+      </w:rPr>
+    </w:lvl>
+    <w:lvl w:ilvl="1" w:tplc="4A7ABC42">
+      <w:start w:val="1"/>
+      <w:numFmt w:val="bullet"/>
+      <w:lvlText w:val=""/>
+      <w:lvlJc w:val="left"/>
+      <w:pPr>
+        <w:ind w:left="720" w:hanging="360"/>
+      </w:pPr>
+      <w:rPr>
+        <w:rFonts w:ascii="Symbol" w:hAnsi="Symbol"/>
+      </w:rPr>
+    </w:lvl>
+    <w:lvl w:ilvl="2" w:tplc="A4B2B0A0">
+      <w:start w:val="1"/>
+      <w:numFmt w:val="bullet"/>
+      <w:lvlText w:val=""/>
+      <w:lvlJc w:val="left"/>
+      <w:pPr>
+        <w:ind w:left="720" w:hanging="360"/>
+      </w:pPr>
+      <w:rPr>
+        <w:rFonts w:ascii="Symbol" w:hAnsi="Symbol"/>
+      </w:rPr>
+    </w:lvl>
+    <w:lvl w:ilvl="3" w:tplc="7CF42D50">
+      <w:start w:val="1"/>
+      <w:numFmt w:val="bullet"/>
+      <w:lvlText w:val=""/>
+      <w:lvlJc w:val="left"/>
+      <w:pPr>
+        <w:ind w:left="720" w:hanging="360"/>
+      </w:pPr>
+      <w:rPr>
+        <w:rFonts w:ascii="Symbol" w:hAnsi="Symbol"/>
+      </w:rPr>
+    </w:lvl>
+    <w:lvl w:ilvl="4" w:tplc="9E580E70">
+      <w:start w:val="1"/>
+      <w:numFmt w:val="bullet"/>
+      <w:lvlText w:val=""/>
+      <w:lvlJc w:val="left"/>
+      <w:pPr>
+        <w:ind w:left="720" w:hanging="360"/>
+      </w:pPr>
+      <w:rPr>
+        <w:rFonts w:ascii="Symbol" w:hAnsi="Symbol"/>
+      </w:rPr>
+    </w:lvl>
+    <w:lvl w:ilvl="5" w:tplc="5FE06E6A">
+      <w:start w:val="1"/>
+      <w:numFmt w:val="bullet"/>
+      <w:lvlText w:val=""/>
+      <w:lvlJc w:val="left"/>
+      <w:pPr>
+        <w:ind w:left="720" w:hanging="360"/>
+      </w:pPr>
+      <w:rPr>
+        <w:rFonts w:ascii="Symbol" w:hAnsi="Symbol"/>
+      </w:rPr>
+    </w:lvl>
+    <w:lvl w:ilvl="6" w:tplc="6F880F42">
+      <w:start w:val="1"/>
+      <w:numFmt w:val="bullet"/>
+      <w:lvlText w:val=""/>
+      <w:lvlJc w:val="left"/>
+      <w:pPr>
+        <w:ind w:left="720" w:hanging="360"/>
+      </w:pPr>
+      <w:rPr>
+        <w:rFonts w:ascii="Symbol" w:hAnsi="Symbol"/>
+      </w:rPr>
+    </w:lvl>
+    <w:lvl w:ilvl="7" w:tplc="CD6081F0">
+      <w:start w:val="1"/>
+      <w:numFmt w:val="bullet"/>
+      <w:lvlText w:val=""/>
+      <w:lvlJc w:val="left"/>
+      <w:pPr>
+        <w:ind w:left="720" w:hanging="360"/>
+      </w:pPr>
+      <w:rPr>
+        <w:rFonts w:ascii="Symbol" w:hAnsi="Symbol"/>
+      </w:rPr>
+    </w:lvl>
+    <w:lvl w:ilvl="8" w:tplc="3C5E34D2">
+      <w:start w:val="1"/>
+      <w:numFmt w:val="bullet"/>
+      <w:lvlText w:val=""/>
+      <w:lvlJc w:val="left"/>
+      <w:pPr>
+        <w:ind w:left="720" w:hanging="360"/>
+      </w:pPr>
+      <w:rPr>
+        <w:rFonts w:ascii="Symbol" w:hAnsi="Symbol"/>
+      </w:rPr>
+    </w:lvl>
+  </w:abstractNum>
+  <w:abstractNum w:abstractNumId="7" w15:restartNumberingAfterBreak="0">
+    <w:nsid w:val="2FD12C16"/>
+    <w:multiLevelType w:val="hybridMultilevel"/>
+    <w:tmpl w:val="2874605E"/>
+    <w:lvl w:ilvl="0" w:tplc="5F22014C">
+      <w:start w:val="1"/>
+      <w:numFmt w:val="bullet"/>
+      <w:lvlText w:val=""/>
+      <w:lvlJc w:val="left"/>
+      <w:pPr>
+        <w:ind w:left="720" w:hanging="360"/>
+      </w:pPr>
+      <w:rPr>
+        <w:rFonts w:ascii="Symbol" w:hAnsi="Symbol"/>
+      </w:rPr>
+    </w:lvl>
+    <w:lvl w:ilvl="1" w:tplc="13CAA2CC">
+      <w:start w:val="1"/>
+      <w:numFmt w:val="bullet"/>
+      <w:lvlText w:val=""/>
+      <w:lvlJc w:val="left"/>
+      <w:pPr>
+        <w:ind w:left="720" w:hanging="360"/>
+      </w:pPr>
+      <w:rPr>
+        <w:rFonts w:ascii="Symbol" w:hAnsi="Symbol"/>
+      </w:rPr>
+    </w:lvl>
+    <w:lvl w:ilvl="2" w:tplc="EFCE3FAE">
+      <w:start w:val="1"/>
+      <w:numFmt w:val="bullet"/>
+      <w:lvlText w:val=""/>
+      <w:lvlJc w:val="left"/>
+      <w:pPr>
+        <w:ind w:left="720" w:hanging="360"/>
+      </w:pPr>
+      <w:rPr>
+        <w:rFonts w:ascii="Symbol" w:hAnsi="Symbol"/>
+      </w:rPr>
+    </w:lvl>
+    <w:lvl w:ilvl="3" w:tplc="81F04FF6">
+      <w:start w:val="1"/>
+      <w:numFmt w:val="bullet"/>
+      <w:lvlText w:val=""/>
+      <w:lvlJc w:val="left"/>
+      <w:pPr>
+        <w:ind w:left="720" w:hanging="360"/>
+      </w:pPr>
+      <w:rPr>
+        <w:rFonts w:ascii="Symbol" w:hAnsi="Symbol"/>
+      </w:rPr>
+    </w:lvl>
+    <w:lvl w:ilvl="4" w:tplc="1DAE1380">
+      <w:start w:val="1"/>
+      <w:numFmt w:val="bullet"/>
+      <w:lvlText w:val=""/>
+      <w:lvlJc w:val="left"/>
+      <w:pPr>
+        <w:ind w:left="720" w:hanging="360"/>
+      </w:pPr>
+      <w:rPr>
+        <w:rFonts w:ascii="Symbol" w:hAnsi="Symbol"/>
+      </w:rPr>
+    </w:lvl>
+    <w:lvl w:ilvl="5" w:tplc="7A72FBCC">
+      <w:start w:val="1"/>
+      <w:numFmt w:val="bullet"/>
+      <w:lvlText w:val=""/>
+      <w:lvlJc w:val="left"/>
+      <w:pPr>
+        <w:ind w:left="720" w:hanging="360"/>
+      </w:pPr>
+      <w:rPr>
+        <w:rFonts w:ascii="Symbol" w:hAnsi="Symbol"/>
+      </w:rPr>
+    </w:lvl>
+    <w:lvl w:ilvl="6" w:tplc="8ACE8BCA">
+      <w:start w:val="1"/>
+      <w:numFmt w:val="bullet"/>
+      <w:lvlText w:val=""/>
+      <w:lvlJc w:val="left"/>
+      <w:pPr>
+        <w:ind w:left="720" w:hanging="360"/>
+      </w:pPr>
+      <w:rPr>
+        <w:rFonts w:ascii="Symbol" w:hAnsi="Symbol"/>
+      </w:rPr>
+    </w:lvl>
+    <w:lvl w:ilvl="7" w:tplc="69C892F8">
+      <w:start w:val="1"/>
+      <w:numFmt w:val="bullet"/>
+      <w:lvlText w:val=""/>
+      <w:lvlJc w:val="left"/>
+      <w:pPr>
+        <w:ind w:left="720" w:hanging="360"/>
+      </w:pPr>
+      <w:rPr>
+        <w:rFonts w:ascii="Symbol" w:hAnsi="Symbol"/>
+      </w:rPr>
+    </w:lvl>
+    <w:lvl w:ilvl="8" w:tplc="B9B614A4">
+      <w:start w:val="1"/>
+      <w:numFmt w:val="bullet"/>
+      <w:lvlText w:val=""/>
+      <w:lvlJc w:val="left"/>
+      <w:pPr>
+        <w:ind w:left="720" w:hanging="360"/>
+      </w:pPr>
+      <w:rPr>
+        <w:rFonts w:ascii="Symbol" w:hAnsi="Symbol"/>
+      </w:rPr>
+    </w:lvl>
+  </w:abstractNum>
+  <w:abstractNum w:abstractNumId="8" w15:restartNumberingAfterBreak="0">
+    <w:nsid w:val="61CC0FCE"/>
+    <w:multiLevelType w:val="hybridMultilevel"/>
+    <w:tmpl w:val="083094B8"/>
+    <w:lvl w:ilvl="0" w:tplc="F02A0CD4">
+      <w:start w:val="1"/>
+      <w:numFmt w:val="bullet"/>
+      <w:lvlText w:val=""/>
+      <w:lvlJc w:val="left"/>
+      <w:pPr>
+        <w:ind w:left="720" w:hanging="360"/>
+      </w:pPr>
+      <w:rPr>
+        <w:rFonts w:ascii="Symbol" w:hAnsi="Symbol"/>
+      </w:rPr>
+    </w:lvl>
+    <w:lvl w:ilvl="1" w:tplc="8084C920">
+      <w:start w:val="1"/>
+      <w:numFmt w:val="bullet"/>
+      <w:lvlText w:val=""/>
+      <w:lvlJc w:val="left"/>
+      <w:pPr>
+        <w:ind w:left="720" w:hanging="360"/>
+      </w:pPr>
+      <w:rPr>
+        <w:rFonts w:ascii="Symbol" w:hAnsi="Symbol"/>
+      </w:rPr>
+    </w:lvl>
+    <w:lvl w:ilvl="2" w:tplc="836083F6">
+      <w:start w:val="1"/>
+      <w:numFmt w:val="bullet"/>
+      <w:lvlText w:val=""/>
+      <w:lvlJc w:val="left"/>
+      <w:pPr>
+        <w:ind w:left="720" w:hanging="360"/>
+      </w:pPr>
+      <w:rPr>
+        <w:rFonts w:ascii="Symbol" w:hAnsi="Symbol"/>
+      </w:rPr>
+    </w:lvl>
+    <w:lvl w:ilvl="3" w:tplc="F4BECF32">
+      <w:start w:val="1"/>
+      <w:numFmt w:val="bullet"/>
+      <w:lvlText w:val=""/>
+      <w:lvlJc w:val="left"/>
+      <w:pPr>
+        <w:ind w:left="720" w:hanging="360"/>
+      </w:pPr>
+      <w:rPr>
+        <w:rFonts w:ascii="Symbol" w:hAnsi="Symbol"/>
+      </w:rPr>
+    </w:lvl>
+    <w:lvl w:ilvl="4" w:tplc="369C8EA0">
+      <w:start w:val="1"/>
+      <w:numFmt w:val="bullet"/>
+      <w:lvlText w:val=""/>
+      <w:lvlJc w:val="left"/>
+      <w:pPr>
+        <w:ind w:left="720" w:hanging="360"/>
+      </w:pPr>
+      <w:rPr>
+        <w:rFonts w:ascii="Symbol" w:hAnsi="Symbol"/>
+      </w:rPr>
+    </w:lvl>
+    <w:lvl w:ilvl="5" w:tplc="3054970C">
+      <w:start w:val="1"/>
+      <w:numFmt w:val="bullet"/>
+      <w:lvlText w:val=""/>
+      <w:lvlJc w:val="left"/>
+      <w:pPr>
+        <w:ind w:left="720" w:hanging="360"/>
+      </w:pPr>
+      <w:rPr>
+        <w:rFonts w:ascii="Symbol" w:hAnsi="Symbol"/>
+      </w:rPr>
+    </w:lvl>
+    <w:lvl w:ilvl="6" w:tplc="572477C0">
+      <w:start w:val="1"/>
+      <w:numFmt w:val="bullet"/>
+      <w:lvlText w:val=""/>
+      <w:lvlJc w:val="left"/>
+      <w:pPr>
+        <w:ind w:left="720" w:hanging="360"/>
+      </w:pPr>
+      <w:rPr>
+        <w:rFonts w:ascii="Symbol" w:hAnsi="Symbol"/>
+      </w:rPr>
+    </w:lvl>
+    <w:lvl w:ilvl="7" w:tplc="979007E2">
+      <w:start w:val="1"/>
+      <w:numFmt w:val="bullet"/>
+      <w:lvlText w:val=""/>
+      <w:lvlJc w:val="left"/>
+      <w:pPr>
+        <w:ind w:left="720" w:hanging="360"/>
+      </w:pPr>
+      <w:rPr>
+        <w:rFonts w:ascii="Symbol" w:hAnsi="Symbol"/>
+      </w:rPr>
+    </w:lvl>
+    <w:lvl w:ilvl="8" w:tplc="C986A376">
+      <w:start w:val="1"/>
+      <w:numFmt w:val="bullet"/>
+      <w:lvlText w:val=""/>
+      <w:lvlJc w:val="left"/>
+      <w:pPr>
+        <w:ind w:left="720" w:hanging="360"/>
+      </w:pPr>
+      <w:rPr>
+        <w:rFonts w:ascii="Symbol" w:hAnsi="Symbol"/>
+      </w:rPr>
+    </w:lvl>
+  </w:abstractNum>
+  <w:abstractNum w:abstractNumId="9" w15:restartNumberingAfterBreak="0">
+    <w:nsid w:val="650674AF"/>
+    <w:multiLevelType w:val="hybridMultilevel"/>
+    <w:tmpl w:val="6AA83B64"/>
+    <w:lvl w:ilvl="0" w:tplc="D78CA692">
+      <w:start w:val="1"/>
+      <w:numFmt w:val="bullet"/>
+      <w:lvlText w:val=""/>
+      <w:lvlJc w:val="left"/>
+      <w:pPr>
+        <w:ind w:left="720" w:hanging="360"/>
+      </w:pPr>
+      <w:rPr>
+        <w:rFonts w:ascii="Symbol" w:hAnsi="Symbol"/>
+      </w:rPr>
+    </w:lvl>
+    <w:lvl w:ilvl="1" w:tplc="9D22CB46">
+      <w:start w:val="1"/>
+      <w:numFmt w:val="bullet"/>
+      <w:lvlText w:val=""/>
+      <w:lvlJc w:val="left"/>
+      <w:pPr>
+        <w:ind w:left="720" w:hanging="360"/>
+      </w:pPr>
+      <w:rPr>
+        <w:rFonts w:ascii="Symbol" w:hAnsi="Symbol"/>
+      </w:rPr>
+    </w:lvl>
+    <w:lvl w:ilvl="2" w:tplc="E95AC5D4">
+      <w:start w:val="1"/>
+      <w:numFmt w:val="bullet"/>
+      <w:lvlText w:val=""/>
+      <w:lvlJc w:val="left"/>
+      <w:pPr>
+        <w:ind w:left="720" w:hanging="360"/>
+      </w:pPr>
+      <w:rPr>
+        <w:rFonts w:ascii="Symbol" w:hAnsi="Symbol"/>
+      </w:rPr>
+    </w:lvl>
+    <w:lvl w:ilvl="3" w:tplc="D6E6C2F6">
+      <w:start w:val="1"/>
+      <w:numFmt w:val="bullet"/>
+      <w:lvlText w:val=""/>
+      <w:lvlJc w:val="left"/>
+      <w:pPr>
+        <w:ind w:left="720" w:hanging="360"/>
+      </w:pPr>
+      <w:rPr>
+        <w:rFonts w:ascii="Symbol" w:hAnsi="Symbol"/>
+      </w:rPr>
+    </w:lvl>
+    <w:lvl w:ilvl="4" w:tplc="FA86A5E8">
+      <w:start w:val="1"/>
+      <w:numFmt w:val="bullet"/>
+      <w:lvlText w:val=""/>
+      <w:lvlJc w:val="left"/>
+      <w:pPr>
+        <w:ind w:left="720" w:hanging="360"/>
+      </w:pPr>
+      <w:rPr>
+        <w:rFonts w:ascii="Symbol" w:hAnsi="Symbol"/>
+      </w:rPr>
+    </w:lvl>
+    <w:lvl w:ilvl="5" w:tplc="2D5205CC">
+      <w:start w:val="1"/>
+      <w:numFmt w:val="bullet"/>
+      <w:lvlText w:val=""/>
+      <w:lvlJc w:val="left"/>
+      <w:pPr>
+        <w:ind w:left="720" w:hanging="360"/>
+      </w:pPr>
+      <w:rPr>
+        <w:rFonts w:ascii="Symbol" w:hAnsi="Symbol"/>
+      </w:rPr>
+    </w:lvl>
+    <w:lvl w:ilvl="6" w:tplc="A8B81386">
+      <w:start w:val="1"/>
+      <w:numFmt w:val="bullet"/>
+      <w:lvlText w:val=""/>
+      <w:lvlJc w:val="left"/>
+      <w:pPr>
+        <w:ind w:left="720" w:hanging="360"/>
+      </w:pPr>
+      <w:rPr>
+        <w:rFonts w:ascii="Symbol" w:hAnsi="Symbol"/>
+      </w:rPr>
+    </w:lvl>
+    <w:lvl w:ilvl="7" w:tplc="6C6CE0BC">
+      <w:start w:val="1"/>
+      <w:numFmt w:val="bullet"/>
+      <w:lvlText w:val=""/>
+      <w:lvlJc w:val="left"/>
+      <w:pPr>
+        <w:ind w:left="720" w:hanging="360"/>
+      </w:pPr>
+      <w:rPr>
+        <w:rFonts w:ascii="Symbol" w:hAnsi="Symbol"/>
+      </w:rPr>
+    </w:lvl>
+    <w:lvl w:ilvl="8" w:tplc="0E6817A8">
+      <w:start w:val="1"/>
+      <w:numFmt w:val="bullet"/>
+      <w:lvlText w:val=""/>
+      <w:lvlJc w:val="left"/>
+      <w:pPr>
+        <w:ind w:left="720" w:hanging="360"/>
+      </w:pPr>
+      <w:rPr>
+        <w:rFonts w:ascii="Symbol" w:hAnsi="Symbol"/>
+      </w:rPr>
+    </w:lvl>
+  </w:abstractNum>
+  <w:abstractNum w:abstractNumId="10" w15:restartNumberingAfterBreak="0">
+    <w:nsid w:val="719B0959"/>
+    <w:multiLevelType w:val="hybridMultilevel"/>
+    <w:tmpl w:val="9C84ED88"/>
+    <w:lvl w:ilvl="0" w:tplc="3B7A225E">
+      <w:start w:val="1"/>
+      <w:numFmt w:val="bullet"/>
+      <w:lvlText w:val=""/>
+      <w:lvlJc w:val="left"/>
+      <w:pPr>
+        <w:ind w:left="720" w:hanging="360"/>
+      </w:pPr>
+      <w:rPr>
+        <w:rFonts w:ascii="Symbol" w:hAnsi="Symbol"/>
+      </w:rPr>
+    </w:lvl>
+    <w:lvl w:ilvl="1" w:tplc="B316FC74">
+      <w:start w:val="1"/>
+      <w:numFmt w:val="bullet"/>
+      <w:lvlText w:val=""/>
+      <w:lvlJc w:val="left"/>
+      <w:pPr>
+        <w:ind w:left="720" w:hanging="360"/>
+      </w:pPr>
+      <w:rPr>
+        <w:rFonts w:ascii="Symbol" w:hAnsi="Symbol"/>
+      </w:rPr>
+    </w:lvl>
+    <w:lvl w:ilvl="2" w:tplc="774870CC">
+      <w:start w:val="1"/>
+      <w:numFmt w:val="bullet"/>
+      <w:lvlText w:val=""/>
+      <w:lvlJc w:val="left"/>
+      <w:pPr>
+        <w:ind w:left="720" w:hanging="360"/>
+      </w:pPr>
+      <w:rPr>
+        <w:rFonts w:ascii="Symbol" w:hAnsi="Symbol"/>
+      </w:rPr>
+    </w:lvl>
+    <w:lvl w:ilvl="3" w:tplc="E5E4FD4C">
+      <w:start w:val="1"/>
+      <w:numFmt w:val="bullet"/>
+      <w:lvlText w:val=""/>
+      <w:lvlJc w:val="left"/>
+      <w:pPr>
+        <w:ind w:left="720" w:hanging="360"/>
+      </w:pPr>
+      <w:rPr>
+        <w:rFonts w:ascii="Symbol" w:hAnsi="Symbol"/>
+      </w:rPr>
+    </w:lvl>
+    <w:lvl w:ilvl="4" w:tplc="D51E9504">
+      <w:start w:val="1"/>
+      <w:numFmt w:val="bullet"/>
+      <w:lvlText w:val=""/>
+      <w:lvlJc w:val="left"/>
+      <w:pPr>
+        <w:ind w:left="720" w:hanging="360"/>
+      </w:pPr>
+      <w:rPr>
+        <w:rFonts w:ascii="Symbol" w:hAnsi="Symbol"/>
+      </w:rPr>
+    </w:lvl>
+    <w:lvl w:ilvl="5" w:tplc="26D04F26">
+      <w:start w:val="1"/>
+      <w:numFmt w:val="bullet"/>
+      <w:lvlText w:val=""/>
+      <w:lvlJc w:val="left"/>
+      <w:pPr>
+        <w:ind w:left="720" w:hanging="360"/>
+      </w:pPr>
+      <w:rPr>
+        <w:rFonts w:ascii="Symbol" w:hAnsi="Symbol"/>
+      </w:rPr>
+    </w:lvl>
+    <w:lvl w:ilvl="6" w:tplc="D3D41AA6">
+      <w:start w:val="1"/>
+      <w:numFmt w:val="bullet"/>
+      <w:lvlText w:val=""/>
+      <w:lvlJc w:val="left"/>
+      <w:pPr>
+        <w:ind w:left="720" w:hanging="360"/>
+      </w:pPr>
+      <w:rPr>
+        <w:rFonts w:ascii="Symbol" w:hAnsi="Symbol"/>
+      </w:rPr>
+    </w:lvl>
+    <w:lvl w:ilvl="7" w:tplc="CF5454E6">
+      <w:start w:val="1"/>
+      <w:numFmt w:val="bullet"/>
+      <w:lvlText w:val=""/>
+      <w:lvlJc w:val="left"/>
+      <w:pPr>
+        <w:ind w:left="720" w:hanging="360"/>
+      </w:pPr>
+      <w:rPr>
+        <w:rFonts w:ascii="Symbol" w:hAnsi="Symbol"/>
+      </w:rPr>
+    </w:lvl>
+    <w:lvl w:ilvl="8" w:tplc="56C684C0">
+      <w:start w:val="1"/>
+      <w:numFmt w:val="bullet"/>
+      <w:lvlText w:val=""/>
+      <w:lvlJc w:val="left"/>
+      <w:pPr>
+        <w:ind w:left="720" w:hanging="360"/>
+      </w:pPr>
+      <w:rPr>
+        <w:rFonts w:ascii="Symbol" w:hAnsi="Symbol"/>
+      </w:rPr>
+    </w:lvl>
+  </w:abstractNum>
+  <w:abstractNum w:abstractNumId="11" w15:restartNumberingAfterBreak="0">
     <w:nsid w:val="71BC00D9"/>
     <w:multiLevelType w:val="multilevel"/>
     <w:tmpl w:val="50E83F3A"/>
@@ -4679,7 +6488,7 @@
       </w:pPr>
     </w:lvl>
   </w:abstractNum>
-  <w:abstractNum w:abstractNumId="1" w15:restartNumberingAfterBreak="0">
+  <w:abstractNum w:abstractNumId="12" w15:restartNumberingAfterBreak="0">
     <w:nsid w:val="734F00C3"/>
     <w:multiLevelType w:val="multilevel"/>
     <w:tmpl w:val="50E83F3A"/>
@@ -4792,7 +6601,7 @@
       </w:pPr>
     </w:lvl>
   </w:abstractNum>
-  <w:abstractNum w:abstractNumId="2" w15:restartNumberingAfterBreak="0">
+  <w:abstractNum w:abstractNumId="13" w15:restartNumberingAfterBreak="0">
     <w:nsid w:val="784002C1"/>
     <w:multiLevelType w:val="multilevel"/>
     <w:tmpl w:val="50E83F3A"/>
@@ -4905,14 +6714,163 @@
       </w:pPr>
     </w:lvl>
   </w:abstractNum>
+  <w:abstractNum w:abstractNumId="14" w15:restartNumberingAfterBreak="0">
+    <w:nsid w:val="7A196CED"/>
+    <w:multiLevelType w:val="hybridMultilevel"/>
+    <w:tmpl w:val="16004754"/>
+    <w:lvl w:ilvl="0" w:tplc="D03AD088">
+      <w:start w:val="1"/>
+      <w:numFmt w:val="bullet"/>
+      <w:lvlText w:val=""/>
+      <w:lvlJc w:val="left"/>
+      <w:pPr>
+        <w:ind w:left="720" w:hanging="360"/>
+      </w:pPr>
+      <w:rPr>
+        <w:rFonts w:ascii="Symbol" w:hAnsi="Symbol"/>
+      </w:rPr>
+    </w:lvl>
+    <w:lvl w:ilvl="1" w:tplc="80EC5A2E">
+      <w:start w:val="1"/>
+      <w:numFmt w:val="bullet"/>
+      <w:lvlText w:val=""/>
+      <w:lvlJc w:val="left"/>
+      <w:pPr>
+        <w:ind w:left="720" w:hanging="360"/>
+      </w:pPr>
+      <w:rPr>
+        <w:rFonts w:ascii="Symbol" w:hAnsi="Symbol"/>
+      </w:rPr>
+    </w:lvl>
+    <w:lvl w:ilvl="2" w:tplc="11040D2E">
+      <w:start w:val="1"/>
+      <w:numFmt w:val="bullet"/>
+      <w:lvlText w:val=""/>
+      <w:lvlJc w:val="left"/>
+      <w:pPr>
+        <w:ind w:left="720" w:hanging="360"/>
+      </w:pPr>
+      <w:rPr>
+        <w:rFonts w:ascii="Symbol" w:hAnsi="Symbol"/>
+      </w:rPr>
+    </w:lvl>
+    <w:lvl w:ilvl="3" w:tplc="1AC0AEFA">
+      <w:start w:val="1"/>
+      <w:numFmt w:val="bullet"/>
+      <w:lvlText w:val=""/>
+      <w:lvlJc w:val="left"/>
+      <w:pPr>
+        <w:ind w:left="720" w:hanging="360"/>
+      </w:pPr>
+      <w:rPr>
+        <w:rFonts w:ascii="Symbol" w:hAnsi="Symbol"/>
+      </w:rPr>
+    </w:lvl>
+    <w:lvl w:ilvl="4" w:tplc="54DE30D0">
+      <w:start w:val="1"/>
+      <w:numFmt w:val="bullet"/>
+      <w:lvlText w:val=""/>
+      <w:lvlJc w:val="left"/>
+      <w:pPr>
+        <w:ind w:left="720" w:hanging="360"/>
+      </w:pPr>
+      <w:rPr>
+        <w:rFonts w:ascii="Symbol" w:hAnsi="Symbol"/>
+      </w:rPr>
+    </w:lvl>
+    <w:lvl w:ilvl="5" w:tplc="1C126232">
+      <w:start w:val="1"/>
+      <w:numFmt w:val="bullet"/>
+      <w:lvlText w:val=""/>
+      <w:lvlJc w:val="left"/>
+      <w:pPr>
+        <w:ind w:left="720" w:hanging="360"/>
+      </w:pPr>
+      <w:rPr>
+        <w:rFonts w:ascii="Symbol" w:hAnsi="Symbol"/>
+      </w:rPr>
+    </w:lvl>
+    <w:lvl w:ilvl="6" w:tplc="B6E2963A">
+      <w:start w:val="1"/>
+      <w:numFmt w:val="bullet"/>
+      <w:lvlText w:val=""/>
+      <w:lvlJc w:val="left"/>
+      <w:pPr>
+        <w:ind w:left="720" w:hanging="360"/>
+      </w:pPr>
+      <w:rPr>
+        <w:rFonts w:ascii="Symbol" w:hAnsi="Symbol"/>
+      </w:rPr>
+    </w:lvl>
+    <w:lvl w:ilvl="7" w:tplc="C0089478">
+      <w:start w:val="1"/>
+      <w:numFmt w:val="bullet"/>
+      <w:lvlText w:val=""/>
+      <w:lvlJc w:val="left"/>
+      <w:pPr>
+        <w:ind w:left="720" w:hanging="360"/>
+      </w:pPr>
+      <w:rPr>
+        <w:rFonts w:ascii="Symbol" w:hAnsi="Symbol"/>
+      </w:rPr>
+    </w:lvl>
+    <w:lvl w:ilvl="8" w:tplc="5532DA38">
+      <w:start w:val="1"/>
+      <w:numFmt w:val="bullet"/>
+      <w:lvlText w:val=""/>
+      <w:lvlJc w:val="left"/>
+      <w:pPr>
+        <w:ind w:left="720" w:hanging="360"/>
+      </w:pPr>
+      <w:rPr>
+        <w:rFonts w:ascii="Symbol" w:hAnsi="Symbol"/>
+      </w:rPr>
+    </w:lvl>
+  </w:abstractNum>
   <w:num w:numId="1" w16cid:durableId="250160641">
+    <w:abstractNumId w:val="11"/>
+  </w:num>
+  <w:num w:numId="2" w16cid:durableId="1843160166">
+    <w:abstractNumId w:val="12"/>
+  </w:num>
+  <w:num w:numId="3" w16cid:durableId="1649238535">
+    <w:abstractNumId w:val="13"/>
+  </w:num>
+  <w:num w:numId="4" w16cid:durableId="135880334">
+    <w:abstractNumId w:val="9"/>
+  </w:num>
+  <w:num w:numId="5" w16cid:durableId="347828243">
     <w:abstractNumId w:val="0"/>
   </w:num>
-  <w:num w:numId="2" w16cid:durableId="1843160166">
+  <w:num w:numId="6" w16cid:durableId="1065565255">
     <w:abstractNumId w:val="1"/>
   </w:num>
-  <w:num w:numId="3" w16cid:durableId="1649238535">
+  <w:num w:numId="7" w16cid:durableId="482165364">
+    <w:abstractNumId w:val="5"/>
+  </w:num>
+  <w:num w:numId="8" w16cid:durableId="680744518">
+    <w:abstractNumId w:val="10"/>
+  </w:num>
+  <w:num w:numId="9" w16cid:durableId="963390918">
     <w:abstractNumId w:val="2"/>
+  </w:num>
+  <w:num w:numId="10" w16cid:durableId="610011409">
+    <w:abstractNumId w:val="14"/>
+  </w:num>
+  <w:num w:numId="11" w16cid:durableId="1063285875">
+    <w:abstractNumId w:val="3"/>
+  </w:num>
+  <w:num w:numId="12" w16cid:durableId="321348975">
+    <w:abstractNumId w:val="7"/>
+  </w:num>
+  <w:num w:numId="13" w16cid:durableId="916479180">
+    <w:abstractNumId w:val="4"/>
+  </w:num>
+  <w:num w:numId="14" w16cid:durableId="886994836">
+    <w:abstractNumId w:val="8"/>
+  </w:num>
+  <w:num w:numId="15" w16cid:durableId="1607736520">
+    <w:abstractNumId w:val="6"/>
   </w:num>
 </w:numbering>
 </file>
@@ -5900,6 +7858,14 @@
 </file>
 
 <file path=customXml/item1.xml><?xml version="1.0" encoding="utf-8"?>
+<p:properties xmlns:p="http://schemas.microsoft.com/office/2006/metadata/properties" xmlns:xsi="http://www.w3.org/2001/XMLSchema-instance" xmlns:pc="http://schemas.microsoft.com/office/infopath/2007/PartnerControls">
+  <documentManagement>
+    <_activity xmlns="91172594-76f2-42b4-b6c8-5686d13fb17f" xsi:nil="true"/>
+  </documentManagement>
+</p:properties>
+</file>
+
+<file path=customXml/item2.xml><?xml version="1.0" encoding="utf-8"?>
 <?mso-contentType ?>
 <FormTemplates xmlns="http://schemas.microsoft.com/sharepoint/v3/contenttype/forms">
   <Display>DocumentLibraryForm</Display>
@@ -5908,19 +7874,7 @@
 </FormTemplates>
 </file>
 
-<file path=customXml/item2.xml><?xml version="1.0" encoding="utf-8"?>
-<p:properties xmlns:p="http://schemas.microsoft.com/office/2006/metadata/properties" xmlns:xsi="http://www.w3.org/2001/XMLSchema-instance" xmlns:pc="http://schemas.microsoft.com/office/infopath/2007/PartnerControls">
-  <documentManagement>
-    <_activity xmlns="91172594-76f2-42b4-b6c8-5686d13fb17f" xsi:nil="true"/>
-  </documentManagement>
-</p:properties>
-</file>
-
 <file path=customXml/item3.xml><?xml version="1.0" encoding="utf-8"?>
-<b:Sources xmlns:b="http://schemas.openxmlformats.org/officeDocument/2006/bibliography" xmlns="http://schemas.openxmlformats.org/officeDocument/2006/bibliography" SelectedStyle="\APASixthEditionOfficeOnline.xsl" StyleName="APA" Version="6"/>
-</file>
-
-<file path=customXml/item4.xml><?xml version="1.0" encoding="utf-8"?>
 <ct:contentTypeSchema xmlns:ct="http://schemas.microsoft.com/office/2006/metadata/contentType" xmlns:ma="http://schemas.microsoft.com/office/2006/metadata/properties/metaAttributes" ct:_="" ma:_="" ma:contentTypeName="Document" ma:contentTypeID="0x010100085B5888F14DAE46912A6E0F6FCFCB07" ma:contentTypeVersion="9" ma:contentTypeDescription="Create a new document." ma:contentTypeScope="" ma:versionID="2185b18d6fd5c46c37ca5df071e41de6">
   <xsd:schema xmlns:xsd="http://www.w3.org/2001/XMLSchema" xmlns:xs="http://www.w3.org/2001/XMLSchema" xmlns:p="http://schemas.microsoft.com/office/2006/metadata/properties" xmlns:ns3="91172594-76f2-42b4-b6c8-5686d13fb17f" targetNamespace="http://schemas.microsoft.com/office/2006/metadata/properties" ma:root="true" ma:fieldsID="3ce95284eb097024ce56720a48b923a2" ns3:_="">
     <xsd:import namespace="91172594-76f2-42b4-b6c8-5686d13fb17f"/>
@@ -6096,15 +8050,11 @@
 </ct:contentTypeSchema>
 </file>
 
-<file path=customXml/itemProps1.xml><?xml version="1.0" encoding="utf-8"?>
-<ds:datastoreItem xmlns:ds="http://schemas.openxmlformats.org/officeDocument/2006/customXml" ds:itemID="{510AB3BD-BC06-4C1C-BE0E-F78D828DF9A1}">
-  <ds:schemaRefs>
-    <ds:schemaRef ds:uri="http://schemas.microsoft.com/sharepoint/v3/contenttype/forms"/>
-  </ds:schemaRefs>
-</ds:datastoreItem>
+<file path=customXml/item4.xml><?xml version="1.0" encoding="utf-8"?>
+<b:Sources xmlns:b="http://schemas.openxmlformats.org/officeDocument/2006/bibliography" xmlns="http://schemas.openxmlformats.org/officeDocument/2006/bibliography" SelectedStyle="\APASixthEditionOfficeOnline.xsl" StyleName="APA" Version="6"/>
 </file>
 
-<file path=customXml/itemProps2.xml><?xml version="1.0" encoding="utf-8"?>
+<file path=customXml/itemProps1.xml><?xml version="1.0" encoding="utf-8"?>
 <ds:datastoreItem xmlns:ds="http://schemas.openxmlformats.org/officeDocument/2006/customXml" ds:itemID="{B4565CB4-100A-4A3D-B4D6-384A4DEF81CB}">
   <ds:schemaRefs>
     <ds:schemaRef ds:uri="http://schemas.microsoft.com/office/2006/metadata/properties"/>
@@ -6114,15 +8064,15 @@
 </ds:datastoreItem>
 </file>
 
-<file path=customXml/itemProps3.xml><?xml version="1.0" encoding="utf-8"?>
-<ds:datastoreItem xmlns:ds="http://schemas.openxmlformats.org/officeDocument/2006/customXml" ds:itemID="{FCC1ACD0-7293-47C9-BE0B-4D879715608C}">
+<file path=customXml/itemProps2.xml><?xml version="1.0" encoding="utf-8"?>
+<ds:datastoreItem xmlns:ds="http://schemas.openxmlformats.org/officeDocument/2006/customXml" ds:itemID="{510AB3BD-BC06-4C1C-BE0E-F78D828DF9A1}">
   <ds:schemaRefs>
-    <ds:schemaRef ds:uri="http://schemas.openxmlformats.org/officeDocument/2006/bibliography"/>
+    <ds:schemaRef ds:uri="http://schemas.microsoft.com/sharepoint/v3/contenttype/forms"/>
   </ds:schemaRefs>
 </ds:datastoreItem>
 </file>
 
-<file path=customXml/itemProps4.xml><?xml version="1.0" encoding="utf-8"?>
+<file path=customXml/itemProps3.xml><?xml version="1.0" encoding="utf-8"?>
 <ds:datastoreItem xmlns:ds="http://schemas.openxmlformats.org/officeDocument/2006/customXml" ds:itemID="{8A7A12AC-3EA6-42CF-BE43-5DF49F85A7B6}">
   <ds:schemaRefs>
     <ds:schemaRef ds:uri="http://schemas.microsoft.com/office/2006/metadata/contentType"/>
@@ -6138,4 +8088,12 @@
     <ds:schemaRef ds:uri="http://schemas.microsoft.com/internal/obd"/>
   </ds:schemaRefs>
 </ds:datastoreItem>
+</file>
+
+<file path=customXml/itemProps4.xml><?xml version="1.0" encoding="utf-8"?>
+<ds:datastoreItem xmlns:ds="http://schemas.openxmlformats.org/officeDocument/2006/customXml" ds:itemID="{FCC1ACD0-7293-47C9-BE0B-4D879715608C}">
+  <ds:schemaRefs>
+    <ds:schemaRef ds:uri="http://schemas.openxmlformats.org/officeDocument/2006/bibliography"/>
+  </ds:schemaRefs>
+</ds:datastoreItem>
 </file>
</xml_diff>